<commit_message>
fix(editorial): remove sequential numbering from H2s for SEO and strip number badges from H3s across all guides
</commit_message>
<xml_diff>
--- a/content-pipeline/06-word-documents/000_FULL_COLLECTION_18_ARTICLES_BEN_THANH_EN.docx
+++ b/content-pipeline/06-word-documents/000_FULL_COLLECTION_18_ARTICLES_BEN_THANH_EN.docx
@@ -282,7 +282,7 @@
         <w:spacing w:before="320" w:after="120" w:line="276" w:lineRule="auto"/>
       </w:pPr>
       <w:r>
-        <w:t>1. Historical Stratigraphy: From the Ben Nghe Riverbank to a 21st-Century Crossroads</w:t>
+        <w:t>Historical Stratigraphy: From the Ben Nghe Riverbank to a 21st-Century Crossroads</w:t>
       </w:r>
       <w:r>
         <w:rPr>
@@ -291,7 +291,7 @@
           <w:color w:val="1B365D"/>
           <w:sz w:val="32"/>
         </w:rPr>
-        <w:t>1. Historical Stratigraphy: From the Ben Nghe Riverbank to a 21st-Century Crossroads</w:t>
+        <w:t>Historical Stratigraphy: From the Ben Nghe Riverbank to a 21st-Century Crossroads</w:t>
       </w:r>
     </w:p>
     <w:p>
@@ -463,7 +463,7 @@
         <w:spacing w:before="320" w:after="120" w:line="276" w:lineRule="auto"/>
       </w:pPr>
       <w:r>
-        <w:t>2. Definitive Heritage &amp; Cultural Landmarks Within a 1-Kilometer Radius</w:t>
+        <w:t>Definitive Heritage &amp; Cultural Landmarks Within a 1-Kilometer Radius</w:t>
       </w:r>
       <w:r>
         <w:rPr>
@@ -472,7 +472,7 @@
           <w:color w:val="1B365D"/>
           <w:sz w:val="32"/>
         </w:rPr>
-        <w:t>2. Definitive Heritage &amp; Cultural Landmarks Within a 1-Kilometer Radius</w:t>
+        <w:t>Definitive Heritage &amp; Cultural Landmarks Within a 1-Kilometer Radius</w:t>
       </w:r>
     </w:p>
     <w:p>
@@ -480,7 +480,7 @@
         <w:spacing w:before="240" w:after="80" w:line="276" w:lineRule="auto"/>
       </w:pPr>
       <w:r>
-        <w:t>2.1. Ben Thanh Market: The Living Mirror of Saigon</w:t>
+        <w:t>Ben Thanh Market: The Living Mirror of Saigon</w:t>
       </w:r>
       <w:r>
         <w:rPr>
@@ -489,7 +489,7 @@
           <w:color w:val="D97706"/>
           <w:sz w:val="26"/>
         </w:rPr>
-        <w:t>2.1. Ben Thanh Market: The Living Mirror of Saigon</w:t>
+        <w:t>Ben Thanh Market: The Living Mirror of Saigon</w:t>
       </w:r>
     </w:p>
     <w:p>
@@ -575,7 +575,7 @@
         <w:spacing w:before="240" w:after="80" w:line="276" w:lineRule="auto"/>
       </w:pPr>
       <w:r>
-        <w:t>2.2. HCMC Museum of Fine Arts: Indochine Splendor in the Hui Bon Hoa Mansion</w:t>
+        <w:t>HCMC Museum of Fine Arts: Indochine Splendor in the Hui Bon Hoa Mansion</w:t>
       </w:r>
       <w:r>
         <w:rPr>
@@ -584,7 +584,7 @@
           <w:color w:val="D97706"/>
           <w:sz w:val="26"/>
         </w:rPr>
-        <w:t>2.2. HCMC Museum of Fine Arts: Indochine Splendor in the Hui Bon Hoa Mansion</w:t>
+        <w:t>HCMC Museum of Fine Arts: Indochine Splendor in the Hui Bon Hoa Mansion</w:t>
       </w:r>
     </w:p>
     <w:p>
@@ -781,7 +781,7 @@
         <w:spacing w:before="240" w:after="80" w:line="276" w:lineRule="auto"/>
       </w:pPr>
       <w:r>
-        <w:t>2.3. The Independence Palace: High Zenith of Tropical Modernism</w:t>
+        <w:t>The Independence Palace: High Zenith of Tropical Modernism</w:t>
       </w:r>
       <w:r>
         <w:rPr>
@@ -790,7 +790,7 @@
           <w:color w:val="D97706"/>
           <w:sz w:val="26"/>
         </w:rPr>
-        <w:t>2.3. The Independence Palace: High Zenith of Tropical Modernism</w:t>
+        <w:t>The Independence Palace: High Zenith of Tropical Modernism</w:t>
       </w:r>
     </w:p>
     <w:p>
@@ -1046,7 +1046,7 @@
         <w:spacing w:before="240" w:after="80" w:line="276" w:lineRule="auto"/>
       </w:pPr>
       <w:r>
-        <w:t>2.4. Mariamman Hindu Temple: A Colorful Enclave of Dravidian Spirituality</w:t>
+        <w:t>Mariamman Hindu Temple: A Colorful Enclave of Dravidian Spirituality</w:t>
       </w:r>
       <w:r>
         <w:rPr>
@@ -1055,7 +1055,7 @@
           <w:color w:val="D97706"/>
           <w:sz w:val="26"/>
         </w:rPr>
-        <w:t>2.4. Mariamman Hindu Temple: A Colorful Enclave of Dravidian Spirituality</w:t>
+        <w:t>Mariamman Hindu Temple: A Colorful Enclave of Dravidian Spirituality</w:t>
       </w:r>
     </w:p>
     <w:p>
@@ -1158,7 +1158,7 @@
         <w:spacing w:before="240" w:after="80" w:line="276" w:lineRule="auto"/>
       </w:pPr>
       <w:r>
-        <w:t>2.5. Ben Thanh Central Metro Station: The 2026 Subterranean Landmark</w:t>
+        <w:t>Ben Thanh Central Metro Station: The 2026 Subterranean Landmark</w:t>
       </w:r>
       <w:r>
         <w:rPr>
@@ -1167,7 +1167,7 @@
           <w:color w:val="D97706"/>
           <w:sz w:val="26"/>
         </w:rPr>
-        <w:t>2.5. Ben Thanh Central Metro Station: The 2026 Subterranean Landmark</w:t>
+        <w:t>Ben Thanh Central Metro Station: The 2026 Subterranean Landmark</w:t>
       </w:r>
     </w:p>
     <w:p>
@@ -1259,7 +1259,7 @@
         <w:spacing w:before="320" w:after="120" w:line="276" w:lineRule="auto"/>
       </w:pPr>
       <w:r>
-        <w:t>3. Curated Matrix: Comparing Landmarks Along the Ben Thanh Axis</w:t>
+        <w:t>Curated Matrix: Comparing Landmarks Along the Ben Thanh Axis</w:t>
       </w:r>
       <w:r>
         <w:rPr>
@@ -1268,7 +1268,7 @@
           <w:color w:val="1B365D"/>
           <w:sz w:val="32"/>
         </w:rPr>
-        <w:t>3. Curated Matrix: Comparing Landmarks Along the Ben Thanh Axis</w:t>
+        <w:t>Curated Matrix: Comparing Landmarks Along the Ben Thanh Axis</w:t>
       </w:r>
     </w:p>
     <w:p>
@@ -1296,7 +1296,7 @@
         <w:spacing w:before="320" w:after="120" w:line="276" w:lineRule="auto"/>
       </w:pPr>
       <w:r>
-        <w:t>4. Epicurean Mapping &amp; Neighborhood Life</w:t>
+        <w:t>Epicurean Mapping &amp; Neighborhood Life</w:t>
       </w:r>
       <w:r>
         <w:rPr>
@@ -1305,7 +1305,7 @@
           <w:color w:val="1B365D"/>
           <w:sz w:val="32"/>
         </w:rPr>
-        <w:t>4. Epicurean Mapping &amp; Neighborhood Life</w:t>
+        <w:t>Epicurean Mapping &amp; Neighborhood Life</w:t>
       </w:r>
     </w:p>
     <w:p>
@@ -1329,7 +1329,7 @@
         <w:spacing w:before="240" w:after="80" w:line="276" w:lineRule="auto"/>
       </w:pPr>
       <w:r>
-        <w:t>4.1. Classic Daytime Market Stalls (Inside South &amp; East Gates)</w:t>
+        <w:t>Classic Daytime Market Stalls (Inside South &amp; East Gates)</w:t>
       </w:r>
       <w:r>
         <w:rPr>
@@ -1338,7 +1338,7 @@
           <w:color w:val="D97706"/>
           <w:sz w:val="26"/>
         </w:rPr>
-        <w:t>4.1. Classic Daytime Market Stalls (Inside South &amp; East Gates)</w:t>
+        <w:t>Classic Daytime Market Stalls (Inside South &amp; East Gates)</w:t>
       </w:r>
     </w:p>
     <w:p>
@@ -1467,7 +1467,7 @@
         <w:spacing w:before="240" w:after="80" w:line="276" w:lineRule="auto"/>
       </w:pPr>
       <w:r>
-        <w:t>4.2. Phan Boi Chau &amp; Phan Chu Trinh Evening Street Dining (Post-Dusk)</w:t>
+        <w:t>Phan Boi Chau &amp; Phan Chu Trinh Evening Street Dining (Post-Dusk)</w:t>
       </w:r>
       <w:r>
         <w:rPr>
@@ -1476,7 +1476,7 @@
           <w:color w:val="D97706"/>
           <w:sz w:val="26"/>
         </w:rPr>
-        <w:t>4.2. Phan Boi Chau &amp; Phan Chu Trinh Evening Street Dining (Post-Dusk)</w:t>
+        <w:t>Phan Boi Chau &amp; Phan Chu Trinh Evening Street Dining (Post-Dusk)</w:t>
       </w:r>
     </w:p>
     <w:p>
@@ -1517,7 +1517,7 @@
         <w:spacing w:before="240" w:after="80" w:line="276" w:lineRule="auto"/>
       </w:pPr>
       <w:r>
-        <w:t>4.3. Secret Vintage Apartment Hideaways</w:t>
+        <w:t>Secret Vintage Apartment Hideaways</w:t>
       </w:r>
       <w:r>
         <w:rPr>
@@ -1526,7 +1526,7 @@
           <w:color w:val="D97706"/>
           <w:sz w:val="26"/>
         </w:rPr>
-        <w:t>4.3. Secret Vintage Apartment Hideaways</w:t>
+        <w:t>Secret Vintage Apartment Hideaways</w:t>
       </w:r>
     </w:p>
     <w:p>
@@ -1565,7 +1565,7 @@
         <w:spacing w:before="320" w:after="120" w:line="276" w:lineRule="auto"/>
       </w:pPr>
       <w:r>
-        <w:t>5. Curated Walking Itineraries</w:t>
+        <w:t>Curated Walking Itineraries</w:t>
       </w:r>
       <w:r>
         <w:rPr>
@@ -1574,7 +1574,7 @@
           <w:color w:val="1B365D"/>
           <w:sz w:val="32"/>
         </w:rPr>
-        <w:t>5. Curated Walking Itineraries</w:t>
+        <w:t>Curated Walking Itineraries</w:t>
       </w:r>
     </w:p>
     <w:p>
@@ -1898,7 +1898,7 @@
         <w:spacing w:before="320" w:after="120" w:line="276" w:lineRule="auto"/>
       </w:pPr>
       <w:r>
-        <w:t>6. Field Notes for the Discerning Traveler (2026 Guidelines)</w:t>
+        <w:t>Field Notes for the Discerning Traveler (2026 Guidelines)</w:t>
       </w:r>
       <w:r>
         <w:rPr>
@@ -1907,7 +1907,7 @@
           <w:color w:val="1B365D"/>
           <w:sz w:val="32"/>
         </w:rPr>
-        <w:t>6. Field Notes for the Discerning Traveler (2026 Guidelines)</w:t>
+        <w:t>Field Notes for the Discerning Traveler (2026 Guidelines)</w:t>
       </w:r>
     </w:p>
     <w:p>
@@ -2353,7 +2353,7 @@
         <w:spacing w:before="320" w:after="120" w:line="276" w:lineRule="auto"/>
       </w:pPr>
       <w:r>
-        <w:t>1. The Hui Bon Hoa Dynasty: From Humble Merchant to Real Estate Titan</w:t>
+        <w:t>The Hui Bon Hoa Dynasty: From Humble Merchant to Real Estate Titan</w:t>
       </w:r>
       <w:r>
         <w:rPr>
@@ -2362,7 +2362,7 @@
           <w:color w:val="1B365D"/>
           <w:sz w:val="32"/>
         </w:rPr>
-        <w:t>1. The Hui Bon Hoa Dynasty: From Humble Merchant to Real Estate Titan</w:t>
+        <w:t>The Hui Bon Hoa Dynasty: From Humble Merchant to Real Estate Titan</w:t>
       </w:r>
     </w:p>
     <w:p>
@@ -2518,7 +2518,7 @@
         <w:spacing w:before="320" w:after="120" w:line="276" w:lineRule="auto"/>
       </w:pPr>
       <w:r>
-        <w:t>2. Deciphering the Architectural Harmony: Western Art Deco Meets Eastern Geomancy</w:t>
+        <w:t>Deciphering the Architectural Harmony: Western Art Deco Meets Eastern Geomancy</w:t>
       </w:r>
       <w:r>
         <w:rPr>
@@ -2527,7 +2527,7 @@
           <w:color w:val="1B365D"/>
           <w:sz w:val="32"/>
         </w:rPr>
-        <w:t>2. Deciphering the Architectural Harmony: Western Art Deco Meets Eastern Geomancy</w:t>
+        <w:t>Deciphering the Architectural Harmony: Western Art Deco Meets Eastern Geomancy</w:t>
       </w:r>
     </w:p>
     <w:p>
@@ -2551,7 +2551,7 @@
         <w:spacing w:before="240" w:after="80" w:line="276" w:lineRule="auto"/>
       </w:pPr>
       <w:r>
-        <w:t>2.1. The Exterior: Classical Pilasters Crowned by Emerald Dragon Tiles</w:t>
+        <w:t>The Exterior: Classical Pilasters Crowned by Emerald Dragon Tiles</w:t>
       </w:r>
       <w:r>
         <w:rPr>
@@ -2560,7 +2560,7 @@
           <w:color w:val="D97706"/>
           <w:sz w:val="26"/>
         </w:rPr>
-        <w:t>2.1. The Exterior: Classical Pilasters Crowned by Emerald Dragon Tiles</w:t>
+        <w:t>The Exterior: Classical Pilasters Crowned by Emerald Dragon Tiles</w:t>
       </w:r>
     </w:p>
     <w:p>
@@ -2584,7 +2584,7 @@
         <w:spacing w:before="240" w:after="80" w:line="276" w:lineRule="auto"/>
       </w:pPr>
       <w:r>
-        <w:t>2.2. The Interior: Encaustic Tiles and Prismatic Lightwells</w:t>
+        <w:t>The Interior: Encaustic Tiles and Prismatic Lightwells</w:t>
       </w:r>
       <w:r>
         <w:rPr>
@@ -2593,7 +2593,7 @@
           <w:color w:val="D97706"/>
           <w:sz w:val="26"/>
         </w:rPr>
-        <w:t>2.2. The Interior: Encaustic Tiles and Prismatic Lightwells</w:t>
+        <w:t>The Interior: Encaustic Tiles and Prismatic Lightwells</w:t>
       </w:r>
     </w:p>
     <w:p>
@@ -2650,7 +2650,7 @@
         <w:spacing w:before="240" w:after="80" w:line="276" w:lineRule="auto"/>
       </w:pPr>
       <w:r>
-        <w:t>2.3. The Parisian Antique Elevator: Technological Aristocracy</w:t>
+        <w:t>The Parisian Antique Elevator: Technological Aristocracy</w:t>
       </w:r>
       <w:r>
         <w:rPr>
@@ -2659,7 +2659,7 @@
           <w:color w:val="D97706"/>
           <w:sz w:val="26"/>
         </w:rPr>
-        <w:t>2.3. The Parisian Antique Elevator: Technological Aristocracy</w:t>
+        <w:t>The Parisian Antique Elevator: Technological Aristocracy</w:t>
       </w:r>
     </w:p>
     <w:p>
@@ -2698,7 +2698,7 @@
         <w:spacing w:before="320" w:after="120" w:line="276" w:lineRule="auto"/>
       </w:pPr>
       <w:r>
-        <w:t>3. Navigating the Three Pavilions: A Millennial Artistic Odyssey</w:t>
+        <w:t>Navigating the Three Pavilions: A Millennial Artistic Odyssey</w:t>
       </w:r>
       <w:r>
         <w:rPr>
@@ -2707,7 +2707,7 @@
           <w:color w:val="1B365D"/>
           <w:sz w:val="32"/>
         </w:rPr>
-        <w:t>3. Navigating the Three Pavilions: A Millennial Artistic Odyssey</w:t>
+        <w:t>Navigating the Three Pavilions: A Millennial Artistic Odyssey</w:t>
       </w:r>
     </w:p>
     <w:p>
@@ -2802,7 +2802,7 @@
         <w:spacing w:before="320" w:after="120" w:line="276" w:lineRule="auto"/>
       </w:pPr>
       <w:r>
-        <w:t>4. Curated Field Notes for the Discerning Traveler (2026)</w:t>
+        <w:t>Curated Field Notes for the Discerning Traveler (2026)</w:t>
       </w:r>
       <w:r>
         <w:rPr>
@@ -2811,7 +2811,7 @@
           <w:color w:val="1B365D"/>
           <w:sz w:val="32"/>
         </w:rPr>
-        <w:t>4. Curated Field Notes for the Discerning Traveler (2026)</w:t>
+        <w:t>Curated Field Notes for the Discerning Traveler (2026)</w:t>
       </w:r>
     </w:p>
     <w:p>
@@ -3280,7 +3280,7 @@
         <w:spacing w:before="320" w:after="120" w:line="276" w:lineRule="auto"/>
       </w:pPr>
       <w:r>
-        <w:t>1. Southern Gastronomic Philosophy: The Bold Soul of Alluvial Soil</w:t>
+        <w:t>Southern Gastronomic Philosophy: The Bold Soul of Alluvial Soil</w:t>
       </w:r>
       <w:r>
         <w:rPr>
@@ -3289,7 +3289,7 @@
           <w:color w:val="1B365D"/>
           <w:sz w:val="32"/>
         </w:rPr>
-        <w:t>1. Southern Gastronomic Philosophy: The Bold Soul of Alluvial Soil</w:t>
+        <w:t>Southern Gastronomic Philosophy: The Bold Soul of Alluvial Soil</w:t>
       </w:r>
     </w:p>
     <w:p>
@@ -3361,7 +3361,7 @@
         <w:spacing w:before="320" w:after="120" w:line="276" w:lineRule="auto"/>
       </w:pPr>
       <w:r>
-        <w:t>2. Deconstructing 5 Heritage Stalls Inside the Market (Daytime)</w:t>
+        <w:t>Deconstructing 5 Heritage Stalls Inside the Market (Daytime)</w:t>
       </w:r>
       <w:r>
         <w:rPr>
@@ -3370,7 +3370,7 @@
           <w:color w:val="1B365D"/>
           <w:sz w:val="32"/>
         </w:rPr>
-        <w:t>2. Deconstructing 5 Heritage Stalls Inside the Market (Daytime)</w:t>
+        <w:t>Deconstructing 5 Heritage Stalls Inside the Market (Daytime)</w:t>
       </w:r>
     </w:p>
     <w:p>
@@ -3378,7 +3378,7 @@
         <w:spacing w:before="240" w:after="80" w:line="276" w:lineRule="auto"/>
       </w:pPr>
       <w:r>
-        <w:t>2.1. East Gate Bún Riêu: Freshwater Crab Alchemy</w:t>
+        <w:t>East Gate Bún Riêu: Freshwater Crab Alchemy</w:t>
       </w:r>
       <w:r>
         <w:rPr>
@@ -3387,7 +3387,7 @@
           <w:color w:val="D97706"/>
           <w:sz w:val="26"/>
         </w:rPr>
-        <w:t>2.1. East Gate Bún Riêu: Freshwater Crab Alchemy</w:t>
+        <w:t>East Gate Bún Riêu: Freshwater Crab Alchemy</w:t>
       </w:r>
     </w:p>
     <w:p>
@@ -3490,7 +3490,7 @@
         <w:spacing w:before="240" w:after="80" w:line="276" w:lineRule="auto"/>
       </w:pPr>
       <w:r>
-        <w:t>2.2. Mekong Delta Bún Mắm: The Essence of the Great River</w:t>
+        <w:t>Mekong Delta Bún Mắm: The Essence of the Great River</w:t>
       </w:r>
       <w:r>
         <w:rPr>
@@ -3499,7 +3499,7 @@
           <w:color w:val="D97706"/>
           <w:sz w:val="26"/>
         </w:rPr>
-        <w:t>2.2. Mekong Delta Bún Mắm: The Essence of the Great River</w:t>
+        <w:t>Mekong Delta Bún Mắm: The Essence of the Great River</w:t>
       </w:r>
     </w:p>
     <w:p>
@@ -3593,7 +3593,7 @@
         <w:spacing w:before="240" w:after="80" w:line="276" w:lineRule="auto"/>
       </w:pPr>
       <w:r>
-        <w:t>2.3. Gỏi Cuốn: The Pure Poetry of Rice Paper Rolls</w:t>
+        <w:t>Gỏi Cuốn: The Pure Poetry of Rice Paper Rolls</w:t>
       </w:r>
       <w:r>
         <w:rPr>
@@ -3602,7 +3602,7 @@
           <w:color w:val="D97706"/>
           <w:sz w:val="26"/>
         </w:rPr>
-        <w:t>2.3. Gỏi Cuốn: The Pure Poetry of Rice Paper Rolls</w:t>
+        <w:t>Gỏi Cuốn: The Pure Poetry of Rice Paper Rolls</w:t>
       </w:r>
     </w:p>
     <w:p>
@@ -3626,7 +3626,7 @@
         <w:spacing w:before="240" w:after="80" w:line="276" w:lineRule="auto"/>
       </w:pPr>
       <w:r>
-        <w:t>2.4. Central Vietnamese Steamed Rice Cakes: The Hue Connection</w:t>
+        <w:t>Central Vietnamese Steamed Rice Cakes: The Hue Connection</w:t>
       </w:r>
       <w:r>
         <w:rPr>
@@ -3635,7 +3635,7 @@
           <w:color w:val="D97706"/>
           <w:sz w:val="26"/>
         </w:rPr>
-        <w:t>2.4. Central Vietnamese Steamed Rice Cakes: The Hue Connection</w:t>
+        <w:t>Central Vietnamese Steamed Rice Cakes: The Hue Connection</w:t>
       </w:r>
     </w:p>
     <w:p>
@@ -3676,7 +3676,7 @@
         <w:spacing w:before="240" w:after="80" w:line="276" w:lineRule="auto"/>
       </w:pPr>
       <w:r>
-        <w:t>2.5. Ba Muoi’s Sweet Soup Stall: 60 Years of Sugarcane Romance</w:t>
+        <w:t>Ba Muoi’s Sweet Soup Stall: 60 Years of Sugarcane Romance</w:t>
       </w:r>
       <w:r>
         <w:rPr>
@@ -3685,7 +3685,7 @@
           <w:color w:val="D97706"/>
           <w:sz w:val="26"/>
         </w:rPr>
-        <w:t>2.5. Ba Muoi’s Sweet Soup Stall: 60 Years of Sugarcane Romance</w:t>
+        <w:t>Ba Muoi’s Sweet Soup Stall: 60 Years of Sugarcane Romance</w:t>
       </w:r>
     </w:p>
     <w:p>
@@ -3758,7 +3758,7 @@
         <w:spacing w:before="320" w:after="120" w:line="276" w:lineRule="auto"/>
       </w:pPr>
       <w:r>
-        <w:t>3. Phan Boi Chau Night Dining: Charcoal Braziers Beneath the Neon Sky</w:t>
+        <w:t>Phan Boi Chau Night Dining: Charcoal Braziers Beneath the Neon Sky</w:t>
       </w:r>
       <w:r>
         <w:rPr>
@@ -3767,7 +3767,7 @@
           <w:color w:val="1B365D"/>
           <w:sz w:val="32"/>
         </w:rPr>
-        <w:t>3. Phan Boi Chau Night Dining: Charcoal Braziers Beneath the Neon Sky</w:t>
+        <w:t>Phan Boi Chau Night Dining: Charcoal Braziers Beneath the Neon Sky</w:t>
       </w:r>
     </w:p>
     <w:p>
@@ -3875,7 +3875,7 @@
         <w:spacing w:before="320" w:after="120" w:line="276" w:lineRule="auto"/>
       </w:pPr>
       <w:r>
-        <w:t>4. Tasting Matrix: Comparing Ben Thanh’s Culinary Signatures</w:t>
+        <w:t>Tasting Matrix: Comparing Ben Thanh’s Culinary Signatures</w:t>
       </w:r>
       <w:r>
         <w:rPr>
@@ -3884,7 +3884,7 @@
           <w:color w:val="1B365D"/>
           <w:sz w:val="32"/>
         </w:rPr>
-        <w:t>4. Tasting Matrix: Comparing Ben Thanh’s Culinary Signatures</w:t>
+        <w:t>Tasting Matrix: Comparing Ben Thanh’s Culinary Signatures</w:t>
       </w:r>
     </w:p>
     <w:p>
@@ -3912,7 +3912,7 @@
         <w:spacing w:before="320" w:after="120" w:line="276" w:lineRule="auto"/>
       </w:pPr>
       <w:r>
-        <w:t>5. Field Notes for Conscious Gourmands (2026)</w:t>
+        <w:t>Field Notes for Conscious Gourmands (2026)</w:t>
       </w:r>
       <w:r>
         <w:rPr>
@@ -3921,7 +3921,7 @@
           <w:color w:val="1B365D"/>
           <w:sz w:val="32"/>
         </w:rPr>
-        <w:t>5. Field Notes for Conscious Gourmands (2026)</w:t>
+        <w:t>Field Notes for Conscious Gourmands (2026)</w:t>
       </w:r>
     </w:p>
     <w:p>
@@ -4358,7 +4358,7 @@
         <w:spacing w:before="320" w:after="120" w:line="276" w:lineRule="auto"/>
       </w:pPr>
       <w:r>
-        <w:t>1. Slow Travel Philosophy: Embracing the City on Foot</w:t>
+        <w:t>Slow Travel Philosophy: Embracing the City on Foot</w:t>
       </w:r>
       <w:r>
         <w:rPr>
@@ -4367,7 +4367,7 @@
           <w:color w:val="1B365D"/>
           <w:sz w:val="32"/>
         </w:rPr>
-        <w:t>1. Slow Travel Philosophy: Embracing the City on Foot</w:t>
+        <w:t>Slow Travel Philosophy: Embracing the City on Foot</w:t>
       </w:r>
     </w:p>
     <w:p>
@@ -4422,7 +4422,7 @@
         <w:spacing w:before="320" w:after="120" w:line="276" w:lineRule="auto"/>
       </w:pPr>
       <w:r>
-        <w:t>2. Detailed Four-Stage Itinerary Breakdown</w:t>
+        <w:t>Detailed Four-Stage Itinerary Breakdown</w:t>
       </w:r>
       <w:r>
         <w:rPr>
@@ -4431,7 +4431,7 @@
           <w:color w:val="1B365D"/>
           <w:sz w:val="32"/>
         </w:rPr>
-        <w:t>2. Detailed Four-Stage Itinerary Breakdown</w:t>
+        <w:t>Detailed Four-Stage Itinerary Breakdown</w:t>
       </w:r>
     </w:p>
     <w:p>
@@ -4874,7 +4874,7 @@
         <w:spacing w:before="320" w:after="120" w:line="276" w:lineRule="auto"/>
       </w:pPr>
       <w:r>
-        <w:t>3. Curated Time-Block &amp; Budget Matrix (2026 Reference)</w:t>
+        <w:t>Curated Time-Block &amp; Budget Matrix (2026 Reference)</w:t>
       </w:r>
       <w:r>
         <w:rPr>
@@ -4883,7 +4883,7 @@
           <w:color w:val="1B365D"/>
           <w:sz w:val="32"/>
         </w:rPr>
-        <w:t>3. Curated Time-Block &amp; Budget Matrix (2026 Reference)</w:t>
+        <w:t>Curated Time-Block &amp; Budget Matrix (2026 Reference)</w:t>
       </w:r>
     </w:p>
     <w:p>
@@ -4911,7 +4911,7 @@
         <w:spacing w:before="320" w:after="120" w:line="276" w:lineRule="auto"/>
       </w:pPr>
       <w:r>
-        <w:t>4. Field Checklist for Conscious Voyagers (2026)</w:t>
+        <w:t>Field Checklist for Conscious Voyagers (2026)</w:t>
       </w:r>
       <w:r>
         <w:rPr>
@@ -4920,7 +4920,7 @@
           <w:color w:val="1B365D"/>
           <w:sz w:val="32"/>
         </w:rPr>
-        <w:t>4. Field Checklist for Conscious Voyagers (2026)</w:t>
+        <w:t>Field Checklist for Conscious Voyagers (2026)</w:t>
       </w:r>
     </w:p>
     <w:p>
@@ -5415,7 +5415,7 @@
         <w:spacing w:before="320" w:after="120" w:line="276" w:lineRule="auto"/>
       </w:pPr>
       <w:r>
-        <w:t>1. Historical Stratigraphy: From Colonial Norodom Palace to National Reunification</w:t>
+        <w:t>Historical Stratigraphy: From Colonial Norodom Palace to National Reunification</w:t>
       </w:r>
       <w:r>
         <w:rPr>
@@ -5424,7 +5424,7 @@
           <w:color w:val="1B365D"/>
           <w:sz w:val="32"/>
         </w:rPr>
-        <w:t>1. Historical Stratigraphy: From Colonial Norodom Palace to National Reunification</w:t>
+        <w:t>Historical Stratigraphy: From Colonial Norodom Palace to National Reunification</w:t>
       </w:r>
     </w:p>
     <w:p>
@@ -5562,7 +5562,7 @@
         <w:spacing w:before="320" w:after="120" w:line="276" w:lineRule="auto"/>
       </w:pPr>
       <w:r>
-        <w:t>2. Deciphering Ngo Viet Thu’s Eastern Architectural Cryptogram</w:t>
+        <w:t>Deciphering Ngo Viet Thu’s Eastern Architectural Cryptogram</w:t>
       </w:r>
       <w:r>
         <w:rPr>
@@ -5571,7 +5571,7 @@
           <w:color w:val="1B365D"/>
           <w:sz w:val="32"/>
         </w:rPr>
-        <w:t>2. Deciphering Ngo Viet Thu’s Eastern Architectural Cryptogram</w:t>
+        <w:t>Deciphering Ngo Viet Thu’s Eastern Architectural Cryptogram</w:t>
       </w:r>
     </w:p>
     <w:p>
@@ -5595,7 +5595,7 @@
         <w:spacing w:before="240" w:after="80" w:line="276" w:lineRule="auto"/>
       </w:pPr>
       <w:r>
-        <w:t>2.1. Floorplan Sino-Vietnamese Ideograms</w:t>
+        <w:t>Floorplan Sino-Vietnamese Ideograms</w:t>
       </w:r>
       <w:r>
         <w:rPr>
@@ -5604,7 +5604,7 @@
           <w:color w:val="D97706"/>
           <w:sz w:val="26"/>
         </w:rPr>
-        <w:t>2.1. Floorplan Sino-Vietnamese Ideograms</w:t>
+        <w:t>Floorplan Sino-Vietnamese Ideograms</w:t>
       </w:r>
     </w:p>
     <w:p>
@@ -5784,7 +5784,7 @@
         <w:spacing w:before="240" w:after="80" w:line="276" w:lineRule="auto"/>
       </w:pPr>
       <w:r>
-        <w:t>2.2. The Concrete Bamboo Louver Curtain (Rèm Hoa Đá)</w:t>
+        <w:t>The Concrete Bamboo Louver Curtain (Rèm Hoa Đá)</w:t>
       </w:r>
       <w:r>
         <w:rPr>
@@ -5793,7 +5793,7 @@
           <w:color w:val="D97706"/>
           <w:sz w:val="26"/>
         </w:rPr>
-        <w:t>2.2. The Concrete Bamboo Louver Curtain (Rèm Hoa Đá)</w:t>
+        <w:t>The Concrete Bamboo Louver Curtain (Rèm Hoa Đá)</w:t>
       </w:r>
     </w:p>
     <w:p>
@@ -5849,7 +5849,7 @@
         <w:spacing w:before="320" w:after="120" w:line="276" w:lineRule="auto"/>
       </w:pPr>
       <w:r>
-        <w:t>3. Curated Interior Exploration: From Grand Salons to Underground Bunkers</w:t>
+        <w:t>Curated Interior Exploration: From Grand Salons to Underground Bunkers</w:t>
       </w:r>
       <w:r>
         <w:rPr>
@@ -5858,7 +5858,7 @@
           <w:color w:val="1B365D"/>
           <w:sz w:val="32"/>
         </w:rPr>
-        <w:t>3. Curated Interior Exploration: From Grand Salons to Underground Bunkers</w:t>
+        <w:t>Curated Interior Exploration: From Grand Salons to Underground Bunkers</w:t>
       </w:r>
     </w:p>
     <w:p>
@@ -5886,7 +5886,7 @@
         <w:spacing w:before="320" w:after="120" w:line="276" w:lineRule="auto"/>
       </w:pPr>
       <w:r>
-        <w:t>4. Field Notes for the Discerning Traveler (2026)</w:t>
+        <w:t>Field Notes for the Discerning Traveler (2026)</w:t>
       </w:r>
       <w:r>
         <w:rPr>
@@ -5895,7 +5895,7 @@
           <w:color w:val="1B365D"/>
           <w:sz w:val="32"/>
         </w:rPr>
-        <w:t>4. Field Notes for the Discerning Traveler (2026)</w:t>
+        <w:t>Field Notes for the Discerning Traveler (2026)</w:t>
       </w:r>
     </w:p>
     <w:p>
@@ -6399,7 +6399,7 @@
         <w:spacing w:before="320" w:after="120" w:line="276" w:lineRule="auto"/>
       </w:pPr>
       <w:r>
-        <w:t>1. Subterranean Renaissance: Reimagining the Urban Landscape</w:t>
+        <w:t>Subterranean Renaissance: Reimagining the Urban Landscape</w:t>
       </w:r>
       <w:r>
         <w:rPr>
@@ -6408,7 +6408,7 @@
           <w:color w:val="1B365D"/>
           <w:sz w:val="32"/>
         </w:rPr>
-        <w:t>1. Subterranean Renaissance: Reimagining the Urban Landscape</w:t>
+        <w:t>Subterranean Renaissance: Reimagining the Urban Landscape</w:t>
       </w:r>
     </w:p>
     <w:p>
@@ -6463,7 +6463,7 @@
         <w:spacing w:before="320" w:after="120" w:line="276" w:lineRule="auto"/>
       </w:pPr>
       <w:r>
-        <w:t>2. Navigating the Four-Tier Subterranean Labyrinth</w:t>
+        <w:t>Navigating the Four-Tier Subterranean Labyrinth</w:t>
       </w:r>
       <w:r>
         <w:rPr>
@@ -6472,7 +6472,7 @@
           <w:color w:val="1B365D"/>
           <w:sz w:val="32"/>
         </w:rPr>
-        <w:t>2. Navigating the Four-Tier Subterranean Labyrinth</w:t>
+        <w:t>Navigating the Four-Tier Subterranean Labyrinth</w:t>
       </w:r>
     </w:p>
     <w:p>
@@ -6480,7 +6480,7 @@
         <w:spacing w:before="240" w:after="80" w:line="276" w:lineRule="auto"/>
       </w:pPr>
       <w:r>
-        <w:t>2.1. Level B1: The Commercial Concourse &amp; Ticketing Mezzanine</w:t>
+        <w:t>Level B1: The Commercial Concourse &amp; Ticketing Mezzanine</w:t>
       </w:r>
       <w:r>
         <w:rPr>
@@ -6489,7 +6489,7 @@
           <w:color w:val="D97706"/>
           <w:sz w:val="26"/>
         </w:rPr>
-        <w:t>2.1. Level B1: The Commercial Concourse &amp; Ticketing Mezzanine</w:t>
+        <w:t>Level B1: The Commercial Concourse &amp; Ticketing Mezzanine</w:t>
       </w:r>
     </w:p>
     <w:p>
@@ -6513,7 +6513,7 @@
         <w:spacing w:before="240" w:after="80" w:line="276" w:lineRule="auto"/>
       </w:pPr>
       <w:r>
-        <w:t>2.2. The Architectural Centerpiece: The Lotus Toplight</w:t>
+        <w:t>The Architectural Centerpiece: The Lotus Toplight</w:t>
       </w:r>
       <w:r>
         <w:rPr>
@@ -6522,7 +6522,7 @@
           <w:color w:val="D97706"/>
           <w:sz w:val="26"/>
         </w:rPr>
-        <w:t>2.2. The Architectural Centerpiece: The Lotus Toplight</w:t>
+        <w:t>The Architectural Centerpiece: The Lotus Toplight</w:t>
       </w:r>
     </w:p>
     <w:p>
@@ -6546,7 +6546,7 @@
         <w:spacing w:before="240" w:after="80" w:line="276" w:lineRule="auto"/>
       </w:pPr>
       <w:r>
-        <w:t>2.3. Level B2: Line 1 Boarding Platforms</w:t>
+        <w:t>Level B2: Line 1 Boarding Platforms</w:t>
       </w:r>
       <w:r>
         <w:rPr>
@@ -6555,7 +6555,7 @@
           <w:color w:val="D97706"/>
           <w:sz w:val="26"/>
         </w:rPr>
-        <w:t>2.3. Level B2: Line 1 Boarding Platforms</w:t>
+        <w:t>Level B2: Line 1 Boarding Platforms</w:t>
       </w:r>
     </w:p>
     <w:p>
@@ -6594,7 +6594,7 @@
         <w:spacing w:before="320" w:after="120" w:line="276" w:lineRule="auto"/>
       </w:pPr>
       <w:r>
-        <w:t>3. Curated Line 1 Route &amp; Fare Matrix (2026 Reference)</w:t>
+        <w:t>Curated Line 1 Route &amp; Fare Matrix (2026 Reference)</w:t>
       </w:r>
       <w:r>
         <w:rPr>
@@ -6603,7 +6603,7 @@
           <w:color w:val="1B365D"/>
           <w:sz w:val="32"/>
         </w:rPr>
-        <w:t>3. Curated Line 1 Route &amp; Fare Matrix (2026 Reference)</w:t>
+        <w:t>Curated Line 1 Route &amp; Fare Matrix (2026 Reference)</w:t>
       </w:r>
     </w:p>
     <w:p>
@@ -6631,7 +6631,7 @@
         <w:spacing w:before="320" w:after="120" w:line="276" w:lineRule="auto"/>
       </w:pPr>
       <w:r>
-        <w:t>4. Curated Transit Insights for Conscious Travelers (2026)</w:t>
+        <w:t>Curated Transit Insights for Conscious Travelers (2026)</w:t>
       </w:r>
       <w:r>
         <w:rPr>
@@ -6640,7 +6640,7 @@
           <w:color w:val="1B365D"/>
           <w:sz w:val="32"/>
         </w:rPr>
-        <w:t>4. Curated Transit Insights for Conscious Travelers (2026)</w:t>
+        <w:t>Curated Transit Insights for Conscious Travelers (2026)</w:t>
       </w:r>
     </w:p>
     <w:p>
@@ -7128,7 +7128,7 @@
         <w:spacing w:before="320" w:after="120" w:line="276" w:lineRule="auto"/>
       </w:pPr>
       <w:r>
-        <w:t>1. Footprints of the Tamil Chettiar Community in Old Saigon</w:t>
+        <w:t>Footprints of the Tamil Chettiar Community in Old Saigon</w:t>
       </w:r>
       <w:r>
         <w:rPr>
@@ -7137,7 +7137,7 @@
           <w:color w:val="1B365D"/>
           <w:sz w:val="32"/>
         </w:rPr>
-        <w:t>1. Footprints of the Tamil Chettiar Community in Old Saigon</w:t>
+        <w:t>Footprints of the Tamil Chettiar Community in Old Saigon</w:t>
       </w:r>
     </w:p>
     <w:p>
@@ -7225,7 +7225,7 @@
         <w:spacing w:before="320" w:after="120" w:line="276" w:lineRule="auto"/>
       </w:pPr>
       <w:r>
-        <w:t>2. Deciphering South Indian Dravidian Temple Art</w:t>
+        <w:t>Deciphering South Indian Dravidian Temple Art</w:t>
       </w:r>
       <w:r>
         <w:rPr>
@@ -7234,7 +7234,7 @@
           <w:color w:val="1B365D"/>
           <w:sz w:val="32"/>
         </w:rPr>
-        <w:t>2. Deciphering South Indian Dravidian Temple Art</w:t>
+        <w:t>Deciphering South Indian Dravidian Temple Art</w:t>
       </w:r>
     </w:p>
     <w:p>
@@ -7258,7 +7258,7 @@
         <w:spacing w:before="240" w:after="80" w:line="276" w:lineRule="auto"/>
       </w:pPr>
       <w:r>
-        <w:t>2.1. The Gopuram: Gateway Between the Earthly and Divine</w:t>
+        <w:t>The Gopuram: Gateway Between the Earthly and Divine</w:t>
       </w:r>
       <w:r>
         <w:rPr>
@@ -7267,7 +7267,7 @@
           <w:color w:val="D97706"/>
           <w:sz w:val="26"/>
         </w:rPr>
-        <w:t>2.1. The Gopuram: Gateway Between the Earthly and Divine</w:t>
+        <w:t>The Gopuram: Gateway Between the Earthly and Divine</w:t>
       </w:r>
     </w:p>
     <w:p>
@@ -7308,7 +7308,7 @@
         <w:spacing w:before="240" w:after="80" w:line="276" w:lineRule="auto"/>
       </w:pPr>
       <w:r>
-        <w:t>2.2. The Inner Sanctum: The Abode of Goddess Mariamman</w:t>
+        <w:t>The Inner Sanctum: The Abode of Goddess Mariamman</w:t>
       </w:r>
       <w:r>
         <w:rPr>
@@ -7317,7 +7317,7 @@
           <w:color w:val="D97706"/>
           <w:sz w:val="26"/>
         </w:rPr>
-        <w:t>2.2. The Inner Sanctum: The Abode of Goddess Mariamman</w:t>
+        <w:t>The Inner Sanctum: The Abode of Goddess Mariamman</w:t>
       </w:r>
     </w:p>
     <w:p>
@@ -7406,7 +7406,7 @@
         <w:spacing w:before="320" w:after="120" w:line="276" w:lineRule="auto"/>
       </w:pPr>
       <w:r>
-        <w:t>3. The Sacred Stone-Pressing Ritual: A Unique Cultural Synthesis</w:t>
+        <w:t>The Sacred Stone-Pressing Ritual: A Unique Cultural Synthesis</w:t>
       </w:r>
       <w:r>
         <w:rPr>
@@ -7415,7 +7415,7 @@
           <w:color w:val="1B365D"/>
           <w:sz w:val="32"/>
         </w:rPr>
-        <w:t>3. The Sacred Stone-Pressing Ritual: A Unique Cultural Synthesis</w:t>
+        <w:t>The Sacred Stone-Pressing Ritual: A Unique Cultural Synthesis</w:t>
       </w:r>
     </w:p>
     <w:p>
@@ -7486,7 +7486,7 @@
         <w:spacing w:before="320" w:after="120" w:line="276" w:lineRule="auto"/>
       </w:pPr>
       <w:r>
-        <w:t>4. Curated Sacred Exploration Matrix</w:t>
+        <w:t>Curated Sacred Exploration Matrix</w:t>
       </w:r>
       <w:r>
         <w:rPr>
@@ -7495,7 +7495,7 @@
           <w:color w:val="1B365D"/>
           <w:sz w:val="32"/>
         </w:rPr>
-        <w:t>4. Curated Sacred Exploration Matrix</w:t>
+        <w:t>Curated Sacred Exploration Matrix</w:t>
       </w:r>
     </w:p>
     <w:p>
@@ -7523,7 +7523,7 @@
         <w:spacing w:before="320" w:after="120" w:line="276" w:lineRule="auto"/>
       </w:pPr>
       <w:r>
-        <w:t>5. Conscious Traveler Protocol &amp; Field Guidelines (2026)</w:t>
+        <w:t>Conscious Traveler Protocol &amp; Field Guidelines (2026)</w:t>
       </w:r>
       <w:r>
         <w:rPr>
@@ -7532,7 +7532,7 @@
           <w:color w:val="1B365D"/>
           <w:sz w:val="32"/>
         </w:rPr>
-        <w:t>5. Conscious Traveler Protocol &amp; Field Guidelines (2026)</w:t>
+        <w:t>Conscious Traveler Protocol &amp; Field Guidelines (2026)</w:t>
       </w:r>
     </w:p>
     <w:p>
@@ -8011,7 +8011,7 @@
         <w:spacing w:before="320" w:after="120" w:line="276" w:lineRule="auto"/>
       </w:pPr>
       <w:r>
-        <w:t>1. Navigating the Four Cardinal Shopping Quadrants</w:t>
+        <w:t>Navigating the Four Cardinal Shopping Quadrants</w:t>
       </w:r>
       <w:r>
         <w:rPr>
@@ -8020,7 +8020,7 @@
           <w:color w:val="1B365D"/>
           <w:sz w:val="32"/>
         </w:rPr>
-        <w:t>1. Navigating the Four Cardinal Shopping Quadrants</w:t>
+        <w:t>Navigating the Four Cardinal Shopping Quadrants</w:t>
       </w:r>
     </w:p>
     <w:p>
@@ -8028,7 +8028,7 @@
         <w:spacing w:before="240" w:after="80" w:line="276" w:lineRule="auto"/>
       </w:pPr>
       <w:r>
-        <w:t>1.1. The South Gate (Le Loi Boulevard): Silks &amp; Master Lacquerware</w:t>
+        <w:t>The South Gate (Le Loi Boulevard): Silks &amp; Master Lacquerware</w:t>
       </w:r>
       <w:r>
         <w:rPr>
@@ -8037,7 +8037,7 @@
           <w:color w:val="D97706"/>
           <w:sz w:val="26"/>
         </w:rPr>
-        <w:t>1.1. The South Gate (Le Loi Boulevard): Silks &amp; Master Lacquerware</w:t>
+        <w:t>The South Gate (Le Loi Boulevard): Silks &amp; Master Lacquerware</w:t>
       </w:r>
     </w:p>
     <w:p>
@@ -8078,7 +8078,7 @@
         <w:spacing w:before="240" w:after="80" w:line="276" w:lineRule="auto"/>
       </w:pPr>
       <w:r>
-        <w:t>1.2. The East Gate (Phan Boi Chau Street): Highland Coffees &amp; Delta Spices</w:t>
+        <w:t>The East Gate (Phan Boi Chau Street): Highland Coffees &amp; Delta Spices</w:t>
       </w:r>
       <w:r>
         <w:rPr>
@@ -8087,7 +8087,7 @@
           <w:color w:val="D97706"/>
           <w:sz w:val="26"/>
         </w:rPr>
-        <w:t>1.2. The East Gate (Phan Boi Chau Street): Highland Coffees &amp; Delta Spices</w:t>
+        <w:t>The East Gate (Phan Boi Chau Street): Highland Coffees &amp; Delta Spices</w:t>
       </w:r>
     </w:p>
     <w:p>
@@ -8111,7 +8111,7 @@
         <w:spacing w:before="240" w:after="80" w:line="276" w:lineRule="auto"/>
       </w:pPr>
       <w:r>
-        <w:t>1.3. The West Gate (Phan Chu Trinh Street): Artisan Woven Goods &amp; Leather</w:t>
+        <w:t>The West Gate (Phan Chu Trinh Street): Artisan Woven Goods &amp; Leather</w:t>
       </w:r>
       <w:r>
         <w:rPr>
@@ -8120,7 +8120,7 @@
           <w:color w:val="D97706"/>
           <w:sz w:val="26"/>
         </w:rPr>
-        <w:t>1.3. The West Gate (Phan Chu Trinh Street): Artisan Woven Goods &amp; Leather</w:t>
+        <w:t>The West Gate (Phan Chu Trinh Street): Artisan Woven Goods &amp; Leather</w:t>
       </w:r>
     </w:p>
     <w:p>
@@ -8144,7 +8144,7 @@
         <w:spacing w:before="240" w:after="80" w:line="276" w:lineRule="auto"/>
       </w:pPr>
       <w:r>
-        <w:t>1.4. The North Gate (Le Thanh Ton Street): Orchard Bounty</w:t>
+        <w:t>The North Gate (Le Thanh Ton Street): Orchard Bounty</w:t>
       </w:r>
       <w:r>
         <w:rPr>
@@ -8153,7 +8153,7 @@
           <w:color w:val="D97706"/>
           <w:sz w:val="26"/>
         </w:rPr>
-        <w:t>1.4. The North Gate (Le Thanh Ton Street): Orchard Bounty</w:t>
+        <w:t>The North Gate (Le Thanh Ton Street): Orchard Bounty</w:t>
       </w:r>
     </w:p>
     <w:p>
@@ -8192,7 +8192,7 @@
         <w:spacing w:before="320" w:after="120" w:line="276" w:lineRule="auto"/>
       </w:pPr>
       <w:r>
-        <w:t>2. Bargaining with Grace: Cultural Guidelines</w:t>
+        <w:t>Bargaining with Grace: Cultural Guidelines</w:t>
       </w:r>
       <w:r>
         <w:rPr>
@@ -8201,7 +8201,7 @@
           <w:color w:val="1B365D"/>
           <w:sz w:val="32"/>
         </w:rPr>
-        <w:t>2. Bargaining with Grace: Cultural Guidelines</w:t>
+        <w:t>Bargaining with Grace: Cultural Guidelines</w:t>
       </w:r>
     </w:p>
     <w:p>
@@ -8225,7 +8225,7 @@
         <w:spacing w:before="240" w:after="80" w:line="276" w:lineRule="auto"/>
       </w:pPr>
       <w:r>
-        <w:t>2.1. Honor the Morning Opening Rite (Mở Hàng)</w:t>
+        <w:t>Honor the Morning Opening Rite (Mở Hàng)</w:t>
       </w:r>
       <w:r>
         <w:rPr>
@@ -8234,7 +8234,7 @@
           <w:color w:val="D97706"/>
           <w:sz w:val="26"/>
         </w:rPr>
-        <w:t>2.1. Honor the Morning Opening Rite (Mở Hàng)</w:t>
+        <w:t>Honor the Morning Opening Rite (Mở Hàng)</w:t>
       </w:r>
     </w:p>
     <w:p>
@@ -8258,7 +8258,7 @@
         <w:spacing w:before="240" w:after="80" w:line="276" w:lineRule="auto"/>
       </w:pPr>
       <w:r>
-        <w:t>2.2. The 15% to 25% Equilibrium</w:t>
+        <w:t>The 15% to 25% Equilibrium</w:t>
       </w:r>
       <w:r>
         <w:rPr>
@@ -8267,7 +8267,7 @@
           <w:color w:val="D97706"/>
           <w:sz w:val="26"/>
         </w:rPr>
-        <w:t>2.2. The 15% to 25% Equilibrium</w:t>
+        <w:t>The 15% to 25% Equilibrium</w:t>
       </w:r>
     </w:p>
     <w:p>
@@ -8343,7 +8343,7 @@
         <w:spacing w:before="240" w:after="80" w:line="276" w:lineRule="auto"/>
       </w:pPr>
       <w:r>
-        <w:t>2.3. The Gentle Walk-Away</w:t>
+        <w:t>The Gentle Walk-Away</w:t>
       </w:r>
       <w:r>
         <w:rPr>
@@ -8352,7 +8352,7 @@
           <w:color w:val="D97706"/>
           <w:sz w:val="26"/>
         </w:rPr>
-        <w:t>2.3. The Gentle Walk-Away</w:t>
+        <w:t>The Gentle Walk-Away</w:t>
       </w:r>
     </w:p>
     <w:p>
@@ -8391,7 +8391,7 @@
         <w:spacing w:before="320" w:after="120" w:line="276" w:lineRule="auto"/>
       </w:pPr>
       <w:r>
-        <w:t>3. Detecting Authentic Artisanship vs. Mass-Produced Counterfeits</w:t>
+        <w:t>Detecting Authentic Artisanship vs. Mass-Produced Counterfeits</w:t>
       </w:r>
       <w:r>
         <w:rPr>
@@ -8400,7 +8400,7 @@
           <w:color w:val="1B365D"/>
           <w:sz w:val="32"/>
         </w:rPr>
-        <w:t>3. Detecting Authentic Artisanship vs. Mass-Produced Counterfeits</w:t>
+        <w:t>Detecting Authentic Artisanship vs. Mass-Produced Counterfeits</w:t>
       </w:r>
     </w:p>
     <w:p>
@@ -8428,7 +8428,7 @@
         <w:spacing w:before="320" w:after="120" w:line="276" w:lineRule="auto"/>
       </w:pPr>
       <w:r>
-        <w:t>4. Consumer Protections &amp; Traveler Rights (2026)</w:t>
+        <w:t>Consumer Protections &amp; Traveler Rights (2026)</w:t>
       </w:r>
       <w:r>
         <w:rPr>
@@ -8437,7 +8437,7 @@
           <w:color w:val="1B365D"/>
           <w:sz w:val="32"/>
         </w:rPr>
-        <w:t>4. Consumer Protections &amp; Traveler Rights (2026)</w:t>
+        <w:t>Consumer Protections &amp; Traveler Rights (2026)</w:t>
       </w:r>
     </w:p>
     <w:p>
@@ -8660,7 +8660,7 @@
         <w:spacing w:before="320" w:after="120" w:line="276" w:lineRule="auto"/>
       </w:pPr>
       <w:r>
-        <w:t>1. Introduction: Saigon Unveiled from an Open Deck</w:t>
+        <w:t>Introduction: Saigon Unveiled from an Open Deck</w:t>
       </w:r>
       <w:r>
         <w:rPr>
@@ -8669,7 +8669,7 @@
           <w:color w:val="1B365D"/>
           <w:sz w:val="32"/>
         </w:rPr>
-        <w:t>1. Introduction: Saigon Unveiled from an Open Deck</w:t>
+        <w:t>Introduction: Saigon Unveiled from an Open Deck</w:t>
       </w:r>
     </w:p>
     <w:p>
@@ -8724,7 +8724,7 @@
         <w:spacing w:before="320" w:after="120" w:line="276" w:lineRule="auto"/>
       </w:pPr>
       <w:r>
-        <w:t>2. Fleet Architecture &amp; Bespoke Onboard Amenities</w:t>
+        <w:t>Fleet Architecture &amp; Bespoke Onboard Amenities</w:t>
       </w:r>
       <w:r>
         <w:rPr>
@@ -8733,7 +8733,7 @@
           <w:color w:val="1B365D"/>
           <w:sz w:val="32"/>
         </w:rPr>
-        <w:t>2. Fleet Architecture &amp; Bespoke Onboard Amenities</w:t>
+        <w:t>Fleet Architecture &amp; Bespoke Onboard Amenities</w:t>
       </w:r>
     </w:p>
     <w:p>
@@ -8910,7 +8910,7 @@
         <w:spacing w:before="320" w:after="120" w:line="276" w:lineRule="auto"/>
       </w:pPr>
       <w:r>
-        <w:t>3. Comprehensive Analysis of the Two Signature Routes (2026 Edition)</w:t>
+        <w:t>Comprehensive Analysis of the Two Signature Routes (2026 Edition)</w:t>
       </w:r>
       <w:r>
         <w:rPr>
@@ -8919,7 +8919,7 @@
           <w:color w:val="1B365D"/>
           <w:sz w:val="32"/>
         </w:rPr>
-        <w:t>3. Comprehensive Analysis of the Two Signature Routes (2026 Edition)</w:t>
+        <w:t>Comprehensive Analysis of the Two Signature Routes (2026 Edition)</w:t>
       </w:r>
     </w:p>
     <w:p>
@@ -9532,7 +9532,7 @@
         <w:spacing w:before="320" w:after="120" w:line="276" w:lineRule="auto"/>
       </w:pPr>
       <w:r>
-        <w:t>4. Daytime vs. Twilight Night Voyages: Comparative Matrix</w:t>
+        <w:t>Daytime vs. Twilight Night Voyages: Comparative Matrix</w:t>
       </w:r>
       <w:r>
         <w:rPr>
@@ -9541,7 +9541,7 @@
           <w:color w:val="1B365D"/>
           <w:sz w:val="32"/>
         </w:rPr>
-        <w:t>4. Daytime vs. Twilight Night Voyages: Comparative Matrix</w:t>
+        <w:t>Daytime vs. Twilight Night Voyages: Comparative Matrix</w:t>
       </w:r>
     </w:p>
     <w:p>
@@ -9569,7 +9569,7 @@
         <w:spacing w:before="320" w:after="120" w:line="276" w:lineRule="auto"/>
       </w:pPr>
       <w:r>
-        <w:t>5. Official 2026 Ticket Tariff Schedule</w:t>
+        <w:t>Official 2026 Ticket Tariff Schedule</w:t>
       </w:r>
       <w:r>
         <w:rPr>
@@ -9578,7 +9578,7 @@
           <w:color w:val="1B365D"/>
           <w:sz w:val="32"/>
         </w:rPr>
-        <w:t>5. Official 2026 Ticket Tariff Schedule</w:t>
+        <w:t>Official 2026 Ticket Tariff Schedule</w:t>
       </w:r>
     </w:p>
     <w:p>
@@ -9639,7 +9639,7 @@
         <w:spacing w:before="320" w:after="120" w:line="276" w:lineRule="auto"/>
       </w:pPr>
       <w:r>
-        <w:t>6. Curated Field Notes for the Discerning Traveler</w:t>
+        <w:t>Curated Field Notes for the Discerning Traveler</w:t>
       </w:r>
       <w:r>
         <w:rPr>
@@ -9648,7 +9648,7 @@
           <w:color w:val="1B365D"/>
           <w:sz w:val="32"/>
         </w:rPr>
-        <w:t>6. Curated Field Notes for the Discerning Traveler</w:t>
+        <w:t>Curated Field Notes for the Discerning Traveler</w:t>
       </w:r>
     </w:p>
     <w:p>
@@ -9672,7 +9672,7 @@
         <w:spacing w:before="240" w:after="80" w:line="276" w:lineRule="auto"/>
       </w:pPr>
       <w:r>
-        <w:t>1. The Strategy of Seat Selection</w:t>
+        <w:t>The Strategy of Seat Selection</w:t>
       </w:r>
       <w:r>
         <w:rPr>
@@ -9681,7 +9681,7 @@
           <w:color w:val="D97706"/>
           <w:sz w:val="26"/>
         </w:rPr>
-        <w:t>1. The Strategy of Seat Selection</w:t>
+        <w:t>The Strategy of Seat Selection</w:t>
       </w:r>
     </w:p>
     <w:p>
@@ -9767,7 +9767,7 @@
         <w:spacing w:before="240" w:after="80" w:line="276" w:lineRule="auto"/>
       </w:pPr>
       <w:r>
-        <w:t>2. The Golden Departure Windows</w:t>
+        <w:t>The Golden Departure Windows</w:t>
       </w:r>
       <w:r>
         <w:rPr>
@@ -9776,7 +9776,7 @@
           <w:color w:val="D97706"/>
           <w:sz w:val="26"/>
         </w:rPr>
-        <w:t>2. The Golden Departure Windows</w:t>
+        <w:t>The Golden Departure Windows</w:t>
       </w:r>
     </w:p>
     <w:p>
@@ -9836,7 +9836,7 @@
         <w:spacing w:before="240" w:after="80" w:line="276" w:lineRule="auto"/>
       </w:pPr>
       <w:r>
-        <w:t>3. Vital Safety Protocols</w:t>
+        <w:t>Vital Safety Protocols</w:t>
       </w:r>
       <w:r>
         <w:rPr>
@@ -9845,7 +9845,7 @@
           <w:color w:val="D97706"/>
           <w:sz w:val="26"/>
         </w:rPr>
-        <w:t>3. Vital Safety Protocols</w:t>
+        <w:t>Vital Safety Protocols</w:t>
       </w:r>
     </w:p>
     <w:p>
@@ -9920,7 +9920,7 @@
         <w:spacing w:before="320" w:after="120" w:line="276" w:lineRule="auto"/>
       </w:pPr>
       <w:r>
-        <w:t>7. Seamless Itinerary Integration Around Ben Thanh Market</w:t>
+        <w:t>Seamless Itinerary Integration Around Ben Thanh Market</w:t>
       </w:r>
       <w:r>
         <w:rPr>
@@ -9929,7 +9929,7 @@
           <w:color w:val="1B365D"/>
           <w:sz w:val="32"/>
         </w:rPr>
-        <w:t>7. Seamless Itinerary Integration Around Ben Thanh Market</w:t>
+        <w:t>Seamless Itinerary Integration Around Ben Thanh Market</w:t>
       </w:r>
     </w:p>
     <w:p>
@@ -10056,7 +10056,7 @@
         <w:spacing w:before="320" w:after="120" w:line="276" w:lineRule="auto"/>
       </w:pPr>
       <w:r>
-        <w:t>8. Epilogue: The Urban Rhythm from Above</w:t>
+        <w:t>Epilogue: The Urban Rhythm from Above</w:t>
       </w:r>
       <w:r>
         <w:rPr>
@@ -10065,7 +10065,7 @@
           <w:color w:val="1B365D"/>
           <w:sz w:val="32"/>
         </w:rPr>
-        <w:t>8. Epilogue: The Urban Rhythm from Above</w:t>
+        <w:t>Epilogue: The Urban Rhythm from Above</w:t>
       </w:r>
     </w:p>
     <w:p>
@@ -10136,7 +10136,7 @@
         <w:spacing w:before="320" w:after="120" w:line="276" w:lineRule="auto"/>
       </w:pPr>
       <w:r>
-        <w:t>1. Introduction: The Allure of Saigon’s Hidden Perches</w:t>
+        <w:t>Introduction: The Allure of Saigon’s Hidden Perches</w:t>
       </w:r>
       <w:r>
         <w:rPr>
@@ -10145,7 +10145,7 @@
           <w:color w:val="1B365D"/>
           <w:sz w:val="32"/>
         </w:rPr>
-        <w:t>1. Introduction: The Allure of Saigon’s Hidden Perches</w:t>
+        <w:t>Introduction: The Allure of Saigon’s Hidden Perches</w:t>
       </w:r>
     </w:p>
     <w:p>
@@ -10217,7 +10217,7 @@
         <w:spacing w:before="320" w:after="120" w:line="276" w:lineRule="auto"/>
       </w:pPr>
       <w:r>
-        <w:t>2. Adaptive Heritage: The Renaissance of Residential Blocks</w:t>
+        <w:t>Adaptive Heritage: The Renaissance of Residential Blocks</w:t>
       </w:r>
       <w:r>
         <w:rPr>
@@ -10226,7 +10226,7 @@
           <w:color w:val="1B365D"/>
           <w:sz w:val="32"/>
         </w:rPr>
-        <w:t>2. Adaptive Heritage: The Renaissance of Residential Blocks</w:t>
+        <w:t>Adaptive Heritage: The Renaissance of Residential Blocks</w:t>
       </w:r>
     </w:p>
     <w:p>
@@ -10334,7 +10334,7 @@
         <w:spacing w:before="320" w:after="120" w:line="276" w:lineRule="auto"/>
       </w:pPr>
       <w:r>
-        <w:t>3. Four Iconic Heritage Apartment Buildings Near Ben Thanh</w:t>
+        <w:t>Four Iconic Heritage Apartment Buildings Near Ben Thanh</w:t>
       </w:r>
       <w:r>
         <w:rPr>
@@ -10343,7 +10343,7 @@
           <w:color w:val="1B365D"/>
           <w:sz w:val="32"/>
         </w:rPr>
-        <w:t>3. Four Iconic Heritage Apartment Buildings Near Ben Thanh</w:t>
+        <w:t>Four Iconic Heritage Apartment Buildings Near Ben Thanh</w:t>
       </w:r>
     </w:p>
     <w:p>
@@ -10367,7 +10367,7 @@
         <w:spacing w:before="240" w:after="80" w:line="276" w:lineRule="auto"/>
       </w:pPr>
       <w:r>
-        <w:t>1. 42 Ton That Thiep – The Artisanal &amp; Bohemian Labyrinth</w:t>
+        <w:t>42 Ton That Thiep – The Artisanal &amp; Bohemian Labyrinth</w:t>
       </w:r>
       <w:r>
         <w:rPr>
@@ -10376,7 +10376,7 @@
           <w:color w:val="D97706"/>
           <w:sz w:val="26"/>
         </w:rPr>
-        <w:t>1. 42 Ton That Thiep – The Artisanal &amp; Bohemian Labyrinth</w:t>
+        <w:t>42 Ton That Thiep – The Artisanal &amp; Bohemian Labyrinth</w:t>
       </w:r>
     </w:p>
     <w:p>
@@ -10504,7 +10504,7 @@
         <w:spacing w:before="240" w:after="80" w:line="276" w:lineRule="auto"/>
       </w:pPr>
       <w:r>
-        <w:t>2. 26 Ly Tu Trong – The Creative Vanguard</w:t>
+        <w:t>26 Ly Tu Trong – The Creative Vanguard</w:t>
       </w:r>
       <w:r>
         <w:rPr>
@@ -10513,7 +10513,7 @@
           <w:color w:val="D97706"/>
           <w:sz w:val="26"/>
         </w:rPr>
-        <w:t>2. 26 Ly Tu Trong – The Creative Vanguard</w:t>
+        <w:t>26 Ly Tu Trong – The Creative Vanguard</w:t>
       </w:r>
     </w:p>
     <w:p>
@@ -10641,7 +10641,7 @@
         <w:spacing w:before="240" w:after="80" w:line="276" w:lineRule="auto"/>
       </w:pPr>
       <w:r>
-        <w:t>3. 14 Ton That Dam – The Cinematic Riverfront Relic</w:t>
+        <w:t>14 Ton That Dam – The Cinematic Riverfront Relic</w:t>
       </w:r>
       <w:r>
         <w:rPr>
@@ -10650,7 +10650,7 @@
           <w:color w:val="D97706"/>
           <w:sz w:val="26"/>
         </w:rPr>
-        <w:t>3. 14 Ton That Dam – The Cinematic Riverfront Relic</w:t>
+        <w:t>14 Ton That Dam – The Cinematic Riverfront Relic</w:t>
       </w:r>
     </w:p>
     <w:p>
@@ -10795,7 +10795,7 @@
         <w:spacing w:before="240" w:after="80" w:line="276" w:lineRule="auto"/>
       </w:pPr>
       <w:r>
-        <w:t>4. The Balcony Flats of Pasteur &amp; Le Loi</w:t>
+        <w:t>The Balcony Flats of Pasteur &amp; Le Loi</w:t>
       </w:r>
       <w:r>
         <w:rPr>
@@ -10804,7 +10804,7 @@
           <w:color w:val="D97706"/>
           <w:sz w:val="26"/>
         </w:rPr>
-        <w:t>4. The Balcony Flats of Pasteur &amp; Le Loi</w:t>
+        <w:t>The Balcony Flats of Pasteur &amp; Le Loi</w:t>
       </w:r>
     </w:p>
     <w:p>
@@ -10921,7 +10921,7 @@
         <w:spacing w:before="320" w:after="120" w:line="276" w:lineRule="auto"/>
       </w:pPr>
       <w:r>
-        <w:t>4. The Beverage Matrix: From Traditional Phin to Specialty Third Wave</w:t>
+        <w:t>The Beverage Matrix: From Traditional Phin to Specialty Third Wave</w:t>
       </w:r>
       <w:r>
         <w:rPr>
@@ -10930,7 +10930,7 @@
           <w:color w:val="1B365D"/>
           <w:sz w:val="32"/>
         </w:rPr>
-        <w:t>4. The Beverage Matrix: From Traditional Phin to Specialty Third Wave</w:t>
+        <w:t>The Beverage Matrix: From Traditional Phin to Specialty Third Wave</w:t>
       </w:r>
     </w:p>
     <w:p>
@@ -10974,7 +10974,7 @@
         <w:spacing w:before="320" w:after="120" w:line="276" w:lineRule="auto"/>
       </w:pPr>
       <w:r>
-        <w:t>5. Conscious Voyager Etiquette for Residential Walk-Ups</w:t>
+        <w:t>Conscious Voyager Etiquette for Residential Walk-Ups</w:t>
       </w:r>
       <w:r>
         <w:rPr>
@@ -10983,7 +10983,7 @@
           <w:color w:val="1B365D"/>
           <w:sz w:val="32"/>
         </w:rPr>
-        <w:t>5. Conscious Voyager Etiquette for Residential Walk-Ups</w:t>
+        <w:t>Conscious Voyager Etiquette for Residential Walk-Ups</w:t>
       </w:r>
     </w:p>
     <w:p>
@@ -11126,7 +11126,7 @@
         <w:spacing w:before="320" w:after="120" w:line="276" w:lineRule="auto"/>
       </w:pPr>
       <w:r>
-        <w:t>6. Epilogue: The Timeless Pause</w:t>
+        <w:t>Epilogue: The Timeless Pause</w:t>
       </w:r>
       <w:r>
         <w:rPr>
@@ -11135,7 +11135,7 @@
           <w:color w:val="1B365D"/>
           <w:sz w:val="32"/>
         </w:rPr>
-        <w:t>6. Epilogue: The Timeless Pause</w:t>
+        <w:t>Epilogue: The Timeless Pause</w:t>
       </w:r>
     </w:p>
     <w:p>
@@ -11206,7 +11206,7 @@
         <w:spacing w:before="320" w:after="120" w:line="276" w:lineRule="auto"/>
       </w:pPr>
       <w:r>
-        <w:t>1. Introduction: When Saigon Kindles Her Constellations</w:t>
+        <w:t>Introduction: When Saigon Kindles Her Constellations</w:t>
       </w:r>
       <w:r>
         <w:rPr>
@@ -11215,7 +11215,7 @@
           <w:color w:val="1B365D"/>
           <w:sz w:val="32"/>
         </w:rPr>
-        <w:t>1. Introduction: When Saigon Kindles Her Constellations</w:t>
+        <w:t>Introduction: When Saigon Kindles Her Constellations</w:t>
       </w:r>
     </w:p>
     <w:p>
@@ -11270,7 +11270,7 @@
         <w:spacing w:before="320" w:after="120" w:line="276" w:lineRule="auto"/>
       </w:pPr>
       <w:r>
-        <w:t>2. Terroir Mixology: The Rise of Vietnamese Craft Cocktails</w:t>
+        <w:t>Terroir Mixology: The Rise of Vietnamese Craft Cocktails</w:t>
       </w:r>
       <w:r>
         <w:rPr>
@@ -11279,7 +11279,7 @@
           <w:color w:val="1B365D"/>
           <w:sz w:val="32"/>
         </w:rPr>
-        <w:t>2. Terroir Mixology: The Rise of Vietnamese Craft Cocktails</w:t>
+        <w:t>Terroir Mixology: The Rise of Vietnamese Craft Cocktails</w:t>
       </w:r>
     </w:p>
     <w:p>
@@ -11413,7 +11413,7 @@
         <w:spacing w:before="320" w:after="120" w:line="276" w:lineRule="auto"/>
       </w:pPr>
       <w:r>
-        <w:t>3. Four Unrivaled Rooftop Vantage Points Overlooking Ben Thanh</w:t>
+        <w:t>Four Unrivaled Rooftop Vantage Points Overlooking Ben Thanh</w:t>
       </w:r>
       <w:r>
         <w:rPr>
@@ -11422,7 +11422,7 @@
           <w:color w:val="1B365D"/>
           <w:sz w:val="32"/>
         </w:rPr>
-        <w:t>3. Four Unrivaled Rooftop Vantage Points Overlooking Ben Thanh</w:t>
+        <w:t>Four Unrivaled Rooftop Vantage Points Overlooking Ben Thanh</w:t>
       </w:r>
     </w:p>
     <w:p>
@@ -11446,7 +11446,7 @@
         <w:spacing w:before="240" w:after="80" w:line="276" w:lineRule="auto"/>
       </w:pPr>
       <w:r>
-        <w:t>1. The Clocktower Overlook Lounges (Phan Boi Chau &amp; Le Lai)</w:t>
+        <w:t>The Clocktower Overlook Lounges (Phan Boi Chau &amp; Le Lai)</w:t>
       </w:r>
       <w:r>
         <w:rPr>
@@ -11455,7 +11455,7 @@
           <w:color w:val="D97706"/>
           <w:sz w:val="26"/>
         </w:rPr>
-        <w:t>1. The Clocktower Overlook Lounges (Phan Boi Chau &amp; Le Lai)</w:t>
+        <w:t>The Clocktower Overlook Lounges (Phan Boi Chau &amp; Le Lai)</w:t>
       </w:r>
     </w:p>
     <w:p>
@@ -11600,7 +11600,7 @@
         <w:spacing w:before="240" w:after="80" w:line="276" w:lineRule="auto"/>
       </w:pPr>
       <w:r>
-        <w:t>2. Heritage Roof Perches of Ton That Thiep &amp; Huynh Thuc Khang</w:t>
+        <w:t>Heritage Roof Perches of Ton That Thiep &amp; Huynh Thuc Khang</w:t>
       </w:r>
       <w:r>
         <w:rPr>
@@ -11609,7 +11609,7 @@
           <w:color w:val="D97706"/>
           <w:sz w:val="26"/>
         </w:rPr>
-        <w:t>2. Heritage Roof Perches of Ton That Thiep &amp; Huynh Thuc Khang</w:t>
+        <w:t>Heritage Roof Perches of Ton That Thiep &amp; Huynh Thuc Khang</w:t>
       </w:r>
     </w:p>
     <w:p>
@@ -11754,7 +11754,7 @@
         <w:spacing w:before="240" w:after="80" w:line="276" w:lineRule="auto"/>
       </w:pPr>
       <w:r>
-        <w:t>3. Grand Panoramas on Le Loi &amp; Nam Ky Khoi Nghia</w:t>
+        <w:t>Grand Panoramas on Le Loi &amp; Nam Ky Khoi Nghia</w:t>
       </w:r>
       <w:r>
         <w:rPr>
@@ -11763,7 +11763,7 @@
           <w:color w:val="D97706"/>
           <w:sz w:val="26"/>
         </w:rPr>
-        <w:t>3. Grand Panoramas on Le Loi &amp; Nam Ky Khoi Nghia</w:t>
+        <w:t>Grand Panoramas on Le Loi &amp; Nam Ky Khoi Nghia</w:t>
       </w:r>
     </w:p>
     <w:p>
@@ -11923,7 +11923,7 @@
         <w:spacing w:before="320" w:after="120" w:line="276" w:lineRule="auto"/>
       </w:pPr>
       <w:r>
-        <w:t>4. The Subterranean Realm: Hidden Alleyway Speakeasies</w:t>
+        <w:t>The Subterranean Realm: Hidden Alleyway Speakeasies</w:t>
       </w:r>
       <w:r>
         <w:rPr>
@@ -11932,7 +11932,7 @@
           <w:color w:val="1B365D"/>
           <w:sz w:val="32"/>
         </w:rPr>
-        <w:t>4. The Subterranean Realm: Hidden Alleyway Speakeasies</w:t>
+        <w:t>The Subterranean Realm: Hidden Alleyway Speakeasies</w:t>
       </w:r>
     </w:p>
     <w:p>
@@ -12083,7 +12083,7 @@
         <w:spacing w:before="320" w:after="120" w:line="276" w:lineRule="auto"/>
       </w:pPr>
       <w:r>
-        <w:t>5. Curated Beverage Tariff Matrix (2026 Reference)</w:t>
+        <w:t>Curated Beverage Tariff Matrix (2026 Reference)</w:t>
       </w:r>
       <w:r>
         <w:rPr>
@@ -12092,7 +12092,7 @@
           <w:color w:val="1B365D"/>
           <w:sz w:val="32"/>
         </w:rPr>
-        <w:t>5. Curated Beverage Tariff Matrix (2026 Reference)</w:t>
+        <w:t>Curated Beverage Tariff Matrix (2026 Reference)</w:t>
       </w:r>
     </w:p>
     <w:p>
@@ -12120,7 +12120,7 @@
         <w:spacing w:before="320" w:after="120" w:line="276" w:lineRule="auto"/>
       </w:pPr>
       <w:r>
-        <w:t>6. Field Protocols for Nocturnal Elegance</w:t>
+        <w:t>Field Protocols for Nocturnal Elegance</w:t>
       </w:r>
       <w:r>
         <w:rPr>
@@ -12129,7 +12129,7 @@
           <w:color w:val="1B365D"/>
           <w:sz w:val="32"/>
         </w:rPr>
-        <w:t>6. Field Protocols for Nocturnal Elegance</w:t>
+        <w:t>Field Protocols for Nocturnal Elegance</w:t>
       </w:r>
     </w:p>
     <w:p>
@@ -12263,7 +12263,7 @@
         <w:spacing w:before="320" w:after="120" w:line="276" w:lineRule="auto"/>
       </w:pPr>
       <w:r>
-        <w:t>7. Epilogue: Toasting the Eternal Metropolis</w:t>
+        <w:t>Epilogue: Toasting the Eternal Metropolis</w:t>
       </w:r>
       <w:r>
         <w:rPr>
@@ -12272,7 +12272,7 @@
           <w:color w:val="1B365D"/>
           <w:sz w:val="32"/>
         </w:rPr>
-        <w:t>7. Epilogue: Toasting the Eternal Metropolis</w:t>
+        <w:t>Epilogue: Toasting the Eternal Metropolis</w:t>
       </w:r>
     </w:p>
     <w:p>
@@ -12343,7 +12343,7 @@
         <w:spacing w:before="320" w:after="120" w:line="276" w:lineRule="auto"/>
       </w:pPr>
       <w:r>
-        <w:t>1. Introduction: Hospitality Imbued with Heritage</w:t>
+        <w:t>Introduction: Hospitality Imbued with Heritage</w:t>
       </w:r>
       <w:r>
         <w:rPr>
@@ -12352,7 +12352,7 @@
           <w:color w:val="1B365D"/>
           <w:sz w:val="32"/>
         </w:rPr>
-        <w:t>1. Introduction: Hospitality Imbued with Heritage</w:t>
+        <w:t>Introduction: Hospitality Imbued with Heritage</w:t>
       </w:r>
     </w:p>
     <w:p>
@@ -12407,7 +12407,7 @@
         <w:spacing w:before="320" w:after="120" w:line="276" w:lineRule="auto"/>
       </w:pPr>
       <w:r>
-        <w:t>2. Core Hallmarks of a Bespoke Saigon Boutique Hotel</w:t>
+        <w:t>Core Hallmarks of a Bespoke Saigon Boutique Hotel</w:t>
       </w:r>
       <w:r>
         <w:rPr>
@@ -12416,7 +12416,7 @@
           <w:color w:val="1B365D"/>
           <w:sz w:val="32"/>
         </w:rPr>
-        <w:t>2. Core Hallmarks of a Bespoke Saigon Boutique Hotel</w:t>
+        <w:t>Core Hallmarks of a Bespoke Saigon Boutique Hotel</w:t>
       </w:r>
     </w:p>
     <w:p>
@@ -12559,7 +12559,7 @@
         <w:spacing w:before="320" w:after="120" w:line="276" w:lineRule="auto"/>
       </w:pPr>
       <w:r>
-        <w:t>3. Five Exceptional Boutique &amp; Heritage Sanctuaries Near Ben Thanh</w:t>
+        <w:t>Five Exceptional Boutique &amp; Heritage Sanctuaries Near Ben Thanh</w:t>
       </w:r>
       <w:r>
         <w:rPr>
@@ -12568,7 +12568,7 @@
           <w:color w:val="1B365D"/>
           <w:sz w:val="32"/>
         </w:rPr>
-        <w:t>3. Five Exceptional Boutique &amp; Heritage Sanctuaries Near Ben Thanh</w:t>
+        <w:t>Five Exceptional Boutique &amp; Heritage Sanctuaries Near Ben Thanh</w:t>
       </w:r>
     </w:p>
     <w:p>
@@ -12592,7 +12592,7 @@
         <w:spacing w:before="240" w:after="80" w:line="276" w:lineRule="auto"/>
       </w:pPr>
       <w:r>
-        <w:t>1. The Myst Dong Khoi – Ode to Ba Son Shipyards &amp; Alleyway Nostalgia</w:t>
+        <w:t>The Myst Dong Khoi – Ode to Ba Son Shipyards &amp; Alleyway Nostalgia</w:t>
       </w:r>
       <w:r>
         <w:rPr>
@@ -12601,7 +12601,7 @@
           <w:color w:val="D97706"/>
           <w:sz w:val="26"/>
         </w:rPr>
-        <w:t>1. The Myst Dong Khoi – Ode to Ba Son Shipyards &amp; Alleyway Nostalgia</w:t>
+        <w:t>The Myst Dong Khoi – Ode to Ba Son Shipyards &amp; Alleyway Nostalgia</w:t>
       </w:r>
     </w:p>
     <w:p>
@@ -12729,7 +12729,7 @@
         <w:spacing w:before="240" w:after="80" w:line="276" w:lineRule="auto"/>
       </w:pPr>
       <w:r>
-        <w:t>2. Silverland Yen Hotel – A Zen Oasis Behind the North Gate</w:t>
+        <w:t>Silverland Yen Hotel – A Zen Oasis Behind the North Gate</w:t>
       </w:r>
       <w:r>
         <w:rPr>
@@ -12738,7 +12738,7 @@
           <w:color w:val="D97706"/>
           <w:sz w:val="26"/>
         </w:rPr>
-        <w:t>2. Silverland Yen Hotel – A Zen Oasis Behind the North Gate</w:t>
+        <w:t>Silverland Yen Hotel – A Zen Oasis Behind the North Gate</w:t>
       </w:r>
     </w:p>
     <w:p>
@@ -12866,7 +12866,7 @@
         <w:spacing w:before="240" w:after="80" w:line="276" w:lineRule="auto"/>
       </w:pPr>
       <w:r>
-        <w:t>3. Hotel Continental Saigon – Vietnam’s Oldest Grand Hotel (Inaugurated 1880)</w:t>
+        <w:t>Hotel Continental Saigon – Vietnam’s Oldest Grand Hotel (Inaugurated 1880)</w:t>
       </w:r>
       <w:r>
         <w:rPr>
@@ -12875,7 +12875,7 @@
           <w:color w:val="D97706"/>
           <w:sz w:val="26"/>
         </w:rPr>
-        <w:t>3. Hotel Continental Saigon – Vietnam’s Oldest Grand Hotel (Inaugurated 1880)</w:t>
+        <w:t>Hotel Continental Saigon – Vietnam’s Oldest Grand Hotel (Inaugurated 1880)</w:t>
       </w:r>
     </w:p>
     <w:p>
@@ -13020,7 +13020,7 @@
         <w:spacing w:before="240" w:after="80" w:line="276" w:lineRule="auto"/>
       </w:pPr>
       <w:r>
-        <w:t>4. La Siesta Premium Sai Gon – Sophisticated Indochine Glamour</w:t>
+        <w:t>La Siesta Premium Sai Gon – Sophisticated Indochine Glamour</w:t>
       </w:r>
       <w:r>
         <w:rPr>
@@ -13029,7 +13029,7 @@
           <w:color w:val="D97706"/>
           <w:sz w:val="26"/>
         </w:rPr>
-        <w:t>4. La Siesta Premium Sai Gon – Sophisticated Indochine Glamour</w:t>
+        <w:t>La Siesta Premium Sai Gon – Sophisticated Indochine Glamour</w:t>
       </w:r>
     </w:p>
     <w:p>
@@ -13157,7 +13157,7 @@
         <w:spacing w:before="240" w:after="80" w:line="276" w:lineRule="auto"/>
       </w:pPr>
       <w:r>
-        <w:t>5. Fusion Original Saigon Centre – Modernist Artistry on the Metro Line</w:t>
+        <w:t>Fusion Original Saigon Centre – Modernist Artistry on the Metro Line</w:t>
       </w:r>
       <w:r>
         <w:rPr>
@@ -13166,7 +13166,7 @@
           <w:color w:val="D97706"/>
           <w:sz w:val="26"/>
         </w:rPr>
-        <w:t>5. Fusion Original Saigon Centre – Modernist Artistry on the Metro Line</w:t>
+        <w:t>Fusion Original Saigon Centre – Modernist Artistry on the Metro Line</w:t>
       </w:r>
     </w:p>
     <w:p>
@@ -13326,7 +13326,7 @@
         <w:spacing w:before="320" w:after="120" w:line="276" w:lineRule="auto"/>
       </w:pPr>
       <w:r>
-        <w:t>4. Comparative Matrix: Premier Sanctuaries at a Glance</w:t>
+        <w:t>Comparative Matrix: Premier Sanctuaries at a Glance</w:t>
       </w:r>
       <w:r>
         <w:rPr>
@@ -13335,7 +13335,7 @@
           <w:color w:val="1B365D"/>
           <w:sz w:val="32"/>
         </w:rPr>
-        <w:t>4. Comparative Matrix: Premier Sanctuaries at a Glance</w:t>
+        <w:t>Comparative Matrix: Premier Sanctuaries at a Glance</w:t>
       </w:r>
     </w:p>
     <w:p>
@@ -13363,7 +13363,7 @@
         <w:spacing w:before="320" w:after="120" w:line="276" w:lineRule="auto"/>
       </w:pPr>
       <w:r>
-        <w:t>5. Strategic Reservation Guidance for the Discerning Guest</w:t>
+        <w:t>Strategic Reservation Guidance for the Discerning Guest</w:t>
       </w:r>
       <w:r>
         <w:rPr>
@@ -13372,7 +13372,7 @@
           <w:color w:val="1B365D"/>
           <w:sz w:val="32"/>
         </w:rPr>
-        <w:t>5. Strategic Reservation Guidance for the Discerning Guest</w:t>
+        <w:t>Strategic Reservation Guidance for the Discerning Guest</w:t>
       </w:r>
     </w:p>
     <w:p>
@@ -13473,7 +13473,7 @@
         <w:spacing w:before="320" w:after="120" w:line="276" w:lineRule="auto"/>
       </w:pPr>
       <w:r>
-        <w:t>6. Epilogue: Awakening to Saigon’s Living Grace</w:t>
+        <w:t>Epilogue: Awakening to Saigon’s Living Grace</w:t>
       </w:r>
       <w:r>
         <w:rPr>
@@ -13482,7 +13482,7 @@
           <w:color w:val="1B365D"/>
           <w:sz w:val="32"/>
         </w:rPr>
-        <w:t>6. Epilogue: Awakening to Saigon’s Living Grace</w:t>
+        <w:t>Epilogue: Awakening to Saigon’s Living Grace</w:t>
       </w:r>
     </w:p>
     <w:p>
@@ -13553,7 +13553,7 @@
         <w:spacing w:before="320" w:after="120" w:line="276" w:lineRule="auto"/>
       </w:pPr>
       <w:r>
-        <w:t>1. Introduction: Far More Than a Commodity Bazaar</w:t>
+        <w:t>Introduction: Far More Than a Commodity Bazaar</w:t>
       </w:r>
       <w:r>
         <w:rPr>
@@ -13562,7 +13562,7 @@
           <w:color w:val="1B365D"/>
           <w:sz w:val="32"/>
         </w:rPr>
-        <w:t>1. Introduction: Far More Than a Commodity Bazaar</w:t>
+        <w:t>Introduction: Far More Than a Commodity Bazaar</w:t>
       </w:r>
     </w:p>
     <w:p>
@@ -13634,7 +13634,7 @@
         <w:spacing w:before="320" w:after="120" w:line="276" w:lineRule="auto"/>
       </w:pPr>
       <w:r>
-        <w:t>2. Master Map: 15 Experiences Across Four Golden Windows</w:t>
+        <w:t>Master Map: 15 Experiences Across Four Golden Windows</w:t>
       </w:r>
       <w:r>
         <w:rPr>
@@ -13643,7 +13643,7 @@
           <w:color w:val="1B365D"/>
           <w:sz w:val="32"/>
         </w:rPr>
-        <w:t>2. Master Map: 15 Experiences Across Four Golden Windows</w:t>
+        <w:t>Master Map: 15 Experiences Across Four Golden Windows</w:t>
       </w:r>
     </w:p>
     <w:p>
@@ -14446,7 +14446,7 @@
         <w:spacing w:before="320" w:after="120" w:line="276" w:lineRule="auto"/>
       </w:pPr>
       <w:r>
-        <w:t>3. Comparative Itinerary Schedules: 4-Hour Express vs. Full Day</w:t>
+        <w:t>Comparative Itinerary Schedules: 4-Hour Express vs. Full Day</w:t>
       </w:r>
       <w:r>
         <w:rPr>
@@ -14455,7 +14455,7 @@
           <w:color w:val="1B365D"/>
           <w:sz w:val="32"/>
         </w:rPr>
-        <w:t>3. Comparative Itinerary Schedules: 4-Hour Express vs. Full Day</w:t>
+        <w:t>Comparative Itinerary Schedules: 4-Hour Express vs. Full Day</w:t>
       </w:r>
     </w:p>
     <w:p>
@@ -14483,7 +14483,7 @@
         <w:spacing w:before="320" w:after="120" w:line="276" w:lineRule="auto"/>
       </w:pPr>
       <w:r>
-        <w:t>4. Key Takeaways &amp; Field Advice from The Rice Tour</w:t>
+        <w:t>Key Takeaways &amp; Field Advice from The Rice Tour</w:t>
       </w:r>
       <w:r>
         <w:rPr>
@@ -14492,7 +14492,7 @@
           <w:color w:val="1B365D"/>
           <w:sz w:val="32"/>
         </w:rPr>
-        <w:t>4. Key Takeaways &amp; Field Advice from The Rice Tour</w:t>
+        <w:t>Key Takeaways &amp; Field Advice from The Rice Tour</w:t>
       </w:r>
     </w:p>
     <w:p>
@@ -14625,7 +14625,7 @@
         <w:spacing w:before="320" w:after="120" w:line="276" w:lineRule="auto"/>
       </w:pPr>
       <w:r>
-        <w:t>1. Introduction: Stepping into Saigon's Beating Heart Like an Insider</w:t>
+        <w:t>Introduction: Stepping into Saigon's Beating Heart Like an Insider</w:t>
       </w:r>
       <w:r>
         <w:rPr>
@@ -14634,7 +14634,7 @@
           <w:color w:val="1B365D"/>
           <w:sz w:val="32"/>
         </w:rPr>
-        <w:t>1. Introduction: Stepping into Saigon's Beating Heart Like an Insider</w:t>
+        <w:t>Introduction: Stepping into Saigon's Beating Heart Like an Insider</w:t>
       </w:r>
     </w:p>
     <w:p>
@@ -14706,7 +14706,7 @@
         <w:spacing w:before="320" w:after="120" w:line="276" w:lineRule="auto"/>
       </w:pPr>
       <w:r>
-        <w:t>2. Operating Hours &amp; Two Distinct Daily Rhythms</w:t>
+        <w:t>Operating Hours &amp; Two Distinct Daily Rhythms</w:t>
       </w:r>
       <w:r>
         <w:rPr>
@@ -14715,7 +14715,7 @@
           <w:color w:val="1B365D"/>
           <w:sz w:val="32"/>
         </w:rPr>
-        <w:t>2. Operating Hours &amp; Two Distinct Daily Rhythms</w:t>
+        <w:t>Operating Hours &amp; Two Distinct Daily Rhythms</w:t>
       </w:r>
     </w:p>
     <w:p>
@@ -14739,7 +14739,7 @@
         <w:spacing w:before="240" w:after="80" w:line="276" w:lineRule="auto"/>
       </w:pPr>
       <w:r>
-        <w:t>1. The Historic Covered Hall Bazaar (06:00 – 18:00)</w:t>
+        <w:t>The Historic Covered Hall Bazaar (06:00 – 18:00)</w:t>
       </w:r>
       <w:r>
         <w:rPr>
@@ -14748,7 +14748,7 @@
           <w:color w:val="D97706"/>
           <w:sz w:val="26"/>
         </w:rPr>
-        <w:t>1. The Historic Covered Hall Bazaar (06:00 – 18:00)</w:t>
+        <w:t>The Historic Covered Hall Bazaar (06:00 – 18:00)</w:t>
       </w:r>
     </w:p>
     <w:p>
@@ -14808,7 +14808,7 @@
         <w:spacing w:before="240" w:after="80" w:line="276" w:lineRule="auto"/>
       </w:pPr>
       <w:r>
-        <w:t>2. The Open-Air Night Street Bazaar (18:00 – 23:30)</w:t>
+        <w:t>The Open-Air Night Street Bazaar (18:00 – 23:30)</w:t>
       </w:r>
       <w:r>
         <w:rPr>
@@ -14817,7 +14817,7 @@
           <w:color w:val="D97706"/>
           <w:sz w:val="26"/>
         </w:rPr>
-        <w:t>2. The Open-Air Night Street Bazaar (18:00 – 23:30)</w:t>
+        <w:t>The Open-Air Night Street Bazaar (18:00 – 23:30)</w:t>
       </w:r>
     </w:p>
     <w:p>
@@ -14892,7 +14892,7 @@
         <w:spacing w:before="320" w:after="120" w:line="276" w:lineRule="auto"/>
       </w:pPr>
       <w:r>
-        <w:t>3. Official Parking Map &amp; Scam Avoidance</w:t>
+        <w:t>Official Parking Map &amp; Scam Avoidance</w:t>
       </w:r>
       <w:r>
         <w:rPr>
@@ -14901,7 +14901,7 @@
           <w:color w:val="1B365D"/>
           <w:sz w:val="32"/>
         </w:rPr>
-        <w:t>3. Official Parking Map &amp; Scam Avoidance</w:t>
+        <w:t>Official Parking Map &amp; Scam Avoidance</w:t>
       </w:r>
     </w:p>
     <w:p>
@@ -14945,7 +14945,7 @@
         <w:spacing w:before="320" w:after="120" w:line="276" w:lineRule="auto"/>
       </w:pPr>
       <w:r>
-        <w:t>4. Currency Exchange: The Gold Shop Quarter on Phan Chu Trinh (Ha Tam &amp; Mai Van)</w:t>
+        <w:t>Currency Exchange: The Gold Shop Quarter on Phan Chu Trinh (Ha Tam &amp; Mai Van)</w:t>
       </w:r>
       <w:r>
         <w:rPr>
@@ -14954,7 +14954,7 @@
           <w:color w:val="1B365D"/>
           <w:sz w:val="32"/>
         </w:rPr>
-        <w:t>4. Currency Exchange: The Gold Shop Quarter on Phan Chu Trinh (Ha Tam &amp; Mai Van)</w:t>
+        <w:t>Currency Exchange: The Gold Shop Quarter on Phan Chu Trinh (Ha Tam &amp; Mai Van)</w:t>
       </w:r>
     </w:p>
     <w:p>
@@ -15139,7 +15139,7 @@
         <w:spacing w:before="320" w:after="120" w:line="276" w:lineRule="auto"/>
       </w:pPr>
       <w:r>
-        <w:t>5. Master Bargaining Rules: The "Smiling Negotiation" Code</w:t>
+        <w:t>Master Bargaining Rules: The "Smiling Negotiation" Code</w:t>
       </w:r>
       <w:r>
         <w:rPr>
@@ -15148,7 +15148,7 @@
           <w:color w:val="1B365D"/>
           <w:sz w:val="32"/>
         </w:rPr>
-        <w:t>5. Master Bargaining Rules: The "Smiling Negotiation" Code</w:t>
+        <w:t>Master Bargaining Rules: The "Smiling Negotiation" Code</w:t>
       </w:r>
     </w:p>
     <w:p>
@@ -15342,7 +15342,7 @@
         <w:spacing w:before="320" w:after="120" w:line="276" w:lineRule="auto"/>
       </w:pPr>
       <w:r>
-        <w:t>6. Hygiene &amp; Dining Safety in the Culinary Hall</w:t>
+        <w:t>Hygiene &amp; Dining Safety in the Culinary Hall</w:t>
       </w:r>
       <w:r>
         <w:rPr>
@@ -15351,7 +15351,7 @@
           <w:color w:val="1B365D"/>
           <w:sz w:val="32"/>
         </w:rPr>
-        <w:t>6. Hygiene &amp; Dining Safety in the Culinary Hall</w:t>
+        <w:t>Hygiene &amp; Dining Safety in the Culinary Hall</w:t>
       </w:r>
     </w:p>
     <w:p>
@@ -15519,7 +15519,7 @@
         <w:spacing w:before="320" w:after="120" w:line="276" w:lineRule="auto"/>
       </w:pPr>
       <w:r>
-        <w:t>7. Safety, Scams &amp; Emergency Contacts</w:t>
+        <w:t>Safety, Scams &amp; Emergency Contacts</w:t>
       </w:r>
       <w:r>
         <w:rPr>
@@ -15528,7 +15528,7 @@
           <w:color w:val="1B365D"/>
           <w:sz w:val="32"/>
         </w:rPr>
-        <w:t>7. Safety, Scams &amp; Emergency Contacts</w:t>
+        <w:t>Safety, Scams &amp; Emergency Contacts</w:t>
       </w:r>
     </w:p>
     <w:p>
@@ -15753,7 +15753,7 @@
         <w:spacing w:before="320" w:after="120" w:line="276" w:lineRule="auto"/>
       </w:pPr>
       <w:r>
-        <w:t>1. Introduction: The Shadows Behind the Splendor of a Century-Old Bazaar</w:t>
+        <w:t>Introduction: The Shadows Behind the Splendor of a Century-Old Bazaar</w:t>
       </w:r>
       <w:r>
         <w:rPr>
@@ -15762,7 +15762,7 @@
           <w:color w:val="1B365D"/>
           <w:sz w:val="32"/>
         </w:rPr>
-        <w:t>1. Introduction: The Shadows Behind the Splendor of a Century-Old Bazaar</w:t>
+        <w:t>Introduction: The Shadows Behind the Splendor of a Century-Old Bazaar</w:t>
       </w:r>
     </w:p>
     <w:p>
@@ -15834,7 +15834,7 @@
         <w:spacing w:before="320" w:after="120" w:line="276" w:lineRule="auto"/>
       </w:pPr>
       <w:r>
-        <w:t>2. Anatomy of the 7 Most Common Scams &amp; Traps</w:t>
+        <w:t>Anatomy of the 7 Most Common Scams &amp; Traps</w:t>
       </w:r>
       <w:r>
         <w:rPr>
@@ -15843,7 +15843,7 @@
           <w:color w:val="1B365D"/>
           <w:sz w:val="32"/>
         </w:rPr>
-        <w:t>2. Anatomy of the 7 Most Common Scams &amp; Traps</w:t>
+        <w:t>Anatomy of the 7 Most Common Scams &amp; Traps</w:t>
       </w:r>
     </w:p>
     <w:p>
@@ -16747,7 +16747,7 @@
         <w:spacing w:before="320" w:after="120" w:line="276" w:lineRule="auto"/>
       </w:pPr>
       <w:r>
-        <w:t>3. Verified Price Reference Benchmark (2026 Edition)</w:t>
+        <w:t>Verified Price Reference Benchmark (2026 Edition)</w:t>
       </w:r>
       <w:r>
         <w:rPr>
@@ -16756,7 +16756,7 @@
           <w:color w:val="1B365D"/>
           <w:sz w:val="32"/>
         </w:rPr>
-        <w:t>3. Verified Price Reference Benchmark (2026 Edition)</w:t>
+        <w:t>Verified Price Reference Benchmark (2026 Edition)</w:t>
       </w:r>
     </w:p>
     <w:p>
@@ -16800,7 +16800,7 @@
         <w:spacing w:before="320" w:after="120" w:line="276" w:lineRule="auto"/>
       </w:pPr>
       <w:r>
-        <w:t>4. Emergency Directory &amp; 24/7 Tourist Assistance</w:t>
+        <w:t>Emergency Directory &amp; 24/7 Tourist Assistance</w:t>
       </w:r>
       <w:r>
         <w:rPr>
@@ -16809,7 +16809,7 @@
           <w:color w:val="1B365D"/>
           <w:sz w:val="32"/>
         </w:rPr>
-        <w:t>4. Emergency Directory &amp; 24/7 Tourist Assistance</w:t>
+        <w:t>Emergency Directory &amp; 24/7 Tourist Assistance</w:t>
       </w:r>
     </w:p>
     <w:p>
@@ -17048,7 +17048,7 @@
         <w:spacing w:before="320" w:after="120" w:line="276" w:lineRule="auto"/>
       </w:pPr>
       <w:r>
-        <w:t>1. Introduction: Saigon's Miniature Financial Street</w:t>
+        <w:t>Introduction: Saigon's Miniature Financial Street</w:t>
       </w:r>
       <w:r>
         <w:rPr>
@@ -17057,7 +17057,7 @@
           <w:color w:val="1B365D"/>
           <w:sz w:val="32"/>
         </w:rPr>
-        <w:t>1. Introduction: Saigon's Miniature Financial Street</w:t>
+        <w:t>Introduction: Saigon's Miniature Financial Street</w:t>
       </w:r>
     </w:p>
     <w:p>
@@ -17196,7 +17196,7 @@
         <w:spacing w:before="320" w:after="120" w:line="276" w:lineRule="auto"/>
       </w:pPr>
       <w:r>
-        <w:t>2. Ha Tam vs. Mai Van: The West Gate Twin Titans</w:t>
+        <w:t>Ha Tam vs. Mai Van: The West Gate Twin Titans</w:t>
       </w:r>
       <w:r>
         <w:rPr>
@@ -17205,7 +17205,7 @@
           <w:color w:val="1B365D"/>
           <w:sz w:val="32"/>
         </w:rPr>
-        <w:t>2. Ha Tam vs. Mai Van: The West Gate Twin Titans</w:t>
+        <w:t>Ha Tam vs. Mai Van: The West Gate Twin Titans</w:t>
       </w:r>
     </w:p>
     <w:p>
@@ -17330,7 +17330,7 @@
         <w:spacing w:before="320" w:after="120" w:line="276" w:lineRule="auto"/>
       </w:pPr>
       <w:r>
-        <w:t>3. Rate Comparison: Ha Tam vs. Commercial Banks vs. Tan Son Nhat Airport</w:t>
+        <w:t>Rate Comparison: Ha Tam vs. Commercial Banks vs. Tan Son Nhat Airport</w:t>
       </w:r>
       <w:r>
         <w:rPr>
@@ -17339,7 +17339,7 @@
           <w:color w:val="1B365D"/>
           <w:sz w:val="32"/>
         </w:rPr>
-        <w:t>3. Rate Comparison: Ha Tam vs. Commercial Banks vs. Tan Son Nhat Airport</w:t>
+        <w:t>Rate Comparison: Ha Tam vs. Commercial Banks vs. Tan Son Nhat Airport</w:t>
       </w:r>
     </w:p>
     <w:p>
@@ -17367,7 +17367,7 @@
         <w:spacing w:before="320" w:after="120" w:line="276" w:lineRule="auto"/>
       </w:pPr>
       <w:r>
-        <w:t>4. Crucial Banknote Rules (Avoiding Rejection or Fee Deductions)</w:t>
+        <w:t>Crucial Banknote Rules (Avoiding Rejection or Fee Deductions)</w:t>
       </w:r>
       <w:r>
         <w:rPr>
@@ -17376,7 +17376,7 @@
           <w:color w:val="1B365D"/>
           <w:sz w:val="32"/>
         </w:rPr>
-        <w:t>4. Crucial Banknote Rules (Avoiding Rejection or Fee Deductions)</w:t>
+        <w:t>Crucial Banknote Rules (Avoiding Rejection or Fee Deductions)</w:t>
       </w:r>
     </w:p>
     <w:p>
@@ -17400,7 +17400,7 @@
         <w:spacing w:before="240" w:after="80" w:line="276" w:lineRule="auto"/>
       </w:pPr>
       <w:r>
-        <w:t>1. The USD "Big Head" vs. "Small Head" Reality</w:t>
+        <w:t>The USD "Big Head" vs. "Small Head" Reality</w:t>
       </w:r>
       <w:r>
         <w:rPr>
@@ -17409,7 +17409,7 @@
           <w:color w:val="D97706"/>
           <w:sz w:val="26"/>
         </w:rPr>
-        <w:t>1. The USD "Big Head" vs. "Small Head" Reality</w:t>
+        <w:t>The USD "Big Head" vs. "Small Head" Reality</w:t>
       </w:r>
     </w:p>
     <w:p>
@@ -17469,7 +17469,7 @@
         <w:spacing w:before="240" w:after="80" w:line="276" w:lineRule="auto"/>
       </w:pPr>
       <w:r>
-        <w:t>2. Physical Condition of Paper Currency</w:t>
+        <w:t>Physical Condition of Paper Currency</w:t>
       </w:r>
       <w:r>
         <w:rPr>
@@ -17478,7 +17478,7 @@
           <w:color w:val="D97706"/>
           <w:sz w:val="26"/>
         </w:rPr>
-        <w:t>2. Physical Condition of Paper Currency</w:t>
+        <w:t>Physical Condition of Paper Currency</w:t>
       </w:r>
     </w:p>
     <w:p>
@@ -17546,7 +17546,7 @@
         <w:spacing w:before="240" w:after="80" w:line="276" w:lineRule="auto"/>
       </w:pPr>
       <w:r>
-        <w:t>3. Large Denominations Yield Superior Rates</w:t>
+        <w:t>Large Denominations Yield Superior Rates</w:t>
       </w:r>
       <w:r>
         <w:rPr>
@@ -17555,7 +17555,7 @@
           <w:color w:val="D97706"/>
           <w:sz w:val="26"/>
         </w:rPr>
-        <w:t>3. Large Denominations Yield Superior Rates</w:t>
+        <w:t>Large Denominations Yield Superior Rates</w:t>
       </w:r>
     </w:p>
     <w:p>
@@ -17612,7 +17612,7 @@
         <w:spacing w:before="320" w:after="120" w:line="276" w:lineRule="auto"/>
       </w:pPr>
       <w:r>
-        <w:t>5. Five-Step Security Protocol for Large Cash Transactions</w:t>
+        <w:t>Five-Step Security Protocol for Large Cash Transactions</w:t>
       </w:r>
       <w:r>
         <w:rPr>
@@ -17621,7 +17621,7 @@
           <w:color w:val="1B365D"/>
           <w:sz w:val="32"/>
         </w:rPr>
-        <w:t>5. Five-Step Security Protocol for Large Cash Transactions</w:t>
+        <w:t>Five-Step Security Protocol for Large Cash Transactions</w:t>
       </w:r>
     </w:p>
     <w:p>
@@ -17839,7 +17839,7 @@
         <w:spacing w:before="320" w:after="120" w:line="276" w:lineRule="auto"/>
       </w:pPr>
       <w:r>
-        <w:t>1. Introduction: The Battle for Parking in Saigon’s Heritage Heart</w:t>
+        <w:t>Introduction: The Battle for Parking in Saigon’s Heritage Heart</w:t>
       </w:r>
       <w:r>
         <w:rPr>
@@ -17848,7 +17848,7 @@
           <w:color w:val="1B365D"/>
           <w:sz w:val="32"/>
         </w:rPr>
-        <w:t>1. Introduction: The Battle for Parking in Saigon’s Heritage Heart</w:t>
+        <w:t>Introduction: The Battle for Parking in Saigon’s Heritage Heart</w:t>
       </w:r>
     </w:p>
     <w:p>
@@ -17936,7 +17936,7 @@
         <w:spacing w:before="320" w:after="120" w:line="276" w:lineRule="auto"/>
       </w:pPr>
       <w:r>
-        <w:t>2. Master Comparison: 6 Regulated Parking Hubs &amp; 2026 Tariffs</w:t>
+        <w:t>Master Comparison: 6 Regulated Parking Hubs &amp; 2026 Tariffs</w:t>
       </w:r>
       <w:r>
         <w:rPr>
@@ -17945,7 +17945,7 @@
           <w:color w:val="1B365D"/>
           <w:sz w:val="32"/>
         </w:rPr>
-        <w:t>2. Master Comparison: 6 Regulated Parking Hubs &amp; 2026 Tariffs</w:t>
+        <w:t>Master Comparison: 6 Regulated Parking Hubs &amp; 2026 Tariffs</w:t>
       </w:r>
     </w:p>
     <w:p>
@@ -17973,7 +17973,7 @@
         <w:spacing w:before="320" w:after="120" w:line="276" w:lineRule="auto"/>
       </w:pPr>
       <w:r>
-        <w:t>3. Practical Recommendations by Vehicle Class</w:t>
+        <w:t>Practical Recommendations by Vehicle Class</w:t>
       </w:r>
       <w:r>
         <w:rPr>
@@ -17982,7 +17982,7 @@
           <w:color w:val="1B365D"/>
           <w:sz w:val="32"/>
         </w:rPr>
-        <w:t>3. Practical Recommendations by Vehicle Class</w:t>
+        <w:t>Practical Recommendations by Vehicle Class</w:t>
       </w:r>
     </w:p>
     <w:p>
@@ -18322,7 +18322,7 @@
         <w:spacing w:before="320" w:after="120" w:line="276" w:lineRule="auto"/>
       </w:pPr>
       <w:r>
-        <w:t>4. How to Spot Rogue Parking Traps &amp; 3-Step Counteraction</w:t>
+        <w:t>How to Spot Rogue Parking Traps &amp; 3-Step Counteraction</w:t>
       </w:r>
       <w:r>
         <w:rPr>
@@ -18331,7 +18331,7 @@
           <w:color w:val="1B365D"/>
           <w:sz w:val="32"/>
         </w:rPr>
-        <w:t>4. How to Spot Rogue Parking Traps &amp; 3-Step Counteraction</w:t>
+        <w:t>How to Spot Rogue Parking Traps &amp; 3-Step Counteraction</w:t>
       </w:r>
     </w:p>
     <w:p>
@@ -18525,7 +18525,7 @@
         <w:spacing w:before="320" w:after="120" w:line="276" w:lineRule="auto"/>
       </w:pPr>
       <w:r>
-        <w:t>1. Introduction: Your Gateway Ride into Saigon’s Vibrant Heart</w:t>
+        <w:t>Introduction: Your Gateway Ride into Saigon’s Vibrant Heart</w:t>
       </w:r>
       <w:r>
         <w:rPr>
@@ -18534,7 +18534,7 @@
           <w:color w:val="1B365D"/>
           <w:sz w:val="32"/>
         </w:rPr>
-        <w:t>1. Introduction: Your Gateway Ride into Saigon’s Vibrant Heart</w:t>
+        <w:t>Introduction: Your Gateway Ride into Saigon’s Vibrant Heart</w:t>
       </w:r>
     </w:p>
     <w:p>
@@ -18639,7 +18639,7 @@
         <w:spacing w:before="320" w:after="120" w:line="276" w:lineRule="auto"/>
       </w:pPr>
       <w:r>
-        <w:t>2. Master Comparison of 5 Airport Transfer Options (2026 Rates)</w:t>
+        <w:t>Master Comparison of 5 Airport Transfer Options (2026 Rates)</w:t>
       </w:r>
       <w:r>
         <w:rPr>
@@ -18648,7 +18648,7 @@
           <w:color w:val="1B365D"/>
           <w:sz w:val="32"/>
         </w:rPr>
-        <w:t>2. Master Comparison of 5 Airport Transfer Options (2026 Rates)</w:t>
+        <w:t>Master Comparison of 5 Airport Transfer Options (2026 Rates)</w:t>
       </w:r>
     </w:p>
     <w:p>
@@ -18676,7 +18676,7 @@
         <w:spacing w:before="320" w:after="120" w:line="276" w:lineRule="auto"/>
       </w:pPr>
       <w:r>
-        <w:t>3. Step-by-Step Logistics &amp; Insider Tactics</w:t>
+        <w:t>Step-by-Step Logistics &amp; Insider Tactics</w:t>
       </w:r>
       <w:r>
         <w:rPr>
@@ -18685,7 +18685,7 @@
           <w:color w:val="1B365D"/>
           <w:sz w:val="32"/>
         </w:rPr>
-        <w:t>3. Step-by-Step Logistics &amp; Insider Tactics</w:t>
+        <w:t>Step-by-Step Logistics &amp; Insider Tactics</w:t>
       </w:r>
     </w:p>
     <w:p>
@@ -19182,7 +19182,7 @@
         <w:spacing w:before="320" w:after="120" w:line="276" w:lineRule="auto"/>
       </w:pPr>
       <w:r>
-        <w:t>4. Time-of-Day Traffic Advisories</w:t>
+        <w:t>Time-of-Day Traffic Advisories</w:t>
       </w:r>
       <w:r>
         <w:rPr>
@@ -19191,7 +19191,7 @@
           <w:color w:val="1B365D"/>
           <w:sz w:val="32"/>
         </w:rPr>
-        <w:t>4. Time-of-Day Traffic Advisories</w:t>
+        <w:t>Time-of-Day Traffic Advisories</w:t>
       </w:r>
     </w:p>
     <w:p>

</xml_diff>

<commit_message>
fix(editorial): complete human writing rewrite across all 18 Ben Thanh guides and recompile docx/astro templates
</commit_message>
<xml_diff>
--- a/content-pipeline/06-word-documents/000_FULL_COLLECTION_18_ARTICLES_BEN_THANH_EN.docx
+++ b/content-pipeline/06-word-documents/000_FULL_COLLECTION_18_ARTICLES_BEN_THANH_EN.docx
@@ -72,7 +72,7 @@
         <w:spacing w:before="40" w:after="120" w:line="276" w:lineRule="auto"/>
       </w:pPr>
       <w:r>
-        <w:t>The urban quarter cradling Ben Thanh Market has long evolved beyond its identity as a bustling commercial marketplace; it stands as the veritable cultural and architectural heart of Ho Chi Minh City. Within a gentle walking radius of 300 to 1,200 meters from the iconic four-dial clock tower, travelers are treated to a captivating layered narrative: early 20th-century colonial elegance, mid-century tropical modernism at its zenith, and a visionary underground transit metropolis newly completed in 2026.</w:t>
+        <w:t>Around Ben Thanh Market, the streets tell the story of modern Ho Chi Minh City in real time. Within a 10- to 15-minute walk of the iconic clock tower, travelers encounter three distinct eras: quiet French colonial administrative buildings, mid-century tropical modernism, and the wide granite esplanades and underground concourses of the new Metro Line 1 completed in 2026.</w:t>
       </w:r>
       <w:r>
         <w:rPr>
@@ -80,24 +80,7 @@
           <w:color w:val="1E293B"/>
           <w:sz w:val="21"/>
         </w:rPr>
-        <w:t xml:space="preserve">The urban quarter cradling Ben Thanh Market has long evolved beyond its identity as a bustling commercial marketplace; it stands as the veritable </w:t>
-      </w:r>
-      <w:r>
-        <w:rPr>
-          <w:rFonts w:ascii="Calibri" w:hAnsi="Calibri"/>
-          <w:b/>
-          <w:color w:val="1E293B"/>
-          <w:sz w:val="21"/>
-        </w:rPr>
-        <w:t>cultural and architectural heart of Ho Chi Minh City</w:t>
-      </w:r>
-      <w:r>
-        <w:rPr>
-          <w:rFonts w:ascii="Calibri" w:hAnsi="Calibri"/>
-          <w:color w:val="1E293B"/>
-          <w:sz w:val="21"/>
-        </w:rPr>
-        <w:t>. Within a gentle walking radius of 300 to 1,200 meters from the iconic four-dial clock tower, travelers are treated to a captivating layered narrative: early 20th-century colonial elegance, mid-century tropical modernism at its zenith, and a visionary underground transit metropolis newly completed in 2026.</w:t>
+        <w:t>Around Ben Thanh Market, the streets tell the story of modern Ho Chi Minh City in real time. Within a 10- to 15-minute walk of the iconic clock tower, travelers encounter three distinct eras: quiet French colonial administrative buildings, mid-century tropical modernism, and the wide granite esplanades and underground concourses of the new Metro Line 1 completed in 2026.</w:t>
       </w:r>
     </w:p>
     <w:p>
@@ -120,7 +103,7 @@
         <w:spacing w:before="320" w:after="120" w:line="276" w:lineRule="auto"/>
       </w:pPr>
       <w:r>
-        <w:t>🌟 Key Curated Dimensions of the Ben Thanh Heritage Axis</w:t>
+        <w:t>🌟 At a Glance: Key Numbers &amp; Highlights Around Ben Thanh</w:t>
       </w:r>
       <w:r>
         <w:rPr>
@@ -129,7 +112,7 @@
           <w:color w:val="1B365D"/>
           <w:sz w:val="32"/>
         </w:rPr>
-        <w:t>🌟 Key Curated Dimensions of the Ben Thanh Heritage Axis</w:t>
+        <w:t>🌟 At a Glance: Key Numbers &amp; Highlights Around Ben Thanh</w:t>
       </w:r>
     </w:p>
     <w:p>
@@ -282,7 +265,7 @@
         <w:spacing w:before="320" w:after="120" w:line="276" w:lineRule="auto"/>
       </w:pPr>
       <w:r>
-        <w:t>Historical Stratigraphy: From the Ben Nghe Riverbank to a 21st-Century Crossroads</w:t>
+        <w:t>From Riverbank Wharf to Modern Crossroads: A Century of History</w:t>
       </w:r>
       <w:r>
         <w:rPr>
@@ -291,7 +274,7 @@
           <w:color w:val="1B365D"/>
           <w:sz w:val="32"/>
         </w:rPr>
-        <w:t>Historical Stratigraphy: From the Ben Nghe Riverbank to a 21st-Century Crossroads</w:t>
+        <w:t>From Riverbank Wharf to Modern Crossroads: A Century of History</w:t>
       </w:r>
     </w:p>
     <w:p>
@@ -315,7 +298,7 @@
         <w:spacing w:before="40" w:after="120" w:line="276" w:lineRule="auto"/>
       </w:pPr>
       <w:r>
-        <w:t>In the early 19th century, the ancestral precursor to Ben Thanh was a riverine trading dock along the Ben Nghe canal, nestled beneath the ramparts of the historic Gia Dinh Citadel. The very name "Bến Thành" (literally Wharf of the Citadel) arose from its utilitarian purpose: the landing pier where royal troops, merchant junks, and wandering voyagers arrived to provision the fortress. When French naval forces captured Gia Dinh in 1859, the waterside market was consumed by fire. The colonial administration subsequently rebuilt the market using timber posts and thatched roofs along the Charner Canal (now Nguyen Hue Boulevard), but the rapid influx of merchants quickly overwhelmed the confined canal banks.</w:t>
+        <w:t>In the early 19th century, the ancestral precursor to Ben Thanh was a riverine trading dock along the Ben Nghe canal, built near the ramparts of the historic Gia Dinh Citadel. The very name "Bến Thành" (literally Wharf of the Citadel) arose from its utilitarian purpose: the landing pier where royal troops, merchant junks, and wandering voyagers arrived to provision the fortress. When French naval forces captured Gia Dinh in 1859, the waterside market was consumed by fire. The colonial administration subsequently rebuilt the market using timber posts and thatched roofs along the Charner Canal (now Nguyen Hue Boulevard), but the rapid influx of merchants quickly overwhelmed the confined canal banks.</w:t>
       </w:r>
       <w:r>
         <w:rPr>
@@ -323,7 +306,7 @@
           <w:color w:val="1E293B"/>
           <w:sz w:val="21"/>
         </w:rPr>
-        <w:t xml:space="preserve">In the early 19th century, the ancestral precursor to Ben Thanh was a riverine trading dock along the Ben Nghe canal, nestled beneath the ramparts of the historic Gia Dinh Citadel. The very name </w:t>
+        <w:t xml:space="preserve">In the early 19th century, the ancestral precursor to Ben Thanh was a riverine trading dock along the Ben Nghe canal, built near the ramparts of the historic Gia Dinh Citadel. The very name </w:t>
       </w:r>
       <w:r>
         <w:rPr>
@@ -550,24 +533,24 @@
         <w:spacing w:before="20" w:after="40" w:line="276" w:lineRule="auto"/>
       </w:pPr>
       <w:r>
-        <w:t>Conscious Travel Insight: Venture beyond the outer perimeter. Step into the cooler labyrinth of interior alleys, where early 20th-century iron roof trusses still support high ceilings, facilitating natural cross-ventilation against the tropical afternoon warmth.</w:t>
-      </w:r>
-      <w:r>
-        <w:rPr>
-          <w:rFonts w:ascii="Calibri" w:hAnsi="Calibri"/>
-          <w:b/>
-          <w:color w:val="1E293B"/>
-          <w:sz w:val="20"/>
-        </w:rPr>
-        <w:t>Conscious Travel Insight:</w:t>
-      </w:r>
-      <w:r>
-        <w:rPr>
-          <w:rFonts w:ascii="Calibri" w:hAnsi="Calibri"/>
-          <w:color w:val="1E293B"/>
-          <w:sz w:val="20"/>
-        </w:rPr>
-        <w:t xml:space="preserve"> Venture beyond the outer perimeter. Step into the cooler labyrinth of interior alleys, where early 20th-century iron roof trusses still support high ceilings, facilitating natural cross-ventilation against the tropical afternoon warmth.</w:t>
+        <w:t>Insider Tip: Venture beyond the souvenir stalls at the perimeter. Step into the interior aisles, where early 20th-century iron roof trusses still support high ceilings that keep the market cool through natural cross-ventilation even on hot afternoons.</w:t>
+      </w:r>
+      <w:r>
+        <w:rPr>
+          <w:rFonts w:ascii="Calibri" w:hAnsi="Calibri"/>
+          <w:b/>
+          <w:color w:val="1E293B"/>
+          <w:sz w:val="20"/>
+        </w:rPr>
+        <w:t>Insider Tip:</w:t>
+      </w:r>
+      <w:r>
+        <w:rPr>
+          <w:rFonts w:ascii="Calibri" w:hAnsi="Calibri"/>
+          <w:color w:val="1E293B"/>
+          <w:sz w:val="20"/>
+        </w:rPr>
+        <w:t xml:space="preserve"> Venture beyond the souvenir stalls at the perimeter. Step into the interior aisles, where early 20th-century iron roof trusses still support high ceilings that keep the market cool through natural cross-ventilation even on hot afternoons.</w:t>
       </w:r>
     </w:p>
     <w:p>
@@ -575,7 +558,7 @@
         <w:spacing w:before="240" w:after="80" w:line="276" w:lineRule="auto"/>
       </w:pPr>
       <w:r>
-        <w:t>HCMC Museum of Fine Arts: Indochine Splendor in the Hui Bon Hoa Mansion</w:t>
+        <w:t>HCMC Museum of Fine Arts: Indochine Architecture &amp; Vietnamese Fine Art</w:t>
       </w:r>
       <w:r>
         <w:rPr>
@@ -584,7 +567,7 @@
           <w:color w:val="D97706"/>
           <w:sz w:val="26"/>
         </w:rPr>
-        <w:t>HCMC Museum of Fine Arts: Indochine Splendor in the Hui Bon Hoa Mansion</w:t>
+        <w:t>HCMC Museum of Fine Arts: Indochine Architecture &amp; Vietnamese Fine Art</w:t>
       </w:r>
     </w:p>
     <w:p>
@@ -619,24 +602,24 @@
         <w:spacing w:before="20" w:after="40" w:line="276" w:lineRule="auto"/>
       </w:pPr>
       <w:r>
-        <w:t>Gilded Heritage: This magnificent three-mansion estate once served as the private residence and headquarters of Hui Bon Hoa (popularly known as Chú Hỏa), the legendary Chinese-Vietnamese merchant whose real estate empire defined colonial Saigon. Designed between 1929 and 1934 by French architect Rivera, the complex represents an opulent marriage of Western Art Deco, Beaux-Arts flourishes, and traditional Feng Shui geomancy.</w:t>
-      </w:r>
-      <w:r>
-        <w:rPr>
-          <w:rFonts w:ascii="Calibri" w:hAnsi="Calibri"/>
-          <w:b/>
-          <w:color w:val="1E293B"/>
-          <w:sz w:val="20"/>
-        </w:rPr>
-        <w:t>Gilded Heritage:</w:t>
-      </w:r>
-      <w:r>
-        <w:rPr>
-          <w:rFonts w:ascii="Calibri" w:hAnsi="Calibri"/>
-          <w:color w:val="1E293B"/>
-          <w:sz w:val="20"/>
-        </w:rPr>
-        <w:t xml:space="preserve"> This magnificent three-mansion estate once served as the private residence and headquarters of </w:t>
+        <w:t>Historical Background: This three-building estate once served as the private home and company headquarters of Hui Bon Hoa (popularly known as Chú Hỏa), one of Saigon's most prominent early-20th-century merchants. Designed between 1929 and 1934 by French architect Rivera, the complex combines Western Art Deco lines, Beaux-Arts stonework, and Chinese feng shui principles.</w:t>
+      </w:r>
+      <w:r>
+        <w:rPr>
+          <w:rFonts w:ascii="Calibri" w:hAnsi="Calibri"/>
+          <w:b/>
+          <w:color w:val="1E293B"/>
+          <w:sz w:val="20"/>
+        </w:rPr>
+        <w:t>Historical Background:</w:t>
+      </w:r>
+      <w:r>
+        <w:rPr>
+          <w:rFonts w:ascii="Calibri" w:hAnsi="Calibri"/>
+          <w:color w:val="1E293B"/>
+          <w:sz w:val="20"/>
+        </w:rPr>
+        <w:t xml:space="preserve"> This three-building estate once served as the private home and company headquarters of </w:t>
       </w:r>
       <w:r>
         <w:rPr>
@@ -670,16 +653,16 @@
           <w:color w:val="1E293B"/>
           <w:sz w:val="20"/>
         </w:rPr>
-        <w:t xml:space="preserve">), the legendary Chinese-Vietnamese merchant whose real estate empire defined colonial Saigon. Designed between 1929 and 1934 by French architect Rivera, the complex represents an opulent marriage of </w:t>
-      </w:r>
-      <w:r>
-        <w:rPr>
-          <w:rFonts w:ascii="Calibri" w:hAnsi="Calibri"/>
-          <w:b/>
-          <w:color w:val="1E293B"/>
-          <w:sz w:val="20"/>
-        </w:rPr>
-        <w:t>Western Art Deco, Beaux-Arts flourishes, and traditional Feng Shui geomancy</w:t>
+        <w:t xml:space="preserve">), one of Saigon's most prominent early-20th-century merchants. Designed between 1929 and 1934 by French architect Rivera, the complex combines </w:t>
+      </w:r>
+      <w:r>
+        <w:rPr>
+          <w:rFonts w:ascii="Calibri" w:hAnsi="Calibri"/>
+          <w:b/>
+          <w:color w:val="1E293B"/>
+          <w:sz w:val="20"/>
+        </w:rPr>
+        <w:t>Western Art Deco lines, Beaux-Arts stonework, and Chinese feng shui principles</w:t>
       </w:r>
       <w:r>
         <w:rPr>
@@ -1259,7 +1242,7 @@
         <w:spacing w:before="320" w:after="120" w:line="276" w:lineRule="auto"/>
       </w:pPr>
       <w:r>
-        <w:t>Curated Matrix: Comparing Landmarks Along the Ben Thanh Axis</w:t>
+        <w:t>Key Landmarks at a Glance</w:t>
       </w:r>
       <w:r>
         <w:rPr>
@@ -1268,7 +1251,7 @@
           <w:color w:val="1B365D"/>
           <w:sz w:val="32"/>
         </w:rPr>
-        <w:t>Curated Matrix: Comparing Landmarks Along the Ben Thanh Axis</w:t>
+        <w:t>Key Landmarks at a Glance</w:t>
       </w:r>
     </w:p>
     <w:p>
@@ -1313,7 +1296,7 @@
         <w:spacing w:before="40" w:after="120" w:line="276" w:lineRule="auto"/>
       </w:pPr>
       <w:r>
-        <w:t>No encounter with Ben Thanh is complete without immersing your palate in the rich gastronomic mosaic of the southern delta.</w:t>
+        <w:t>No encounter with Ben Thanh is complete without immersing your palate in the rich culinary culture of the southern delta.</w:t>
       </w:r>
       <w:r>
         <w:rPr>
@@ -1321,7 +1304,7 @@
           <w:color w:val="1E293B"/>
           <w:sz w:val="21"/>
         </w:rPr>
-        <w:t>No encounter with Ben Thanh is complete without immersing your palate in the rich gastronomic mosaic of the southern delta.</w:t>
+        <w:t>No encounter with Ben Thanh is complete without immersing your palate in the rich culinary culture of the southern delta.</w:t>
       </w:r>
     </w:p>
     <w:p>
@@ -1898,7 +1881,7 @@
         <w:spacing w:before="320" w:after="120" w:line="276" w:lineRule="auto"/>
       </w:pPr>
       <w:r>
-        <w:t>Field Notes for the Discerning Traveler (2026 Guidelines)</w:t>
+        <w:t>Field Notes for the Traveler (2026 Guidelines)</w:t>
       </w:r>
       <w:r>
         <w:rPr>
@@ -1907,7 +1890,7 @@
           <w:color w:val="1B365D"/>
           <w:sz w:val="32"/>
         </w:rPr>
-        <w:t>Field Notes for the Discerning Traveler (2026 Guidelines)</w:t>
+        <w:t>Field Notes for the Traveler (2026 Guidelines)</w:t>
       </w:r>
     </w:p>
     <w:p>
@@ -2034,7 +2017,7 @@
         <w:spacing w:before="320" w:after="120" w:line="276" w:lineRule="auto"/>
       </w:pPr>
       <w:r>
-        <w:t>Epilogue: Preserving the Timeless Soul of Saigon</w:t>
+        <w:t>Closing Thoughts: Walking Saigon with Open Eyes</w:t>
       </w:r>
       <w:r>
         <w:rPr>
@@ -2043,7 +2026,7 @@
           <w:color w:val="1B365D"/>
           <w:sz w:val="32"/>
         </w:rPr>
-        <w:t>Epilogue: Preserving the Timeless Soul of Saigon</w:t>
+        <w:t>Closing Thoughts: Walking Saigon with Open Eyes</w:t>
       </w:r>
     </w:p>
     <w:p>
@@ -2051,7 +2034,7 @@
         <w:spacing w:before="40" w:after="120" w:line="276" w:lineRule="auto"/>
       </w:pPr>
       <w:r>
-        <w:t>No matter how many futuristic glass towers rise into the southern sky, the quarter surrounding Ben Thanh Market preserves an irreplaceable human soul. It is a soul woven from the rhythmic clatter of street life, the sweet call of wandering dessert vendors, the stoic beauty of French brick facades, and the unquenchable optimism of those who call this river city home.</w:t>
+        <w:t>No matter how many glass towers rise into the southern sky, the quarter surrounding Ben Thanh Market preserves an irreplaceable human rhythm: morning street greetings between stall keepers, quiet courtyards tucked behind bustling avenues, and the easy coexistence of old traditions with modern city life. Exploring this neighborhood on foot offers a genuine, unfiltered encounter with Saigon at its most welcoming.</w:t>
       </w:r>
       <w:r>
         <w:rPr>
@@ -2059,23 +2042,7 @@
           <w:color w:val="1E293B"/>
           <w:sz w:val="21"/>
         </w:rPr>
-        <w:t>No matter how many futuristic glass towers rise into the southern sky, the quarter surrounding Ben Thanh Market preserves an irreplaceable human soul. It is a soul woven from the rhythmic clatter of street life, the sweet call of wandering dessert vendors, the stoic beauty of French brick facades, and the unquenchable optimism of those who call this river city home.</w:t>
-      </w:r>
-    </w:p>
-    <w:p>
-      <w:pPr>
-        <w:spacing w:before="40" w:after="120" w:line="276" w:lineRule="auto"/>
-      </w:pPr>
-      <w:r>
-        <w:t>Take your time walking down these tamarind-canopied boulevards. Allow your senses to be awakened by a Saigon that is both humble and grand, timeless yet boldly accelerating into the future—a true pilgrimage for the thoughtful traveler.</w:t>
-      </w:r>
-      <w:r>
-        <w:rPr>
-          <w:rFonts w:ascii="Calibri" w:hAnsi="Calibri"/>
-          <w:color w:val="1E293B"/>
-          <w:sz w:val="21"/>
-        </w:rPr>
-        <w:t>Take your time walking down these tamarind-canopied boulevards. Allow your senses to be awakened by a Saigon that is both humble and grand, timeless yet boldly accelerating into the future—a true pilgrimage for the thoughtful traveler.</w:t>
+        <w:t>No matter how many glass towers rise into the southern sky, the quarter surrounding Ben Thanh Market preserves an irreplaceable human rhythm: morning street greetings between stall keepers, quiet courtyards tucked behind bustling avenues, and the easy coexistence of old traditions with modern city life. Exploring this neighborhood on foot offers a genuine, unfiltered encounter with Saigon at its most welcoming.</w:t>
       </w:r>
     </w:p>
     <w:p>
@@ -2088,7 +2055,7 @@
         <w:spacing w:before="280" w:after="120"/>
       </w:pPr>
       <w:r>
-        <w:t>HCMC Museum of Fine Arts: Inside the Gilded Legacy of Hui Bon Hoa</w:t>
+        <w:t>HCMC Museum of Fine Arts: Inside the Historic Estate of Hui Bon Hoa</w:t>
       </w:r>
       <w:r>
         <w:rPr>
@@ -2097,7 +2064,7 @@
           <w:color w:val="1B365D"/>
           <w:sz w:val="42"/>
         </w:rPr>
-        <w:t>HCMC Museum of Fine Arts: Inside the Gilded Legacy of Hui Bon Hoa</w:t>
+        <w:t>HCMC Museum of Fine Arts: Inside the Historic Estate of Hui Bon Hoa</w:t>
       </w:r>
     </w:p>
     <w:p>
@@ -2802,7 +2769,7 @@
         <w:spacing w:before="320" w:after="120" w:line="276" w:lineRule="auto"/>
       </w:pPr>
       <w:r>
-        <w:t>Curated Field Notes for the Discerning Traveler (2026)</w:t>
+        <w:t>Curated Field Notes for the Traveler (2026)</w:t>
       </w:r>
       <w:r>
         <w:rPr>
@@ -2811,7 +2778,7 @@
           <w:color w:val="1B365D"/>
           <w:sz w:val="32"/>
         </w:rPr>
-        <w:t>Curated Field Notes for the Discerning Traveler (2026)</w:t>
+        <w:t>Curated Field Notes for the Traveler (2026)</w:t>
       </w:r>
     </w:p>
     <w:p>
@@ -3058,7 +3025,7 @@
         <w:spacing w:before="280" w:after="120"/>
       </w:pPr>
       <w:r>
-        <w:t>The Culinary Maze of Ben Thanh: Signature Stalls &amp; Night Street Delicacies</w:t>
+        <w:t>Ben Thanh Market Food Guide: Iconic Heritage Stalls &amp; Night Street Dining</w:t>
       </w:r>
       <w:r>
         <w:rPr>
@@ -3067,7 +3034,7 @@
           <w:color w:val="1B365D"/>
           <w:sz w:val="42"/>
         </w:rPr>
-        <w:t>The Culinary Maze of Ben Thanh: Signature Stalls &amp; Night Street Delicacies</w:t>
+        <w:t>Ben Thanh Market Food Guide: Iconic Heritage Stalls &amp; Night Street Dining</w:t>
       </w:r>
     </w:p>
     <w:p>
@@ -3214,7 +3181,7 @@
         <w:spacing w:before="20" w:after="40" w:line="276" w:lineRule="auto"/>
       </w:pPr>
       <w:r>
-        <w:t>16 Southern Sweet Soups: Showcased in jewel-toned glass bowls at Ba Muoi’s traditional dessert stall, serving market crowds since 1968.</w:t>
+        <w:t>16 Southern Sweet Soups: Showcased in jewel-toned glass bowls at Che Be’s traditional dessert stall (Stall 1119), serving market crowds since 1968.</w:t>
       </w:r>
       <w:r>
         <w:rPr>
@@ -3231,7 +3198,7 @@
           <w:color w:val="1E293B"/>
           <w:sz w:val="20"/>
         </w:rPr>
-        <w:t xml:space="preserve"> Showcased in jewel-toned glass bowls at Ba Muoi’s traditional dessert stall, serving market crowds since 1968.</w:t>
+        <w:t xml:space="preserve"> Showcased in jewel-toned glass bowls at Che Be’s traditional dessert stall (Stall 1119), serving market crowds since 1968.</w:t>
       </w:r>
     </w:p>
     <w:p>
@@ -3280,7 +3247,7 @@
         <w:spacing w:before="320" w:after="120" w:line="276" w:lineRule="auto"/>
       </w:pPr>
       <w:r>
-        <w:t>Southern Gastronomic Philosophy: The Bold Soul of Alluvial Soil</w:t>
+        <w:t>Southern Culinary Philosophy: The Bold Soul of Alluvial Soil</w:t>
       </w:r>
       <w:r>
         <w:rPr>
@@ -3289,7 +3256,7 @@
           <w:color w:val="1B365D"/>
           <w:sz w:val="32"/>
         </w:rPr>
-        <w:t>Southern Gastronomic Philosophy: The Bold Soul of Alluvial Soil</w:t>
+        <w:t>Southern Culinary Philosophy: The Bold Soul of Alluvial Soil</w:t>
       </w:r>
     </w:p>
     <w:p>
@@ -3676,7 +3643,7 @@
         <w:spacing w:before="240" w:after="80" w:line="276" w:lineRule="auto"/>
       </w:pPr>
       <w:r>
-        <w:t>Ba Muoi’s Sweet Soup Stall: 60 Years of Sugarcane Romance</w:t>
+        <w:t>Chè Bé Dessert Stall (Stall 1119): Southern Sweet Soups Since 1968</w:t>
       </w:r>
       <w:r>
         <w:rPr>
@@ -3685,7 +3652,7 @@
           <w:color w:val="D97706"/>
           <w:sz w:val="26"/>
         </w:rPr>
-        <w:t>Ba Muoi’s Sweet Soup Stall: 60 Years of Sugarcane Romance</w:t>
+        <w:t>Chè Bé Dessert Stall (Stall 1119): Southern Sweet Soups Since 1968</w:t>
       </w:r>
     </w:p>
     <w:p>
@@ -3758,7 +3725,7 @@
         <w:spacing w:before="320" w:after="120" w:line="276" w:lineRule="auto"/>
       </w:pPr>
       <w:r>
-        <w:t>Phan Boi Chau Night Dining: Charcoal Braziers Beneath the Neon Sky</w:t>
+        <w:t>Phan Boi Chau Street at Night: Sizzling Seafood &amp; Charcoal Grills</w:t>
       </w:r>
       <w:r>
         <w:rPr>
@@ -3767,7 +3734,7 @@
           <w:color w:val="1B365D"/>
           <w:sz w:val="32"/>
         </w:rPr>
-        <w:t>Phan Boi Chau Night Dining: Charcoal Braziers Beneath the Neon Sky</w:t>
+        <w:t>Phan Boi Chau Street at Night: Sizzling Seafood &amp; Charcoal Grills</w:t>
       </w:r>
     </w:p>
     <w:p>
@@ -3912,7 +3879,7 @@
         <w:spacing w:before="320" w:after="120" w:line="276" w:lineRule="auto"/>
       </w:pPr>
       <w:r>
-        <w:t>Field Notes for Conscious Gourmands (2026)</w:t>
+        <w:t>Field Notes for Food Lovers (2026)</w:t>
       </w:r>
       <w:r>
         <w:rPr>
@@ -3921,7 +3888,7 @@
           <w:color w:val="1B365D"/>
           <w:sz w:val="32"/>
         </w:rPr>
-        <w:t>Field Notes for Conscious Gourmands (2026)</w:t>
+        <w:t>Field Notes for Food Lovers (2026)</w:t>
       </w:r>
     </w:p>
     <w:p>
@@ -4158,7 +4125,7 @@
         <w:spacing w:before="40" w:after="120" w:line="276" w:lineRule="auto"/>
       </w:pPr>
       <w:r>
-        <w:t>As an anchor itinerary within our definitive guide to things to do near Ben Thanh Market, this One-Day Heritage Walking Tour has been curated by The Rice Tour to guide conscious voyagers through the very best of District 1—seamlessly aligning with the diurnal rhythms of the southern tropical climate.</w:t>
+        <w:t>As an anchor itinerary within our definitive guide to things to do near Ben Thanh Market, this One-Day Heritage Walking Tour has been curated by The Rice Tour to guide travelers through the very best of District 1—seamlessly aligning with the diurnal rhythms of the southern tropical climate.</w:t>
       </w:r>
       <w:r>
         <w:rPr>
@@ -4199,7 +4166,7 @@
           <w:color w:val="1E293B"/>
           <w:sz w:val="21"/>
         </w:rPr>
-        <w:t xml:space="preserve"> has been curated by The Rice Tour to guide conscious voyagers through the very best of District 1—seamlessly aligning with the diurnal rhythms of the southern tropical climate.</w:t>
+        <w:t xml:space="preserve"> has been curated by The Rice Tour to guide travelers through the very best of District 1—seamlessly aligning with the diurnal rhythms of the southern tropical climate.</w:t>
       </w:r>
     </w:p>
     <w:p>
@@ -4358,7 +4325,7 @@
         <w:spacing w:before="320" w:after="120" w:line="276" w:lineRule="auto"/>
       </w:pPr>
       <w:r>
-        <w:t>Slow Travel Philosophy: Embracing the City on Foot</w:t>
+        <w:t>Why District 1 Is Best Explored on Foot</w:t>
       </w:r>
       <w:r>
         <w:rPr>
@@ -4367,7 +4334,7 @@
           <w:color w:val="1B365D"/>
           <w:sz w:val="32"/>
         </w:rPr>
-        <w:t>Slow Travel Philosophy: Embracing the City on Foot</w:t>
+        <w:t>Why District 1 Is Best Explored on Foot</w:t>
       </w:r>
     </w:p>
     <w:p>
@@ -4911,7 +4878,7 @@
         <w:spacing w:before="320" w:after="120" w:line="276" w:lineRule="auto"/>
       </w:pPr>
       <w:r>
-        <w:t>Field Checklist for Conscious Voyagers (2026)</w:t>
+        <w:t>Field Checklist for Travelers (2026)</w:t>
       </w:r>
       <w:r>
         <w:rPr>
@@ -4920,7 +4887,7 @@
           <w:color w:val="1B365D"/>
           <w:sz w:val="32"/>
         </w:rPr>
-        <w:t>Field Checklist for Conscious Voyagers (2026)</w:t>
+        <w:t>Field Checklist for Travelers (2026)</w:t>
       </w:r>
     </w:p>
     <w:p>
@@ -5167,7 +5134,7 @@
         <w:spacing w:before="280" w:after="120"/>
       </w:pPr>
       <w:r>
-        <w:t>The Independence Palace: Mid-Century Modernism &amp; Historic Crossroads of Saigon</w:t>
+        <w:t>The Independence Palace: Mid-Century Modernism &amp; Historic Landmarks of Saigon</w:t>
       </w:r>
       <w:r>
         <w:rPr>
@@ -5176,7 +5143,7 @@
           <w:color w:val="1B365D"/>
           <w:sz w:val="42"/>
         </w:rPr>
-        <w:t>The Independence Palace: Mid-Century Modernism &amp; Historic Crossroads of Saigon</w:t>
+        <w:t>The Independence Palace: Mid-Century Modernism &amp; Historic Landmarks of Saigon</w:t>
       </w:r>
     </w:p>
     <w:p>
@@ -5415,7 +5382,7 @@
         <w:spacing w:before="320" w:after="120" w:line="276" w:lineRule="auto"/>
       </w:pPr>
       <w:r>
-        <w:t>Historical Stratigraphy: From Colonial Norodom Palace to National Reunification</w:t>
+        <w:t>From Norodom Palace to National Reunification: Key Historical Milestones</w:t>
       </w:r>
       <w:r>
         <w:rPr>
@@ -5424,7 +5391,7 @@
           <w:color w:val="1B365D"/>
           <w:sz w:val="32"/>
         </w:rPr>
-        <w:t>Historical Stratigraphy: From Colonial Norodom Palace to National Reunification</w:t>
+        <w:t>From Norodom Palace to National Reunification: Key Historical Milestones</w:t>
       </w:r>
     </w:p>
     <w:p>
@@ -5432,7 +5399,7 @@
         <w:spacing w:before="40" w:after="120" w:line="276" w:lineRule="auto"/>
       </w:pPr>
       <w:r>
-        <w:t>The palatial grounds have served as the fulcrum of southern governance across three distinct epochs:</w:t>
+        <w:t>The site has served as the administrative center of southern Vietnam across three distinct eras:</w:t>
       </w:r>
       <w:r>
         <w:rPr>
@@ -5440,7 +5407,7 @@
           <w:color w:val="1E293B"/>
           <w:sz w:val="21"/>
         </w:rPr>
-        <w:t>The palatial grounds have served as the fulcrum of southern governance across three distinct epochs:</w:t>
+        <w:t>The site has served as the administrative center of southern Vietnam across three distinct eras:</w:t>
       </w:r>
     </w:p>
     <w:p>
@@ -5562,7 +5529,7 @@
         <w:spacing w:before="320" w:after="120" w:line="276" w:lineRule="auto"/>
       </w:pPr>
       <w:r>
-        <w:t>Deciphering Ngo Viet Thu’s Eastern Architectural Cryptogram</w:t>
+        <w:t>Ngo Viet Thu's Symbolic Architecture: Eastern Philosophy in Concrete</w:t>
       </w:r>
       <w:r>
         <w:rPr>
@@ -5571,7 +5538,7 @@
           <w:color w:val="1B365D"/>
           <w:sz w:val="32"/>
         </w:rPr>
-        <w:t>Deciphering Ngo Viet Thu’s Eastern Architectural Cryptogram</w:t>
+        <w:t>Ngo Viet Thu's Symbolic Architecture: Eastern Philosophy in Concrete</w:t>
       </w:r>
     </w:p>
     <w:p>
@@ -5886,7 +5853,7 @@
         <w:spacing w:before="320" w:after="120" w:line="276" w:lineRule="auto"/>
       </w:pPr>
       <w:r>
-        <w:t>Field Notes for the Discerning Traveler (2026)</w:t>
+        <w:t>Field Notes for the Traveler (2026)</w:t>
       </w:r>
       <w:r>
         <w:rPr>
@@ -5895,7 +5862,7 @@
           <w:color w:val="1B365D"/>
           <w:sz w:val="32"/>
         </w:rPr>
-        <w:t>Field Notes for the Discerning Traveler (2026)</w:t>
+        <w:t>Field Notes for the Traveler (2026)</w:t>
       </w:r>
     </w:p>
     <w:p>
@@ -6399,7 +6366,7 @@
         <w:spacing w:before="320" w:after="120" w:line="276" w:lineRule="auto"/>
       </w:pPr>
       <w:r>
-        <w:t>Subterranean Renaissance: Reimagining the Urban Landscape</w:t>
+        <w:t>Saigon's Underground Transit: How Metro Line 1 Connects the City</w:t>
       </w:r>
       <w:r>
         <w:rPr>
@@ -6408,7 +6375,7 @@
           <w:color w:val="1B365D"/>
           <w:sz w:val="32"/>
         </w:rPr>
-        <w:t>Subterranean Renaissance: Reimagining the Urban Landscape</w:t>
+        <w:t>Saigon's Underground Transit: How Metro Line 1 Connects the City</w:t>
       </w:r>
     </w:p>
     <w:p>
@@ -6463,7 +6430,7 @@
         <w:spacing w:before="320" w:after="120" w:line="276" w:lineRule="auto"/>
       </w:pPr>
       <w:r>
-        <w:t>Navigating the Four-Tier Subterranean Labyrinth</w:t>
+        <w:t>Navigating the 4 Underground Levels: Entrances, Ticketing &amp; Platforms</w:t>
       </w:r>
       <w:r>
         <w:rPr>
@@ -6472,7 +6439,7 @@
           <w:color w:val="1B365D"/>
           <w:sz w:val="32"/>
         </w:rPr>
-        <w:t>Navigating the Four-Tier Subterranean Labyrinth</w:t>
+        <w:t>Navigating the 4 Underground Levels: Entrances, Ticketing &amp; Platforms</w:t>
       </w:r>
     </w:p>
     <w:p>
@@ -6631,7 +6598,7 @@
         <w:spacing w:before="320" w:after="120" w:line="276" w:lineRule="auto"/>
       </w:pPr>
       <w:r>
-        <w:t>Curated Transit Insights for Conscious Travelers (2026)</w:t>
+        <w:t>Practical Transit Tips &amp; Passenger Guidelines (2026)</w:t>
       </w:r>
       <w:r>
         <w:rPr>
@@ -6640,7 +6607,7 @@
           <w:color w:val="1B365D"/>
           <w:sz w:val="32"/>
         </w:rPr>
-        <w:t>Curated Transit Insights for Conscious Travelers (2026)</w:t>
+        <w:t>Practical Transit Tips &amp; Passenger Guidelines (2026)</w:t>
       </w:r>
     </w:p>
     <w:p>
@@ -7225,7 +7192,7 @@
         <w:spacing w:before="320" w:after="120" w:line="276" w:lineRule="auto"/>
       </w:pPr>
       <w:r>
-        <w:t>Deciphering South Indian Dravidian Temple Art</w:t>
+        <w:t>Dravidian Temple Architecture: Carved Gopuram Towers &amp; Sacred Shrines</w:t>
       </w:r>
       <w:r>
         <w:rPr>
@@ -7234,7 +7201,7 @@
           <w:color w:val="1B365D"/>
           <w:sz w:val="32"/>
         </w:rPr>
-        <w:t>Deciphering South Indian Dravidian Temple Art</w:t>
+        <w:t>Dravidian Temple Architecture: Carved Gopuram Towers &amp; Sacred Shrines</w:t>
       </w:r>
     </w:p>
     <w:p>
@@ -7811,7 +7778,7 @@
         <w:spacing w:before="40" w:after="120" w:line="276" w:lineRule="auto"/>
       </w:pPr>
       <w:r>
-        <w:t>Highlighted in our comprehensive field guide to things to do near Ben Thanh Market, stepping into the historic market places you at the center of an intoxicating labyrinth of over 1,400 vibrant retail stalls. For conscious voyagers, shopping here is an opportunity to acquire authentic handmade heirlooms and connect directly with the multi-generational trade guilds of the Southern Delta.</w:t>
+        <w:t>Highlighted in our comprehensive field guide to things to do near Ben Thanh Market, stepping into the historic market places you at the center of an intoxicating labyrinth of over 1,400 vibrant retail stalls. For travelers, shopping here is an opportunity to acquire authentic handmade heirlooms and connect directly with the multi-generational trade guilds of the Southern Delta.</w:t>
       </w:r>
       <w:r>
         <w:rPr>
@@ -7835,7 +7802,7 @@
           <w:color w:val="1E293B"/>
           <w:sz w:val="21"/>
         </w:rPr>
-        <w:t>, stepping into the historic market places you at the center of an intoxicating labyrinth of over 1,400 vibrant retail stalls. For conscious voyagers, shopping here is an opportunity to acquire authentic handmade heirlooms and connect directly with the multi-generational trade guilds of the Southern Delta.</w:t>
+        <w:t>, stepping into the historic market places you at the center of an intoxicating labyrinth of over 1,400 vibrant retail stalls. For travelers, shopping here is an opportunity to acquire authentic handmade heirlooms and connect directly with the multi-generational trade guilds of the Southern Delta.</w:t>
       </w:r>
     </w:p>
     <w:p>
@@ -7971,24 +7938,24 @@
         <w:spacing w:before="20" w:after="40" w:line="276" w:lineRule="auto"/>
       </w:pPr>
       <w:r>
-        <w:t>100% Cashless Operations: Every vendor terminal is equipped with tap-to-pay technology and dual-currency digital receipts.</w:t>
-      </w:r>
-      <w:r>
-        <w:rPr>
-          <w:rFonts w:ascii="Calibri" w:hAnsi="Calibri"/>
-          <w:b/>
-          <w:color w:val="1E293B"/>
-          <w:sz w:val="20"/>
-        </w:rPr>
-        <w:t>100% Cashless Operations:</w:t>
-      </w:r>
-      <w:r>
-        <w:rPr>
-          <w:rFonts w:ascii="Calibri" w:hAnsi="Calibri"/>
-          <w:color w:val="1E293B"/>
-          <w:sz w:val="20"/>
-        </w:rPr>
-        <w:t xml:space="preserve"> Every vendor terminal is equipped with tap-to-pay technology and dual-currency digital receipts.</w:t>
+        <w:t>VietQR &amp; Cashless Readiness: While nearly all vendors support digital VietQR payments for domestic accounts, international travelers should still keep modest cash (200,000 – 500,000 VND) on hand for small food stalls and fresh fruit purchases.</w:t>
+      </w:r>
+      <w:r>
+        <w:rPr>
+          <w:rFonts w:ascii="Calibri" w:hAnsi="Calibri"/>
+          <w:b/>
+          <w:color w:val="1E293B"/>
+          <w:sz w:val="20"/>
+        </w:rPr>
+        <w:t>VietQR &amp; Cashless Readiness:</w:t>
+      </w:r>
+      <w:r>
+        <w:rPr>
+          <w:rFonts w:ascii="Calibri" w:hAnsi="Calibri"/>
+          <w:color w:val="1E293B"/>
+          <w:sz w:val="20"/>
+        </w:rPr>
+        <w:t xml:space="preserve"> While nearly all vendors support digital VietQR payments for domestic accounts, international travelers should still keep modest cash (200,000 – 500,000 VND) on hand for small food stalls and fresh fruit purchases.</w:t>
       </w:r>
     </w:p>
     <w:p>
@@ -8192,7 +8159,7 @@
         <w:spacing w:before="320" w:after="120" w:line="276" w:lineRule="auto"/>
       </w:pPr>
       <w:r>
-        <w:t>Bargaining with Grace: Cultural Guidelines</w:t>
+        <w:t>Bargaining with a Smile: Practical Etiquette &amp; Tips</w:t>
       </w:r>
       <w:r>
         <w:rPr>
@@ -8201,7 +8168,7 @@
           <w:color w:val="1B365D"/>
           <w:sz w:val="32"/>
         </w:rPr>
-        <w:t>Bargaining with Grace: Cultural Guidelines</w:t>
+        <w:t>Bargaining with a Smile: Practical Etiquette &amp; Tips</w:t>
       </w:r>
     </w:p>
     <w:p>
@@ -8660,7 +8627,7 @@
         <w:spacing w:before="320" w:after="120" w:line="276" w:lineRule="auto"/>
       </w:pPr>
       <w:r>
-        <w:t>Introduction: Saigon Unveiled from an Open Deck</w:t>
+        <w:t>Saigon Unveiled from an Open Deck</w:t>
       </w:r>
       <w:r>
         <w:rPr>
@@ -8669,7 +8636,7 @@
           <w:color w:val="1B365D"/>
           <w:sz w:val="32"/>
         </w:rPr>
-        <w:t>Introduction: Saigon Unveiled from an Open Deck</w:t>
+        <w:t>Saigon Unveiled from an Open Deck</w:t>
       </w:r>
     </w:p>
     <w:p>
@@ -9639,7 +9606,7 @@
         <w:spacing w:before="320" w:after="120" w:line="276" w:lineRule="auto"/>
       </w:pPr>
       <w:r>
-        <w:t>Curated Field Notes for the Discerning Traveler</w:t>
+        <w:t>Curated Field Notes for the Traveler</w:t>
       </w:r>
       <w:r>
         <w:rPr>
@@ -9648,7 +9615,7 @@
           <w:color w:val="1B365D"/>
           <w:sz w:val="32"/>
         </w:rPr>
-        <w:t>Curated Field Notes for the Discerning Traveler</w:t>
+        <w:t>Curated Field Notes for the Traveler</w:t>
       </w:r>
     </w:p>
     <w:p>
@@ -9811,7 +9778,7 @@
         <w:spacing w:before="20" w:after="40" w:line="276" w:lineRule="auto"/>
       </w:pPr>
       <w:r>
-        <w:t>19:30 – 20:30 (The Dazzling Night Cruise): Captures the illuminated kinetic energy of Nguyen Hue Boulevard, illuminated colonial municipal halls, and riverside skyscrapers.</w:t>
+        <w:t>19:30 – 20:30 (The Dazzling Night Cruise): Captures the illuminated lively energy of Nguyen Hue Boulevard, illuminated colonial municipal halls, and riverside skyscrapers.</w:t>
       </w:r>
       <w:r>
         <w:rPr>
@@ -9828,7 +9795,7 @@
           <w:color w:val="1E293B"/>
           <w:sz w:val="20"/>
         </w:rPr>
-        <w:t xml:space="preserve"> Captures the illuminated kinetic energy of Nguyen Hue Boulevard, illuminated colonial municipal halls, and riverside skyscrapers.</w:t>
+        <w:t xml:space="preserve"> Captures the illuminated lively energy of Nguyen Hue Boulevard, illuminated colonial municipal halls, and riverside skyscrapers.</w:t>
       </w:r>
     </w:p>
     <w:p>
@@ -10136,7 +10103,7 @@
         <w:spacing w:before="320" w:after="120" w:line="276" w:lineRule="auto"/>
       </w:pPr>
       <w:r>
-        <w:t>Introduction: The Allure of Saigon’s Hidden Perches</w:t>
+        <w:t>The Allure of Saigon’s Hidden Perches</w:t>
       </w:r>
       <w:r>
         <w:rPr>
@@ -10145,7 +10112,7 @@
           <w:color w:val="1B365D"/>
           <w:sz w:val="32"/>
         </w:rPr>
-        <w:t>Introduction: The Allure of Saigon’s Hidden Perches</w:t>
+        <w:t>The Allure of Saigon’s Hidden Perches</w:t>
       </w:r>
     </w:p>
     <w:p>
@@ -10186,7 +10153,7 @@
         <w:spacing w:before="40" w:after="120" w:line="276" w:lineRule="auto"/>
       </w:pPr>
       <w:r>
-        <w:t>Stepping through a modest ground-floor motor scooter garage and leaving the bustling din of Le Loi Boulevard behind, one climbs worn granito stairs whose edges have been softened by decades of footfalls. Above, heavy wooden louvered doors open to reveal serene spaces where the aroma of freshly roasted highland Arabica and sweet condensed milk mingles with vinyl jazz records, hand-turned pottery, and emerald foliage framing iron French balconies. For the intentional traveler, these vertical villages offer an intimate, poetic glimpse into the living heart of southern urban culture.</w:t>
+        <w:t>Stepping through a modest ground-floor motor scooter garage and leaving the bustling din of Le Loi Boulevard behind, one climbs worn granito stairs whose edges have been softened by decades of footfalls. Above, heavy wooden louvered doors open to reveal serene spaces where the aroma of freshly roasted highland Arabica and sweet condensed milk mingles with vinyl jazz records, hand-turned pottery, and emerald foliage framing iron French balconies. For the traveler, these vertical villages offer an intimate, poetic glimpse into the living heart of southern urban culture.</w:t>
       </w:r>
       <w:r>
         <w:rPr>
@@ -10194,7 +10161,7 @@
           <w:color w:val="1E293B"/>
           <w:sz w:val="21"/>
         </w:rPr>
-        <w:t>Stepping through a modest ground-floor motor scooter garage and leaving the bustling din of Le Loi Boulevard behind, one climbs worn granito stairs whose edges have been softened by decades of footfalls. Above, heavy wooden louvered doors open to reveal serene spaces where the aroma of freshly roasted highland Arabica and sweet condensed milk mingles with vinyl jazz records, hand-turned pottery, and emerald foliage framing iron French balconies. For the intentional traveler, these vertical villages offer an intimate, poetic glimpse into the living heart of southern urban culture.</w:t>
+        <w:t>Stepping through a modest ground-floor motor scooter garage and leaving the bustling din of Le Loi Boulevard behind, one climbs worn granito stairs whose edges have been softened by decades of footfalls. Above, heavy wooden louvered doors open to reveal serene spaces where the aroma of freshly roasted highland Arabica and sweet condensed milk mingles with vinyl jazz records, hand-turned pottery, and emerald foliage framing iron French balconies. For the traveler, these vertical villages offer an intimate, poetic glimpse into the living heart of southern urban culture.</w:t>
       </w:r>
     </w:p>
     <w:p>
@@ -10217,7 +10184,7 @@
         <w:spacing w:before="320" w:after="120" w:line="276" w:lineRule="auto"/>
       </w:pPr>
       <w:r>
-        <w:t>Adaptive Heritage: The Renaissance of Residential Blocks</w:t>
+        <w:t>How Old Residential Buildings Became Creative Spaces</w:t>
       </w:r>
       <w:r>
         <w:rPr>
@@ -10226,7 +10193,7 @@
           <w:color w:val="1B365D"/>
           <w:sz w:val="32"/>
         </w:rPr>
-        <w:t>Adaptive Heritage: The Renaissance of Residential Blocks</w:t>
+        <w:t>How Old Residential Buildings Became Creative Spaces</w:t>
       </w:r>
     </w:p>
     <w:p>
@@ -10812,7 +10779,7 @@
         <w:spacing w:before="40" w:after="120" w:line="276" w:lineRule="auto"/>
       </w:pPr>
       <w:r>
-        <w:t>Flanking the grand boulevard that approaches Ben Thanh Market's South Clock Tower, these elevated mezzanine flats feature verdant wrought-iron balconies that hover just above street level.</w:t>
+        <w:t>Flanking the grand boulevard that approaches Ben Thanh Market's South Clock Tower, these elevated mezzanine flats feature shaded wrought-iron balconies that hover just above street level.</w:t>
       </w:r>
       <w:r>
         <w:rPr>
@@ -10820,7 +10787,7 @@
           <w:color w:val="1E293B"/>
           <w:sz w:val="21"/>
         </w:rPr>
-        <w:t>Flanking the grand boulevard that approaches Ben Thanh Market's South Clock Tower, these elevated mezzanine flats feature verdant wrought-iron balconies that hover just above street level.</w:t>
+        <w:t>Flanking the grand boulevard that approaches Ben Thanh Market's South Clock Tower, these elevated mezzanine flats feature shaded wrought-iron balconies that hover just above street level.</w:t>
       </w:r>
     </w:p>
     <w:p>
@@ -10974,7 +10941,7 @@
         <w:spacing w:before="320" w:after="120" w:line="276" w:lineRule="auto"/>
       </w:pPr>
       <w:r>
-        <w:t>Conscious Voyager Etiquette for Residential Walk-Ups</w:t>
+        <w:t>Traveler Etiquette for Residential Walk-Ups</w:t>
       </w:r>
       <w:r>
         <w:rPr>
@@ -10983,7 +10950,7 @@
           <w:color w:val="1B365D"/>
           <w:sz w:val="32"/>
         </w:rPr>
-        <w:t>Conscious Voyager Etiquette for Residential Walk-Ups</w:t>
+        <w:t>Traveler Etiquette for Residential Walk-Ups</w:t>
       </w:r>
     </w:p>
     <w:p>
@@ -11206,7 +11173,7 @@
         <w:spacing w:before="320" w:after="120" w:line="276" w:lineRule="auto"/>
       </w:pPr>
       <w:r>
-        <w:t>Introduction: When Saigon Kindles Her Constellations</w:t>
+        <w:t>When Saigon Kindles Her Constellations</w:t>
       </w:r>
       <w:r>
         <w:rPr>
@@ -11215,7 +11182,7 @@
           <w:color w:val="1B365D"/>
           <w:sz w:val="32"/>
         </w:rPr>
-        <w:t>Introduction: When Saigon Kindles Her Constellations</w:t>
+        <w:t>When Saigon Kindles Her Constellations</w:t>
       </w:r>
     </w:p>
     <w:p>
@@ -11270,7 +11237,7 @@
         <w:spacing w:before="320" w:after="120" w:line="276" w:lineRule="auto"/>
       </w:pPr>
       <w:r>
-        <w:t>Terroir Mixology: The Rise of Vietnamese Craft Cocktails</w:t>
+        <w:t>Craft Cocktails with Local Flavors: Kumquat, Betel Leaf &amp; Lotus Seeds</w:t>
       </w:r>
       <w:r>
         <w:rPr>
@@ -11279,7 +11246,7 @@
           <w:color w:val="1B365D"/>
           <w:sz w:val="32"/>
         </w:rPr>
-        <w:t>Terroir Mixology: The Rise of Vietnamese Craft Cocktails</w:t>
+        <w:t>Craft Cocktails with Local Flavors: Kumquat, Betel Leaf &amp; Lotus Seeds</w:t>
       </w:r>
     </w:p>
     <w:p>
@@ -11923,7 +11890,7 @@
         <w:spacing w:before="320" w:after="120" w:line="276" w:lineRule="auto"/>
       </w:pPr>
       <w:r>
-        <w:t>The Subterranean Realm: Hidden Alleyway Speakeasies</w:t>
+        <w:t>Hidden Speakeasies: Tucked-Away Bars in District 1 Alleys</w:t>
       </w:r>
       <w:r>
         <w:rPr>
@@ -11932,7 +11899,7 @@
           <w:color w:val="1B365D"/>
           <w:sz w:val="32"/>
         </w:rPr>
-        <w:t>The Subterranean Realm: Hidden Alleyway Speakeasies</w:t>
+        <w:t>Hidden Speakeasies: Tucked-Away Bars in District 1 Alleys</w:t>
       </w:r>
     </w:p>
     <w:p>
@@ -12343,7 +12310,7 @@
         <w:spacing w:before="320" w:after="120" w:line="276" w:lineRule="auto"/>
       </w:pPr>
       <w:r>
-        <w:t>Introduction: Hospitality Imbued with Heritage</w:t>
+        <w:t>Hospitality Imbued with Heritage</w:t>
       </w:r>
       <w:r>
         <w:rPr>
@@ -12352,7 +12319,7 @@
           <w:color w:val="1B365D"/>
           <w:sz w:val="32"/>
         </w:rPr>
-        <w:t>Introduction: Hospitality Imbued with Heritage</w:t>
+        <w:t>Hospitality Imbued with Heritage</w:t>
       </w:r>
     </w:p>
     <w:p>
@@ -12407,7 +12374,7 @@
         <w:spacing w:before="320" w:after="120" w:line="276" w:lineRule="auto"/>
       </w:pPr>
       <w:r>
-        <w:t>Core Hallmarks of a Bespoke Saigon Boutique Hotel</w:t>
+        <w:t>What Makes a Great Boutique Hotel in Central Saigon</w:t>
       </w:r>
       <w:r>
         <w:rPr>
@@ -12416,7 +12383,7 @@
           <w:color w:val="1B365D"/>
           <w:sz w:val="32"/>
         </w:rPr>
-        <w:t>Core Hallmarks of a Bespoke Saigon Boutique Hotel</w:t>
+        <w:t>What Makes a Great Boutique Hotel in Central Saigon</w:t>
       </w:r>
     </w:p>
     <w:p>
@@ -13363,7 +13330,7 @@
         <w:spacing w:before="320" w:after="120" w:line="276" w:lineRule="auto"/>
       </w:pPr>
       <w:r>
-        <w:t>Strategic Reservation Guidance for the Discerning Guest</w:t>
+        <w:t>Strategic Reservation Guidance for the Guest</w:t>
       </w:r>
       <w:r>
         <w:rPr>
@@ -13372,7 +13339,7 @@
           <w:color w:val="1B365D"/>
           <w:sz w:val="32"/>
         </w:rPr>
-        <w:t>Strategic Reservation Guidance for the Discerning Guest</w:t>
+        <w:t>Strategic Reservation Guidance for the Guest</w:t>
       </w:r>
     </w:p>
     <w:p>
@@ -13553,7 +13520,7 @@
         <w:spacing w:before="320" w:after="120" w:line="276" w:lineRule="auto"/>
       </w:pPr>
       <w:r>
-        <w:t>Introduction: Far More Than a Commodity Bazaar</w:t>
+        <w:t>Far More Than a Commodity Bazaar</w:t>
       </w:r>
       <w:r>
         <w:rPr>
@@ -13562,7 +13529,7 @@
           <w:color w:val="1B365D"/>
           <w:sz w:val="32"/>
         </w:rPr>
-        <w:t>Introduction: Far More Than a Commodity Bazaar</w:t>
+        <w:t>Far More Than a Commodity Bazaar</w:t>
       </w:r>
     </w:p>
     <w:p>
@@ -13802,7 +13769,7 @@
         <w:spacing w:before="40" w:after="120" w:line="276" w:lineRule="auto"/>
       </w:pPr>
       <w:r>
-        <w:t>Following breakfast, stroll across Le Lai Street into the verdant canopy of September 23rd Park (Cong vien 23/9). Order a robust iced condensed milk coffee (ca phe sua da) brewed using traditional cloth-strainer (ca phe vot) techniques from a mobile cart. Rest on the lawn while observing elderly locals practicing Tai Chi and pigeons pecking for crumbs under the morning shade.</w:t>
+        <w:t>Following breakfast, stroll across Le Lai Street into the leafy shade of September 23rd Park (Cong vien 23/9). Order a robust iced condensed milk coffee (ca phe sua da) brewed using traditional cloth-strainer (ca phe vot) techniques from a mobile cart. Rest on the lawn while observing elderly locals practicing Tai Chi and pigeons pecking for crumbs under the morning shade.</w:t>
       </w:r>
       <w:r>
         <w:rPr>
@@ -13810,7 +13777,7 @@
           <w:color w:val="1E293B"/>
           <w:sz w:val="21"/>
         </w:rPr>
-        <w:t>Following breakfast, stroll across Le Lai Street into the verdant canopy of September 23rd Park (</w:t>
+        <w:t>Following breakfast, stroll across Le Lai Street into the leafy shade of September 23rd Park (</w:t>
       </w:r>
       <w:r>
         <w:rPr>
@@ -13934,7 +13901,7 @@
         <w:spacing w:before="160" w:after="60" w:line="276" w:lineRule="auto"/>
       </w:pPr>
       <w:r>
-        <w:t>5. Cooling Down with a Legendary 1968 Shaved Ice Sweet Soup (Che Ba Muoi)</w:t>
+        <w:t>5. Cooling Down with a Legendary 1968 Shaved Ice Sweet Soup (Che Be)</w:t>
       </w:r>
       <w:r>
         <w:rPr>
@@ -13943,7 +13910,7 @@
           <w:color w:val="1B365D"/>
           <w:sz w:val="23"/>
         </w:rPr>
-        <w:t>5. Cooling Down with a Legendary 1968 Shaved Ice Sweet Soup (Che Ba Muoi)</w:t>
+        <w:t>5. Cooling Down with a Legendary 1968 Shaved Ice Sweet Soup (Che Be)</w:t>
       </w:r>
     </w:p>
     <w:p>
@@ -13951,7 +13918,7 @@
         <w:spacing w:before="40" w:after="120" w:line="276" w:lineRule="auto"/>
       </w:pPr>
       <w:r>
-        <w:t>Nestled in the central culinary aisle, Che Ba Muoi is a culinary institution spanning three generations. A tall glass of mixed sweet soup (che thap cam) laden with soft red beans, chewy pomegranate rubies, pandan jelly droplets (banh lot), and rich coconut cream smothered in finely shaved ice offers instant respite from the tropical humidity.</w:t>
+        <w:t>Nestled in the central culinary aisle, Che Be is a culinary institution spanning three generations. A tall glass of mixed sweet soup (che thap cam) laden with soft red beans, chewy pomegranate rubies, pandan jelly droplets (banh lot), and rich coconut cream smothered in finely shaved ice offers instant respite from the tropical humidity.</w:t>
       </w:r>
       <w:r>
         <w:rPr>
@@ -13959,7 +13926,7 @@
           <w:color w:val="1E293B"/>
           <w:sz w:val="21"/>
         </w:rPr>
-        <w:t>Nestled in the central culinary aisle, Che Ba Muoi is a culinary institution spanning three generations. A tall glass of mixed sweet soup (</w:t>
+        <w:t>Nestled in the central culinary aisle, Che Be is a culinary institution spanning three generations. A tall glass of mixed sweet soup (</w:t>
       </w:r>
       <w:r>
         <w:rPr>
@@ -14247,7 +14214,7 @@
         <w:spacing w:before="240" w:after="80" w:line="276" w:lineRule="auto"/>
       </w:pPr>
       <w:r>
-        <w:t>🌙 TIME WINDOW 4: Vibrant Nightfall &amp; Gastronomic Revelry (19:00 – Late)</w:t>
+        <w:t>🌙 TIME WINDOW 4: Vibrant Nightfall &amp; Night Street Food (19:00 – Late)</w:t>
       </w:r>
       <w:r>
         <w:rPr>
@@ -14256,7 +14223,7 @@
           <w:color w:val="D97706"/>
           <w:sz w:val="26"/>
         </w:rPr>
-        <w:t>🌙 TIME WINDOW 4: Vibrant Nightfall &amp; Gastronomic Revelry (19:00 – Late)</w:t>
+        <w:t>🌙 TIME WINDOW 4: Vibrant Nightfall &amp; Night Street Food (19:00 – Late)</w:t>
       </w:r>
     </w:p>
     <w:p>
@@ -14583,7 +14550,7 @@
         <w:spacing w:before="280" w:after="120"/>
       </w:pPr>
       <w:r>
-        <w:t>Ben Thanh Market Ultimate Travel Guide 2026: The Complete A-Z Survival Handbook</w:t>
+        <w:t>Ben Thanh Market Ultimate Travel Guide 2026: The Complete Insider Field Handbook</w:t>
       </w:r>
       <w:r>
         <w:rPr>
@@ -14592,7 +14559,7 @@
           <w:color w:val="1B365D"/>
           <w:sz w:val="42"/>
         </w:rPr>
-        <w:t>Ben Thanh Market Ultimate Travel Guide 2026: The Complete A-Z Survival Handbook</w:t>
+        <w:t>Ben Thanh Market Ultimate Travel Guide 2026: The Complete Insider Field Handbook</w:t>
       </w:r>
     </w:p>
     <w:p>
@@ -14625,7 +14592,7 @@
         <w:spacing w:before="320" w:after="120" w:line="276" w:lineRule="auto"/>
       </w:pPr>
       <w:r>
-        <w:t>Introduction: Stepping into Saigon's Beating Heart Like an Insider</w:t>
+        <w:t>Stepping into Saigon's Beating Heart Like an Insider</w:t>
       </w:r>
       <w:r>
         <w:rPr>
@@ -14634,7 +14601,7 @@
           <w:color w:val="1B365D"/>
           <w:sz w:val="32"/>
         </w:rPr>
-        <w:t>Introduction: Stepping into Saigon's Beating Heart Like an Insider</w:t>
+        <w:t>Stepping into Saigon's Beating Heart Like an Insider</w:t>
       </w:r>
     </w:p>
     <w:p>
@@ -14658,7 +14625,7 @@
         <w:spacing w:before="40" w:after="120" w:line="276" w:lineRule="auto"/>
       </w:pPr>
       <w:r>
-        <w:t>In truth, Ben Thanh Market is only intimidating when entered unprepared. Armed with insider knowledge, local behavioral codes, and ground-tested field wisdom, your journey through this historic bazaar becomes effortless, highly rewarding, and culturally rich. Here is the definitive A-Z survival handbook compiled by The Rice Tour, updated with the latest 2026 infrastructure transformations.</w:t>
+        <w:t>In truth, Ben Thanh Market is only intimidating when entered unprepared. Armed with insider knowledge, local behavioral codes, and ground-tested field wisdom, your journey through this historic bazaar becomes effortless, highly rewarding, and culturally rich. Here is the definitive insider field handbook compiled by The Rice Tour, updated with the latest 2026 infrastructure transformations.</w:t>
       </w:r>
       <w:r>
         <w:rPr>
@@ -14675,7 +14642,7 @@
           <w:color w:val="1E293B"/>
           <w:sz w:val="21"/>
         </w:rPr>
-        <w:t>definitive A-Z survival handbook</w:t>
+        <w:t>definitive insider field handbook</w:t>
       </w:r>
       <w:r>
         <w:rPr>
@@ -15139,7 +15106,7 @@
         <w:spacing w:before="320" w:after="120" w:line="276" w:lineRule="auto"/>
       </w:pPr>
       <w:r>
-        <w:t>Master Bargaining Rules: The "Smiling Negotiation" Code</w:t>
+        <w:t>Bargaining with a Smile: Practical Tips for Respectful Negotiation</w:t>
       </w:r>
       <w:r>
         <w:rPr>
@@ -15148,7 +15115,7 @@
           <w:color w:val="1B365D"/>
           <w:sz w:val="32"/>
         </w:rPr>
-        <w:t>Master Bargaining Rules: The "Smiling Negotiation" Code</w:t>
+        <w:t>Bargaining with a Smile: Practical Tips for Respectful Negotiation</w:t>
       </w:r>
     </w:p>
     <w:p>
@@ -15428,7 +15395,7 @@
         <w:spacing w:before="20" w:after="40" w:line="276" w:lineRule="auto"/>
       </w:pPr>
       <w:r>
-        <w:t>Must-Try Specialties: Do not miss Bun Rieu Cua Dong (East Gate aisle), Banh Beo Hue with crispy pork crackling, and legendary iced sweet soups (Che Ba Muoi).</w:t>
+        <w:t>Must-Try Specialties: Do not miss Bun Rieu Cua Dong (East Gate aisle), Banh Beo Hue with crispy pork crackling, and legendary iced sweet soups (Che Be).</w:t>
       </w:r>
       <w:r>
         <w:rPr>
@@ -15488,7 +15455,7 @@
           <w:color w:val="1E293B"/>
           <w:sz w:val="20"/>
         </w:rPr>
-        <w:t>Che Ba Muoi</w:t>
+        <w:t>Che Be</w:t>
       </w:r>
       <w:r>
         <w:rPr>
@@ -15753,7 +15720,7 @@
         <w:spacing w:before="320" w:after="120" w:line="276" w:lineRule="auto"/>
       </w:pPr>
       <w:r>
-        <w:t>Introduction: The Shadows Behind the Splendor of a Century-Old Bazaar</w:t>
+        <w:t>The Shadows Behind the Splendor of a Century-Old Bazaar</w:t>
       </w:r>
       <w:r>
         <w:rPr>
@@ -15762,7 +15729,7 @@
           <w:color w:val="1B365D"/>
           <w:sz w:val="32"/>
         </w:rPr>
-        <w:t>Introduction: The Shadows Behind the Splendor of a Century-Old Bazaar</w:t>
+        <w:t>The Shadows Behind the Splendor of a Century-Old Bazaar</w:t>
       </w:r>
     </w:p>
     <w:p>
@@ -17048,7 +17015,7 @@
         <w:spacing w:before="320" w:after="120" w:line="276" w:lineRule="auto"/>
       </w:pPr>
       <w:r>
-        <w:t>Introduction: Saigon's Miniature Financial Street</w:t>
+        <w:t>Saigon's Miniature Financial Street</w:t>
       </w:r>
       <w:r>
         <w:rPr>
@@ -17057,7 +17024,7 @@
           <w:color w:val="1B365D"/>
           <w:sz w:val="32"/>
         </w:rPr>
-        <w:t>Introduction: Saigon's Miniature Financial Street</w:t>
+        <w:t>Saigon's Miniature Financial Street</w:t>
       </w:r>
     </w:p>
     <w:p>
@@ -17839,7 +17806,7 @@
         <w:spacing w:before="320" w:after="120" w:line="276" w:lineRule="auto"/>
       </w:pPr>
       <w:r>
-        <w:t>Introduction: The Battle for Parking in Saigon’s Heritage Heart</w:t>
+        <w:t>The Battle for Parking in Saigon’s Heritage Heart</w:t>
       </w:r>
       <w:r>
         <w:rPr>
@@ -17848,7 +17815,7 @@
           <w:color w:val="1B365D"/>
           <w:sz w:val="32"/>
         </w:rPr>
-        <w:t>Introduction: The Battle for Parking in Saigon’s Heritage Heart</w:t>
+        <w:t>The Battle for Parking in Saigon’s Heritage Heart</w:t>
       </w:r>
     </w:p>
     <w:p>
@@ -18525,7 +18492,7 @@
         <w:spacing w:before="320" w:after="120" w:line="276" w:lineRule="auto"/>
       </w:pPr>
       <w:r>
-        <w:t>Introduction: Your Gateway Ride into Saigon’s Vibrant Heart</w:t>
+        <w:t>Your Gateway Ride into Saigon’s Vibrant Heart</w:t>
       </w:r>
       <w:r>
         <w:rPr>
@@ -18534,7 +18501,7 @@
           <w:color w:val="1B365D"/>
           <w:sz w:val="32"/>
         </w:rPr>
-        <w:t>Introduction: Your Gateway Ride into Saigon’s Vibrant Heart</w:t>
+        <w:t>Your Gateway Ride into Saigon’s Vibrant Heart</w:t>
       </w:r>
     </w:p>
     <w:p>

</xml_diff>

<commit_message>
feat(seo): implement semantic internal linking across all 18 Ben Thanh guides without duplicates or fake urls
</commit_message>
<xml_diff>
--- a/content-pipeline/06-word-documents/000_FULL_COLLECTION_18_ARTICLES_BEN_THANH_EN.docx
+++ b/content-pipeline/06-word-documents/000_FULL_COLLECTION_18_ARTICLES_BEN_THANH_EN.docx
@@ -216,7 +216,23 @@
           <w:color w:val="1E293B"/>
           <w:sz w:val="20"/>
         </w:rPr>
-        <w:t xml:space="preserve"> The legendary architectural trademark of the Hui Bon Hoa mansion (now the HCMC Museum of Fine Arts), situated a mere 350-meter stroll from the market.</w:t>
+        <w:t xml:space="preserve"> The legendary architectural trademark of the Hui Bon Hoa mansion (now the </w:t>
+      </w:r>
+      <w:r>
+        <w:rPr>
+          <w:rFonts w:ascii="Calibri" w:hAnsi="Calibri"/>
+          <w:color w:val="D97706"/>
+          <w:sz w:val="20"/>
+        </w:rPr>
+        <w:t>HCMC Museum of Fine Arts</w:t>
+      </w:r>
+      <w:r>
+        <w:rPr>
+          <w:rFonts w:ascii="Calibri" w:hAnsi="Calibri"/>
+          <w:color w:val="1E293B"/>
+          <w:sz w:val="20"/>
+        </w:rPr>
+        <w:t>), situated a mere 350-meter stroll from the market.</w:t>
       </w:r>
     </w:p>
     <w:p>
@@ -242,7 +258,23 @@
           <w:color w:val="1E293B"/>
           <w:sz w:val="20"/>
         </w:rPr>
-        <w:t xml:space="preserve"> Enjoying spiritual reflection at the century-old Mariamman Hindu Temple or marveling at the lotus-shaped underground skylight of the new metro station costs nothing.</w:t>
+        <w:t xml:space="preserve"> Enjoying spiritual reflection at the century-old </w:t>
+      </w:r>
+      <w:r>
+        <w:rPr>
+          <w:rFonts w:ascii="Calibri" w:hAnsi="Calibri"/>
+          <w:color w:val="D97706"/>
+          <w:sz w:val="20"/>
+        </w:rPr>
+        <w:t>Mariamman Hindu Temple</w:t>
+      </w:r>
+      <w:r>
+        <w:rPr>
+          <w:rFonts w:ascii="Calibri" w:hAnsi="Calibri"/>
+          <w:color w:val="1E293B"/>
+          <w:sz w:val="20"/>
+        </w:rPr>
+        <w:t xml:space="preserve"> or marveling at the lotus-shaped underground skylight of the new metro station costs nothing.</w:t>
       </w:r>
     </w:p>
     <w:p>
@@ -2014,10 +2046,25 @@
     </w:p>
     <w:p>
       <w:pPr>
+        <w:spacing w:before="120" w:after="120"/>
+        <w:jc w:val="center"/>
+      </w:pPr>
+      <w:r>
+        <w:t>―――――――――――――――――――――――――――――――――――――――――――――</w:t>
+      </w:r>
+      <w:r>
+        <w:rPr>
+          <w:color w:val="CBD5E1"/>
+        </w:rPr>
+        <w:t>―――――――――――――――――――――――――――――――――――――――――――――</w:t>
+      </w:r>
+    </w:p>
+    <w:p>
+      <w:pPr>
         <w:spacing w:before="320" w:after="120" w:line="276" w:lineRule="auto"/>
       </w:pPr>
       <w:r>
-        <w:t>Closing Thoughts: Walking Saigon with Open Eyes</w:t>
+        <w:t>🗺️ Curated Cluster Connections</w:t>
       </w:r>
       <w:r>
         <w:rPr>
@@ -2026,6 +2073,141 @@
           <w:color w:val="1B365D"/>
           <w:sz w:val="32"/>
         </w:rPr>
+        <w:t>🗺️ Curated Cluster Connections</w:t>
+      </w:r>
+    </w:p>
+    <w:p>
+      <w:pPr>
+        <w:spacing w:before="40" w:after="120" w:line="276" w:lineRule="auto"/>
+      </w:pPr>
+      <w:r>
+        <w:t>To help you navigate District 1 with ease, explore our companion heritage guides:</w:t>
+        <w:br/>
+        <w:t>- Ben Thanh Market Food Guide: savoring traditional flavors with our Ben Thanh Market food guide.</w:t>
+        <w:br/>
+        <w:t>- One-Day Ben Thanh Walking Tour: following our turn-by-turn one-day Ben Thanh walking tour.</w:t>
+      </w:r>
+      <w:r>
+        <w:rPr>
+          <w:rFonts w:ascii="Calibri" w:hAnsi="Calibri"/>
+          <w:color w:val="1E293B"/>
+          <w:sz w:val="21"/>
+        </w:rPr>
+        <w:t>To help you navigate District 1 with ease, explore our companion heritage guides:</w:t>
+      </w:r>
+      <w:r>
+        <w:rPr>
+          <w:rFonts w:ascii="Calibri" w:hAnsi="Calibri"/>
+          <w:color w:val="1E293B"/>
+          <w:sz w:val="21"/>
+        </w:rPr>
+      </w:r>
+      <w:r>
+        <w:rPr>
+          <w:rFonts w:ascii="Calibri" w:hAnsi="Calibri"/>
+          <w:color w:val="1E293B"/>
+          <w:sz w:val="21"/>
+        </w:rPr>
+        <w:br/>
+        <w:t xml:space="preserve">- </w:t>
+      </w:r>
+      <w:r>
+        <w:rPr>
+          <w:rFonts w:ascii="Calibri" w:hAnsi="Calibri"/>
+          <w:b/>
+          <w:color w:val="1E293B"/>
+          <w:sz w:val="21"/>
+        </w:rPr>
+        <w:t>Ben Thanh Market Food Guide:</w:t>
+      </w:r>
+      <w:r>
+        <w:rPr>
+          <w:rFonts w:ascii="Calibri" w:hAnsi="Calibri"/>
+          <w:color w:val="1E293B"/>
+          <w:sz w:val="21"/>
+        </w:rPr>
+        <w:t xml:space="preserve"> savoring traditional flavors with our </w:t>
+      </w:r>
+      <w:r>
+        <w:rPr>
+          <w:rFonts w:ascii="Calibri" w:hAnsi="Calibri"/>
+          <w:color w:val="1E293B"/>
+          <w:sz w:val="21"/>
+        </w:rPr>
+        <w:t>Ben Thanh Market food guide</w:t>
+      </w:r>
+      <w:r>
+        <w:rPr>
+          <w:rFonts w:ascii="Calibri" w:hAnsi="Calibri"/>
+          <w:color w:val="1E293B"/>
+          <w:sz w:val="21"/>
+        </w:rPr>
+        <w:t>.</w:t>
+      </w:r>
+      <w:r>
+        <w:rPr>
+          <w:rFonts w:ascii="Calibri" w:hAnsi="Calibri"/>
+          <w:color w:val="1E293B"/>
+          <w:sz w:val="21"/>
+        </w:rPr>
+      </w:r>
+      <w:r>
+        <w:rPr>
+          <w:rFonts w:ascii="Calibri" w:hAnsi="Calibri"/>
+          <w:color w:val="1E293B"/>
+          <w:sz w:val="21"/>
+        </w:rPr>
+        <w:br/>
+        <w:t xml:space="preserve">- </w:t>
+      </w:r>
+      <w:r>
+        <w:rPr>
+          <w:rFonts w:ascii="Calibri" w:hAnsi="Calibri"/>
+          <w:b/>
+          <w:color w:val="1E293B"/>
+          <w:sz w:val="21"/>
+        </w:rPr>
+        <w:t>One-Day Ben Thanh Walking Tour:</w:t>
+      </w:r>
+      <w:r>
+        <w:rPr>
+          <w:rFonts w:ascii="Calibri" w:hAnsi="Calibri"/>
+          <w:color w:val="1E293B"/>
+          <w:sz w:val="21"/>
+        </w:rPr>
+        <w:t xml:space="preserve"> following our turn-by-turn </w:t>
+      </w:r>
+      <w:r>
+        <w:rPr>
+          <w:rFonts w:ascii="Calibri" w:hAnsi="Calibri"/>
+          <w:color w:val="1E293B"/>
+          <w:sz w:val="21"/>
+        </w:rPr>
+        <w:t>one-day Ben Thanh walking tour</w:t>
+      </w:r>
+      <w:r>
+        <w:rPr>
+          <w:rFonts w:ascii="Calibri" w:hAnsi="Calibri"/>
+          <w:color w:val="1E293B"/>
+          <w:sz w:val="21"/>
+        </w:rPr>
+        <w:t>.</w:t>
+      </w:r>
+    </w:p>
+    <w:p>
+      <w:pPr>
+        <w:spacing w:before="320" w:after="120" w:line="276" w:lineRule="auto"/>
+      </w:pPr>
+      <w:r>
+        <w:t>Closing Thoughts: Walking Saigon with Open Eyes</w:t>
+      </w:r>
+      <w:r>
+        <w:rPr>
+          <w:rFonts w:ascii="Calibri" w:hAnsi="Calibri"/>
+          <w:b/>
+          <w:color w:val="1B365D"/>
+          <w:sz w:val="32"/>
+        </w:rPr>
         <w:t>Closing Thoughts: Walking Saigon with Open Eyes</w:t>
       </w:r>
     </w:p>
@@ -2984,10 +3166,25 @@
     </w:p>
     <w:p>
       <w:pPr>
+        <w:spacing w:before="120" w:after="120"/>
+        <w:jc w:val="center"/>
+      </w:pPr>
+      <w:r>
+        <w:t>―――――――――――――――――――――――――――――――――――――――――――――</w:t>
+      </w:r>
+      <w:r>
+        <w:rPr>
+          <w:color w:val="CBD5E1"/>
+        </w:rPr>
+        <w:t>―――――――――――――――――――――――――――――――――――――――――――――</w:t>
+      </w:r>
+    </w:p>
+    <w:p>
+      <w:pPr>
         <w:spacing w:before="320" w:after="120" w:line="276" w:lineRule="auto"/>
       </w:pPr>
       <w:r>
-        <w:t>Epilogue: A Serene Dialogue with the Past</w:t>
+        <w:t>🗺️ Curated Cluster Connections</w:t>
       </w:r>
       <w:r>
         <w:rPr>
@@ -2996,6 +3193,141 @@
           <w:color w:val="1B365D"/>
           <w:sz w:val="32"/>
         </w:rPr>
+        <w:t>🗺️ Curated Cluster Connections</w:t>
+      </w:r>
+    </w:p>
+    <w:p>
+      <w:pPr>
+        <w:spacing w:before="40" w:after="120" w:line="276" w:lineRule="auto"/>
+      </w:pPr>
+      <w:r>
+        <w:t>To help you navigate District 1 with ease, explore our companion heritage guides:</w:t>
+        <w:br/>
+        <w:t>- One-Day Ben Thanh Walking Tour: incorporating the museum into a curated one-day Ben Thanh walking tour.</w:t>
+        <w:br/>
+        <w:t>- Secret Apartment Cafes: relaxing over specialty drip coffee in secret apartment cafes near Ben Thanh.</w:t>
+      </w:r>
+      <w:r>
+        <w:rPr>
+          <w:rFonts w:ascii="Calibri" w:hAnsi="Calibri"/>
+          <w:color w:val="1E293B"/>
+          <w:sz w:val="21"/>
+        </w:rPr>
+        <w:t>To help you navigate District 1 with ease, explore our companion heritage guides:</w:t>
+      </w:r>
+      <w:r>
+        <w:rPr>
+          <w:rFonts w:ascii="Calibri" w:hAnsi="Calibri"/>
+          <w:color w:val="1E293B"/>
+          <w:sz w:val="21"/>
+        </w:rPr>
+      </w:r>
+      <w:r>
+        <w:rPr>
+          <w:rFonts w:ascii="Calibri" w:hAnsi="Calibri"/>
+          <w:color w:val="1E293B"/>
+          <w:sz w:val="21"/>
+        </w:rPr>
+        <w:br/>
+        <w:t xml:space="preserve">- </w:t>
+      </w:r>
+      <w:r>
+        <w:rPr>
+          <w:rFonts w:ascii="Calibri" w:hAnsi="Calibri"/>
+          <w:b/>
+          <w:color w:val="1E293B"/>
+          <w:sz w:val="21"/>
+        </w:rPr>
+        <w:t>One-Day Ben Thanh Walking Tour:</w:t>
+      </w:r>
+      <w:r>
+        <w:rPr>
+          <w:rFonts w:ascii="Calibri" w:hAnsi="Calibri"/>
+          <w:color w:val="1E293B"/>
+          <w:sz w:val="21"/>
+        </w:rPr>
+        <w:t xml:space="preserve"> incorporating the museum into a curated </w:t>
+      </w:r>
+      <w:r>
+        <w:rPr>
+          <w:rFonts w:ascii="Calibri" w:hAnsi="Calibri"/>
+          <w:color w:val="1E293B"/>
+          <w:sz w:val="21"/>
+        </w:rPr>
+        <w:t>one-day Ben Thanh walking tour</w:t>
+      </w:r>
+      <w:r>
+        <w:rPr>
+          <w:rFonts w:ascii="Calibri" w:hAnsi="Calibri"/>
+          <w:color w:val="1E293B"/>
+          <w:sz w:val="21"/>
+        </w:rPr>
+        <w:t>.</w:t>
+      </w:r>
+      <w:r>
+        <w:rPr>
+          <w:rFonts w:ascii="Calibri" w:hAnsi="Calibri"/>
+          <w:color w:val="1E293B"/>
+          <w:sz w:val="21"/>
+        </w:rPr>
+      </w:r>
+      <w:r>
+        <w:rPr>
+          <w:rFonts w:ascii="Calibri" w:hAnsi="Calibri"/>
+          <w:color w:val="1E293B"/>
+          <w:sz w:val="21"/>
+        </w:rPr>
+        <w:br/>
+        <w:t xml:space="preserve">- </w:t>
+      </w:r>
+      <w:r>
+        <w:rPr>
+          <w:rFonts w:ascii="Calibri" w:hAnsi="Calibri"/>
+          <w:b/>
+          <w:color w:val="1E293B"/>
+          <w:sz w:val="21"/>
+        </w:rPr>
+        <w:t>Secret Apartment Cafes:</w:t>
+      </w:r>
+      <w:r>
+        <w:rPr>
+          <w:rFonts w:ascii="Calibri" w:hAnsi="Calibri"/>
+          <w:color w:val="1E293B"/>
+          <w:sz w:val="21"/>
+        </w:rPr>
+        <w:t xml:space="preserve"> relaxing over specialty drip coffee in </w:t>
+      </w:r>
+      <w:r>
+        <w:rPr>
+          <w:rFonts w:ascii="Calibri" w:hAnsi="Calibri"/>
+          <w:color w:val="1E293B"/>
+          <w:sz w:val="21"/>
+        </w:rPr>
+        <w:t>secret apartment cafes near Ben Thanh</w:t>
+      </w:r>
+      <w:r>
+        <w:rPr>
+          <w:rFonts w:ascii="Calibri" w:hAnsi="Calibri"/>
+          <w:color w:val="1E293B"/>
+          <w:sz w:val="21"/>
+        </w:rPr>
+        <w:t>.</w:t>
+      </w:r>
+    </w:p>
+    <w:p>
+      <w:pPr>
+        <w:spacing w:before="320" w:after="120" w:line="276" w:lineRule="auto"/>
+      </w:pPr>
+      <w:r>
+        <w:t>Epilogue: A Serene Dialogue with the Past</w:t>
+      </w:r>
+      <w:r>
+        <w:rPr>
+          <w:rFonts w:ascii="Calibri" w:hAnsi="Calibri"/>
+          <w:b/>
+          <w:color w:val="1B365D"/>
+          <w:sz w:val="32"/>
+        </w:rPr>
         <w:t>Epilogue: A Serene Dialogue with the Past</w:t>
       </w:r>
     </w:p>
@@ -4062,10 +4394,25 @@
     </w:p>
     <w:p>
       <w:pPr>
+        <w:spacing w:before="120" w:after="120"/>
+        <w:jc w:val="center"/>
+      </w:pPr>
+      <w:r>
+        <w:t>―――――――――――――――――――――――――――――――――――――――――――――</w:t>
+      </w:r>
+      <w:r>
+        <w:rPr>
+          <w:color w:val="CBD5E1"/>
+        </w:rPr>
+        <w:t>―――――――――――――――――――――――――――――――――――――――――――――</w:t>
+      </w:r>
+    </w:p>
+    <w:p>
+      <w:pPr>
         <w:spacing w:before="320" w:after="120" w:line="276" w:lineRule="auto"/>
       </w:pPr>
       <w:r>
-        <w:t>Epilogue: The Warmth of Living Memory</w:t>
+        <w:t>🗺️ Curated Cluster Connections</w:t>
       </w:r>
       <w:r>
         <w:rPr>
@@ -4074,6 +4421,243 @@
           <w:color w:val="1B365D"/>
           <w:sz w:val="32"/>
         </w:rPr>
+        <w:t>🗺️ Curated Cluster Connections</w:t>
+      </w:r>
+    </w:p>
+    <w:p>
+      <w:pPr>
+        <w:spacing w:before="40" w:after="120" w:line="276" w:lineRule="auto"/>
+      </w:pPr>
+      <w:r>
+        <w:t>To help you navigate District 1 with ease, explore our companion heritage guides:</w:t>
+        <w:br/>
+        <w:t>- Things to Do in Ben Thanh Market: discovering the 15 highlighted things to do in Ben Thanh Market.</w:t>
+        <w:br/>
+        <w:t>- Ben Thanh Market Scams &amp; Safety Guide: learning fair price benchmarks from our Ben Thanh Market scams and safety guide.</w:t>
+        <w:br/>
+        <w:t>- Best Rooftop Bars Near Ben Thanh: enjoying sunset drinks at the best rooftop bars near Ben Thanh.</w:t>
+        <w:br/>
+        <w:t>- Money Exchange at Ha Tam Gold Shop: exchanging spending cash at the trusted money exchange near Ben Thanh Market.</w:t>
+      </w:r>
+      <w:r>
+        <w:rPr>
+          <w:rFonts w:ascii="Calibri" w:hAnsi="Calibri"/>
+          <w:color w:val="1E293B"/>
+          <w:sz w:val="21"/>
+        </w:rPr>
+        <w:t>To help you navigate District 1 with ease, explore our companion heritage guides:</w:t>
+      </w:r>
+      <w:r>
+        <w:rPr>
+          <w:rFonts w:ascii="Calibri" w:hAnsi="Calibri"/>
+          <w:color w:val="1E293B"/>
+          <w:sz w:val="21"/>
+        </w:rPr>
+      </w:r>
+      <w:r>
+        <w:rPr>
+          <w:rFonts w:ascii="Calibri" w:hAnsi="Calibri"/>
+          <w:color w:val="1E293B"/>
+          <w:sz w:val="21"/>
+        </w:rPr>
+        <w:br/>
+        <w:t xml:space="preserve">- </w:t>
+      </w:r>
+      <w:r>
+        <w:rPr>
+          <w:rFonts w:ascii="Calibri" w:hAnsi="Calibri"/>
+          <w:b/>
+          <w:color w:val="1E293B"/>
+          <w:sz w:val="21"/>
+        </w:rPr>
+        <w:t>Things to Do in Ben Thanh Market:</w:t>
+      </w:r>
+      <w:r>
+        <w:rPr>
+          <w:rFonts w:ascii="Calibri" w:hAnsi="Calibri"/>
+          <w:color w:val="1E293B"/>
+          <w:sz w:val="21"/>
+        </w:rPr>
+        <w:t xml:space="preserve"> discovering the 15 highlighted </w:t>
+      </w:r>
+      <w:r>
+        <w:rPr>
+          <w:rFonts w:ascii="Calibri" w:hAnsi="Calibri"/>
+          <w:color w:val="1E293B"/>
+          <w:sz w:val="21"/>
+        </w:rPr>
+        <w:t>things to do in Ben Thanh Market</w:t>
+      </w:r>
+      <w:r>
+        <w:rPr>
+          <w:rFonts w:ascii="Calibri" w:hAnsi="Calibri"/>
+          <w:color w:val="1E293B"/>
+          <w:sz w:val="21"/>
+        </w:rPr>
+        <w:t>.</w:t>
+      </w:r>
+      <w:r>
+        <w:rPr>
+          <w:rFonts w:ascii="Calibri" w:hAnsi="Calibri"/>
+          <w:color w:val="1E293B"/>
+          <w:sz w:val="21"/>
+        </w:rPr>
+      </w:r>
+      <w:r>
+        <w:rPr>
+          <w:rFonts w:ascii="Calibri" w:hAnsi="Calibri"/>
+          <w:color w:val="1E293B"/>
+          <w:sz w:val="21"/>
+        </w:rPr>
+        <w:br/>
+        <w:t xml:space="preserve">- </w:t>
+      </w:r>
+      <w:r>
+        <w:rPr>
+          <w:rFonts w:ascii="Calibri" w:hAnsi="Calibri"/>
+          <w:b/>
+          <w:color w:val="1E293B"/>
+          <w:sz w:val="21"/>
+        </w:rPr>
+        <w:t>Ben Thanh Market Scams &amp; Safety Guide:</w:t>
+      </w:r>
+      <w:r>
+        <w:rPr>
+          <w:rFonts w:ascii="Calibri" w:hAnsi="Calibri"/>
+          <w:color w:val="1E293B"/>
+          <w:sz w:val="21"/>
+        </w:rPr>
+        <w:t xml:space="preserve"> learning fair price benchmarks from our </w:t>
+      </w:r>
+      <w:r>
+        <w:rPr>
+          <w:rFonts w:ascii="Calibri" w:hAnsi="Calibri"/>
+          <w:color w:val="1E293B"/>
+          <w:sz w:val="21"/>
+        </w:rPr>
+        <w:t>Ben Thanh Market scams and safety guide</w:t>
+      </w:r>
+      <w:r>
+        <w:rPr>
+          <w:rFonts w:ascii="Calibri" w:hAnsi="Calibri"/>
+          <w:color w:val="1E293B"/>
+          <w:sz w:val="21"/>
+        </w:rPr>
+        <w:t>.</w:t>
+      </w:r>
+      <w:r>
+        <w:rPr>
+          <w:rFonts w:ascii="Calibri" w:hAnsi="Calibri"/>
+          <w:color w:val="1E293B"/>
+          <w:sz w:val="21"/>
+        </w:rPr>
+      </w:r>
+      <w:r>
+        <w:rPr>
+          <w:rFonts w:ascii="Calibri" w:hAnsi="Calibri"/>
+          <w:color w:val="1E293B"/>
+          <w:sz w:val="21"/>
+        </w:rPr>
+        <w:br/>
+        <w:t xml:space="preserve">- </w:t>
+      </w:r>
+      <w:r>
+        <w:rPr>
+          <w:rFonts w:ascii="Calibri" w:hAnsi="Calibri"/>
+          <w:b/>
+          <w:color w:val="1E293B"/>
+          <w:sz w:val="21"/>
+        </w:rPr>
+        <w:t>Best Rooftop Bars Near Ben Thanh:</w:t>
+      </w:r>
+      <w:r>
+        <w:rPr>
+          <w:rFonts w:ascii="Calibri" w:hAnsi="Calibri"/>
+          <w:color w:val="1E293B"/>
+          <w:sz w:val="21"/>
+        </w:rPr>
+        <w:t xml:space="preserve"> enjoying sunset drinks at the </w:t>
+      </w:r>
+      <w:r>
+        <w:rPr>
+          <w:rFonts w:ascii="Calibri" w:hAnsi="Calibri"/>
+          <w:color w:val="1E293B"/>
+          <w:sz w:val="21"/>
+        </w:rPr>
+        <w:t>best rooftop bars near Ben Thanh</w:t>
+      </w:r>
+      <w:r>
+        <w:rPr>
+          <w:rFonts w:ascii="Calibri" w:hAnsi="Calibri"/>
+          <w:color w:val="1E293B"/>
+          <w:sz w:val="21"/>
+        </w:rPr>
+        <w:t>.</w:t>
+      </w:r>
+      <w:r>
+        <w:rPr>
+          <w:rFonts w:ascii="Calibri" w:hAnsi="Calibri"/>
+          <w:color w:val="1E293B"/>
+          <w:sz w:val="21"/>
+        </w:rPr>
+      </w:r>
+      <w:r>
+        <w:rPr>
+          <w:rFonts w:ascii="Calibri" w:hAnsi="Calibri"/>
+          <w:color w:val="1E293B"/>
+          <w:sz w:val="21"/>
+        </w:rPr>
+        <w:br/>
+        <w:t xml:space="preserve">- </w:t>
+      </w:r>
+      <w:r>
+        <w:rPr>
+          <w:rFonts w:ascii="Calibri" w:hAnsi="Calibri"/>
+          <w:b/>
+          <w:color w:val="1E293B"/>
+          <w:sz w:val="21"/>
+        </w:rPr>
+        <w:t>Money Exchange at Ha Tam Gold Shop:</w:t>
+      </w:r>
+      <w:r>
+        <w:rPr>
+          <w:rFonts w:ascii="Calibri" w:hAnsi="Calibri"/>
+          <w:color w:val="1E293B"/>
+          <w:sz w:val="21"/>
+        </w:rPr>
+        <w:t xml:space="preserve"> exchanging spending cash at the trusted </w:t>
+      </w:r>
+      <w:r>
+        <w:rPr>
+          <w:rFonts w:ascii="Calibri" w:hAnsi="Calibri"/>
+          <w:color w:val="1E293B"/>
+          <w:sz w:val="21"/>
+        </w:rPr>
+        <w:t>money exchange near Ben Thanh Market</w:t>
+      </w:r>
+      <w:r>
+        <w:rPr>
+          <w:rFonts w:ascii="Calibri" w:hAnsi="Calibri"/>
+          <w:color w:val="1E293B"/>
+          <w:sz w:val="21"/>
+        </w:rPr>
+        <w:t>.</w:t>
+      </w:r>
+    </w:p>
+    <w:p>
+      <w:pPr>
+        <w:spacing w:before="320" w:after="120" w:line="276" w:lineRule="auto"/>
+      </w:pPr>
+      <w:r>
+        <w:t>Epilogue: The Warmth of Living Memory</w:t>
+      </w:r>
+      <w:r>
+        <w:rPr>
+          <w:rFonts w:ascii="Calibri" w:hAnsi="Calibri"/>
+          <w:b/>
+          <w:color w:val="1B365D"/>
+          <w:sz w:val="32"/>
+        </w:rPr>
         <w:t>Epilogue: The Warmth of Living Memory</w:t>
       </w:r>
     </w:p>
@@ -4224,7 +4808,39 @@
           <w:color w:val="1E293B"/>
           <w:sz w:val="20"/>
         </w:rPr>
-        <w:t xml:space="preserve"> Seamlessly links Ben Thanh Market, Mariamman Hindu Temple, HCMC Museum of Fine Arts, Independence Palace, Ben Thanh Metro Station, and Bach Dang Riverfront Park.</w:t>
+        <w:t xml:space="preserve"> Seamlessly links Ben Thanh Market, </w:t>
+      </w:r>
+      <w:r>
+        <w:rPr>
+          <w:rFonts w:ascii="Calibri" w:hAnsi="Calibri"/>
+          <w:color w:val="D97706"/>
+          <w:sz w:val="20"/>
+        </w:rPr>
+        <w:t>Mariamman Hindu Temple</w:t>
+      </w:r>
+      <w:r>
+        <w:rPr>
+          <w:rFonts w:ascii="Calibri" w:hAnsi="Calibri"/>
+          <w:color w:val="1E293B"/>
+          <w:sz w:val="20"/>
+        </w:rPr>
+        <w:t xml:space="preserve">, HCMC Museum of Fine Arts, </w:t>
+      </w:r>
+      <w:r>
+        <w:rPr>
+          <w:rFonts w:ascii="Calibri" w:hAnsi="Calibri"/>
+          <w:color w:val="D97706"/>
+          <w:sz w:val="20"/>
+        </w:rPr>
+        <w:t>Independence Palace</w:t>
+      </w:r>
+      <w:r>
+        <w:rPr>
+          <w:rFonts w:ascii="Calibri" w:hAnsi="Calibri"/>
+          <w:color w:val="1E293B"/>
+          <w:sz w:val="20"/>
+        </w:rPr>
+        <w:t>, Ben Thanh Metro Station, and Bach Dang Riverfront Park.</w:t>
       </w:r>
     </w:p>
     <w:p>
@@ -6077,10 +6693,25 @@
     </w:p>
     <w:p>
       <w:pPr>
+        <w:spacing w:before="120" w:after="120"/>
+        <w:jc w:val="center"/>
+      </w:pPr>
+      <w:r>
+        <w:t>―――――――――――――――――――――――――――――――――――――――――――――</w:t>
+      </w:r>
+      <w:r>
+        <w:rPr>
+          <w:color w:val="CBD5E1"/>
+        </w:rPr>
+        <w:t>―――――――――――――――――――――――――――――――――――――――――――――</w:t>
+      </w:r>
+    </w:p>
+    <w:p>
+      <w:pPr>
         <w:spacing w:before="320" w:after="120" w:line="276" w:lineRule="auto"/>
       </w:pPr>
       <w:r>
-        <w:t>Epilogue: A Concrete Hymn to Sovereignty and Peace</w:t>
+        <w:t>🗺️ Curated Cluster Connections</w:t>
       </w:r>
       <w:r>
         <w:rPr>
@@ -6089,6 +6720,141 @@
           <w:color w:val="1B365D"/>
           <w:sz w:val="32"/>
         </w:rPr>
+        <w:t>🗺️ Curated Cluster Connections</w:t>
+      </w:r>
+    </w:p>
+    <w:p>
+      <w:pPr>
+        <w:spacing w:before="40" w:after="120" w:line="276" w:lineRule="auto"/>
+      </w:pPr>
+      <w:r>
+        <w:t>To help you navigate District 1 with ease, explore our companion heritage guides:</w:t>
+        <w:br/>
+        <w:t>- Saigon Hop-On Hop-Off Bus: boarding the Saigon Hop-On Hop-Off Bus right outside the main palace gate.</w:t>
+        <w:br/>
+        <w:t>- Boutique Hotels Near Ben Thanh: staying within walking distance at curated boutique hotels near Ben Thanh.</w:t>
+      </w:r>
+      <w:r>
+        <w:rPr>
+          <w:rFonts w:ascii="Calibri" w:hAnsi="Calibri"/>
+          <w:color w:val="1E293B"/>
+          <w:sz w:val="21"/>
+        </w:rPr>
+        <w:t>To help you navigate District 1 with ease, explore our companion heritage guides:</w:t>
+      </w:r>
+      <w:r>
+        <w:rPr>
+          <w:rFonts w:ascii="Calibri" w:hAnsi="Calibri"/>
+          <w:color w:val="1E293B"/>
+          <w:sz w:val="21"/>
+        </w:rPr>
+      </w:r>
+      <w:r>
+        <w:rPr>
+          <w:rFonts w:ascii="Calibri" w:hAnsi="Calibri"/>
+          <w:color w:val="1E293B"/>
+          <w:sz w:val="21"/>
+        </w:rPr>
+        <w:br/>
+        <w:t xml:space="preserve">- </w:t>
+      </w:r>
+      <w:r>
+        <w:rPr>
+          <w:rFonts w:ascii="Calibri" w:hAnsi="Calibri"/>
+          <w:b/>
+          <w:color w:val="1E293B"/>
+          <w:sz w:val="21"/>
+        </w:rPr>
+        <w:t>Saigon Hop-On Hop-Off Bus:</w:t>
+      </w:r>
+      <w:r>
+        <w:rPr>
+          <w:rFonts w:ascii="Calibri" w:hAnsi="Calibri"/>
+          <w:color w:val="1E293B"/>
+          <w:sz w:val="21"/>
+        </w:rPr>
+        <w:t xml:space="preserve"> boarding the </w:t>
+      </w:r>
+      <w:r>
+        <w:rPr>
+          <w:rFonts w:ascii="Calibri" w:hAnsi="Calibri"/>
+          <w:color w:val="1E293B"/>
+          <w:sz w:val="21"/>
+        </w:rPr>
+        <w:t>Saigon Hop-On Hop-Off Bus</w:t>
+      </w:r>
+      <w:r>
+        <w:rPr>
+          <w:rFonts w:ascii="Calibri" w:hAnsi="Calibri"/>
+          <w:color w:val="1E293B"/>
+          <w:sz w:val="21"/>
+        </w:rPr>
+        <w:t xml:space="preserve"> right outside the main palace gate.</w:t>
+      </w:r>
+      <w:r>
+        <w:rPr>
+          <w:rFonts w:ascii="Calibri" w:hAnsi="Calibri"/>
+          <w:color w:val="1E293B"/>
+          <w:sz w:val="21"/>
+        </w:rPr>
+      </w:r>
+      <w:r>
+        <w:rPr>
+          <w:rFonts w:ascii="Calibri" w:hAnsi="Calibri"/>
+          <w:color w:val="1E293B"/>
+          <w:sz w:val="21"/>
+        </w:rPr>
+        <w:br/>
+        <w:t xml:space="preserve">- </w:t>
+      </w:r>
+      <w:r>
+        <w:rPr>
+          <w:rFonts w:ascii="Calibri" w:hAnsi="Calibri"/>
+          <w:b/>
+          <w:color w:val="1E293B"/>
+          <w:sz w:val="21"/>
+        </w:rPr>
+        <w:t>Boutique Hotels Near Ben Thanh:</w:t>
+      </w:r>
+      <w:r>
+        <w:rPr>
+          <w:rFonts w:ascii="Calibri" w:hAnsi="Calibri"/>
+          <w:color w:val="1E293B"/>
+          <w:sz w:val="21"/>
+        </w:rPr>
+        <w:t xml:space="preserve"> staying within walking distance at curated </w:t>
+      </w:r>
+      <w:r>
+        <w:rPr>
+          <w:rFonts w:ascii="Calibri" w:hAnsi="Calibri"/>
+          <w:color w:val="1E293B"/>
+          <w:sz w:val="21"/>
+        </w:rPr>
+        <w:t>boutique hotels near Ben Thanh</w:t>
+      </w:r>
+      <w:r>
+        <w:rPr>
+          <w:rFonts w:ascii="Calibri" w:hAnsi="Calibri"/>
+          <w:color w:val="1E293B"/>
+          <w:sz w:val="21"/>
+        </w:rPr>
+        <w:t>.</w:t>
+      </w:r>
+    </w:p>
+    <w:p>
+      <w:pPr>
+        <w:spacing w:before="320" w:after="120" w:line="276" w:lineRule="auto"/>
+      </w:pPr>
+      <w:r>
+        <w:t>Epilogue: A Concrete Hymn to Sovereignty and Peace</w:t>
+      </w:r>
+      <w:r>
+        <w:rPr>
+          <w:rFonts w:ascii="Calibri" w:hAnsi="Calibri"/>
+          <w:b/>
+          <w:color w:val="1B365D"/>
+          <w:sz w:val="32"/>
+        </w:rPr>
         <w:t>Epilogue: A Concrete Hymn to Sovereignty and Peace</w:t>
       </w:r>
     </w:p>
@@ -6806,10 +7572,25 @@
     </w:p>
     <w:p>
       <w:pPr>
+        <w:spacing w:before="120" w:after="120"/>
+        <w:jc w:val="center"/>
+      </w:pPr>
+      <w:r>
+        <w:t>―――――――――――――――――――――――――――――――――――――――――――――</w:t>
+      </w:r>
+      <w:r>
+        <w:rPr>
+          <w:color w:val="CBD5E1"/>
+        </w:rPr>
+        <w:t>―――――――――――――――――――――――――――――――――――――――――――――</w:t>
+      </w:r>
+    </w:p>
+    <w:p>
+      <w:pPr>
         <w:spacing w:before="320" w:after="120" w:line="276" w:lineRule="auto"/>
       </w:pPr>
       <w:r>
-        <w:t>Epilogue: The Velocity of a Renewed Metropolis</w:t>
+        <w:t>🗺️ Curated Cluster Connections</w:t>
       </w:r>
       <w:r>
         <w:rPr>
@@ -6818,6 +7599,192 @@
           <w:color w:val="1B365D"/>
           <w:sz w:val="32"/>
         </w:rPr>
+        <w:t>🗺️ Curated Cluster Connections</w:t>
+      </w:r>
+    </w:p>
+    <w:p>
+      <w:pPr>
+        <w:spacing w:before="40" w:after="120" w:line="276" w:lineRule="auto"/>
+      </w:pPr>
+      <w:r>
+        <w:t>To help you navigate District 1 with ease, explore our companion heritage guides:</w:t>
+        <w:br/>
+        <w:t>- Things to Do in Ben Thanh Market: connecting directly into the bustling stalls of things to do in Ben Thanh Market.</w:t>
+        <w:br/>
+        <w:t>- Parking Guide Near Ben Thanh Market: accessing secure parking with our parking guide near Ben Thanh Market.</w:t>
+        <w:br/>
+        <w:t>- Tan Son Nhat Airport Transfer Guide: connecting from the terminal via our Tan Son Nhat airport to Ben Thanh transfer guide.</w:t>
+      </w:r>
+      <w:r>
+        <w:rPr>
+          <w:rFonts w:ascii="Calibri" w:hAnsi="Calibri"/>
+          <w:color w:val="1E293B"/>
+          <w:sz w:val="21"/>
+        </w:rPr>
+        <w:t>To help you navigate District 1 with ease, explore our companion heritage guides:</w:t>
+      </w:r>
+      <w:r>
+        <w:rPr>
+          <w:rFonts w:ascii="Calibri" w:hAnsi="Calibri"/>
+          <w:color w:val="1E293B"/>
+          <w:sz w:val="21"/>
+        </w:rPr>
+      </w:r>
+      <w:r>
+        <w:rPr>
+          <w:rFonts w:ascii="Calibri" w:hAnsi="Calibri"/>
+          <w:color w:val="1E293B"/>
+          <w:sz w:val="21"/>
+        </w:rPr>
+        <w:br/>
+        <w:t xml:space="preserve">- </w:t>
+      </w:r>
+      <w:r>
+        <w:rPr>
+          <w:rFonts w:ascii="Calibri" w:hAnsi="Calibri"/>
+          <w:b/>
+          <w:color w:val="1E293B"/>
+          <w:sz w:val="21"/>
+        </w:rPr>
+        <w:t>Things to Do in Ben Thanh Market:</w:t>
+      </w:r>
+      <w:r>
+        <w:rPr>
+          <w:rFonts w:ascii="Calibri" w:hAnsi="Calibri"/>
+          <w:color w:val="1E293B"/>
+          <w:sz w:val="21"/>
+        </w:rPr>
+        <w:t xml:space="preserve"> connecting directly into the bustling stalls of </w:t>
+      </w:r>
+      <w:r>
+        <w:rPr>
+          <w:rFonts w:ascii="Calibri" w:hAnsi="Calibri"/>
+          <w:color w:val="1E293B"/>
+          <w:sz w:val="21"/>
+        </w:rPr>
+        <w:t>things to do in Ben Thanh Market</w:t>
+      </w:r>
+      <w:r>
+        <w:rPr>
+          <w:rFonts w:ascii="Calibri" w:hAnsi="Calibri"/>
+          <w:color w:val="1E293B"/>
+          <w:sz w:val="21"/>
+        </w:rPr>
+        <w:t>.</w:t>
+      </w:r>
+      <w:r>
+        <w:rPr>
+          <w:rFonts w:ascii="Calibri" w:hAnsi="Calibri"/>
+          <w:color w:val="1E293B"/>
+          <w:sz w:val="21"/>
+        </w:rPr>
+      </w:r>
+      <w:r>
+        <w:rPr>
+          <w:rFonts w:ascii="Calibri" w:hAnsi="Calibri"/>
+          <w:color w:val="1E293B"/>
+          <w:sz w:val="21"/>
+        </w:rPr>
+        <w:br/>
+        <w:t xml:space="preserve">- </w:t>
+      </w:r>
+      <w:r>
+        <w:rPr>
+          <w:rFonts w:ascii="Calibri" w:hAnsi="Calibri"/>
+          <w:b/>
+          <w:color w:val="1E293B"/>
+          <w:sz w:val="21"/>
+        </w:rPr>
+        <w:t>Parking Guide Near Ben Thanh Market:</w:t>
+      </w:r>
+      <w:r>
+        <w:rPr>
+          <w:rFonts w:ascii="Calibri" w:hAnsi="Calibri"/>
+          <w:color w:val="1E293B"/>
+          <w:sz w:val="21"/>
+        </w:rPr>
+        <w:t xml:space="preserve"> accessing secure parking with our </w:t>
+      </w:r>
+      <w:r>
+        <w:rPr>
+          <w:rFonts w:ascii="Calibri" w:hAnsi="Calibri"/>
+          <w:color w:val="1E293B"/>
+          <w:sz w:val="21"/>
+        </w:rPr>
+        <w:t>parking guide near Ben Thanh Market</w:t>
+      </w:r>
+      <w:r>
+        <w:rPr>
+          <w:rFonts w:ascii="Calibri" w:hAnsi="Calibri"/>
+          <w:color w:val="1E293B"/>
+          <w:sz w:val="21"/>
+        </w:rPr>
+        <w:t>.</w:t>
+      </w:r>
+      <w:r>
+        <w:rPr>
+          <w:rFonts w:ascii="Calibri" w:hAnsi="Calibri"/>
+          <w:color w:val="1E293B"/>
+          <w:sz w:val="21"/>
+        </w:rPr>
+      </w:r>
+      <w:r>
+        <w:rPr>
+          <w:rFonts w:ascii="Calibri" w:hAnsi="Calibri"/>
+          <w:color w:val="1E293B"/>
+          <w:sz w:val="21"/>
+        </w:rPr>
+        <w:br/>
+        <w:t xml:space="preserve">- </w:t>
+      </w:r>
+      <w:r>
+        <w:rPr>
+          <w:rFonts w:ascii="Calibri" w:hAnsi="Calibri"/>
+          <w:b/>
+          <w:color w:val="1E293B"/>
+          <w:sz w:val="21"/>
+        </w:rPr>
+        <w:t>Tan Son Nhat Airport Transfer Guide:</w:t>
+      </w:r>
+      <w:r>
+        <w:rPr>
+          <w:rFonts w:ascii="Calibri" w:hAnsi="Calibri"/>
+          <w:color w:val="1E293B"/>
+          <w:sz w:val="21"/>
+        </w:rPr>
+        <w:t xml:space="preserve"> connecting from the terminal via our </w:t>
+      </w:r>
+      <w:r>
+        <w:rPr>
+          <w:rFonts w:ascii="Calibri" w:hAnsi="Calibri"/>
+          <w:color w:val="1E293B"/>
+          <w:sz w:val="21"/>
+        </w:rPr>
+        <w:t>Tan Son Nhat airport to Ben Thanh transfer guide</w:t>
+      </w:r>
+      <w:r>
+        <w:rPr>
+          <w:rFonts w:ascii="Calibri" w:hAnsi="Calibri"/>
+          <w:color w:val="1E293B"/>
+          <w:sz w:val="21"/>
+        </w:rPr>
+        <w:t>.</w:t>
+      </w:r>
+    </w:p>
+    <w:p>
+      <w:pPr>
+        <w:spacing w:before="320" w:after="120" w:line="276" w:lineRule="auto"/>
+      </w:pPr>
+      <w:r>
+        <w:t>Epilogue: The Velocity of a Renewed Metropolis</w:t>
+      </w:r>
+      <w:r>
+        <w:rPr>
+          <w:rFonts w:ascii="Calibri" w:hAnsi="Calibri"/>
+          <w:b/>
+          <w:color w:val="1B365D"/>
+          <w:sz w:val="32"/>
+        </w:rPr>
         <w:t>Epilogue: The Velocity of a Renewed Metropolis</w:t>
       </w:r>
     </w:p>
@@ -7711,6 +8678,207 @@
           <w:color w:val="CBD5E1"/>
         </w:rPr>
         <w:t>―――――――――――――――――――――――――――――――――――――――――――――</w:t>
+      </w:r>
+    </w:p>
+    <w:p>
+      <w:pPr>
+        <w:spacing w:before="120" w:after="120"/>
+        <w:jc w:val="center"/>
+      </w:pPr>
+      <w:r>
+        <w:t>―――――――――――――――――――――――――――――――――――――――――――――</w:t>
+      </w:r>
+      <w:r>
+        <w:rPr>
+          <w:color w:val="CBD5E1"/>
+        </w:rPr>
+        <w:t>―――――――――――――――――――――――――――――――――――――――――――――</w:t>
+      </w:r>
+    </w:p>
+    <w:p>
+      <w:pPr>
+        <w:spacing w:before="320" w:after="120" w:line="276" w:lineRule="auto"/>
+      </w:pPr>
+      <w:r>
+        <w:t>🗺️ Curated Cluster Connections</w:t>
+      </w:r>
+      <w:r>
+        <w:rPr>
+          <w:rFonts w:ascii="Calibri" w:hAnsi="Calibri"/>
+          <w:b/>
+          <w:color w:val="1B365D"/>
+          <w:sz w:val="32"/>
+        </w:rPr>
+        <w:t>🗺️ Curated Cluster Connections</w:t>
+      </w:r>
+    </w:p>
+    <w:p>
+      <w:pPr>
+        <w:spacing w:before="40" w:after="120" w:line="276" w:lineRule="auto"/>
+      </w:pPr>
+      <w:r>
+        <w:t>To help you navigate District 1 with ease, explore our companion heritage guides:</w:t>
+        <w:br/>
+        <w:t>- One-Day Ben Thanh Walking Tour: including the temple in our morning one-day Ben Thanh walking tour.</w:t>
+        <w:br/>
+        <w:t>- Secret Apartment Cafes: relaxing after your temple visit in secret apartment cafes near Ben Thanh.</w:t>
+        <w:br/>
+        <w:t>- Curated Vietnam Tours: discovering more southern heritage on our curated Vietnam tours.</w:t>
+      </w:r>
+      <w:r>
+        <w:rPr>
+          <w:rFonts w:ascii="Calibri" w:hAnsi="Calibri"/>
+          <w:color w:val="1E293B"/>
+          <w:sz w:val="21"/>
+        </w:rPr>
+        <w:t>To help you navigate District 1 with ease, explore our companion heritage guides:</w:t>
+      </w:r>
+      <w:r>
+        <w:rPr>
+          <w:rFonts w:ascii="Calibri" w:hAnsi="Calibri"/>
+          <w:color w:val="1E293B"/>
+          <w:sz w:val="21"/>
+        </w:rPr>
+      </w:r>
+      <w:r>
+        <w:rPr>
+          <w:rFonts w:ascii="Calibri" w:hAnsi="Calibri"/>
+          <w:color w:val="1E293B"/>
+          <w:sz w:val="21"/>
+        </w:rPr>
+        <w:br/>
+        <w:t xml:space="preserve">- </w:t>
+      </w:r>
+      <w:r>
+        <w:rPr>
+          <w:rFonts w:ascii="Calibri" w:hAnsi="Calibri"/>
+          <w:b/>
+          <w:color w:val="1E293B"/>
+          <w:sz w:val="21"/>
+        </w:rPr>
+        <w:t>One-Day Ben Thanh Walking Tour:</w:t>
+      </w:r>
+      <w:r>
+        <w:rPr>
+          <w:rFonts w:ascii="Calibri" w:hAnsi="Calibri"/>
+          <w:color w:val="1E293B"/>
+          <w:sz w:val="21"/>
+        </w:rPr>
+        <w:t xml:space="preserve"> including the temple in our morning </w:t>
+      </w:r>
+      <w:r>
+        <w:rPr>
+          <w:rFonts w:ascii="Calibri" w:hAnsi="Calibri"/>
+          <w:color w:val="1E293B"/>
+          <w:sz w:val="21"/>
+        </w:rPr>
+        <w:t>one-day Ben Thanh walking tour</w:t>
+      </w:r>
+      <w:r>
+        <w:rPr>
+          <w:rFonts w:ascii="Calibri" w:hAnsi="Calibri"/>
+          <w:color w:val="1E293B"/>
+          <w:sz w:val="21"/>
+        </w:rPr>
+        <w:t>.</w:t>
+      </w:r>
+      <w:r>
+        <w:rPr>
+          <w:rFonts w:ascii="Calibri" w:hAnsi="Calibri"/>
+          <w:color w:val="1E293B"/>
+          <w:sz w:val="21"/>
+        </w:rPr>
+      </w:r>
+      <w:r>
+        <w:rPr>
+          <w:rFonts w:ascii="Calibri" w:hAnsi="Calibri"/>
+          <w:color w:val="1E293B"/>
+          <w:sz w:val="21"/>
+        </w:rPr>
+        <w:br/>
+        <w:t xml:space="preserve">- </w:t>
+      </w:r>
+      <w:r>
+        <w:rPr>
+          <w:rFonts w:ascii="Calibri" w:hAnsi="Calibri"/>
+          <w:b/>
+          <w:color w:val="1E293B"/>
+          <w:sz w:val="21"/>
+        </w:rPr>
+        <w:t>Secret Apartment Cafes:</w:t>
+      </w:r>
+      <w:r>
+        <w:rPr>
+          <w:rFonts w:ascii="Calibri" w:hAnsi="Calibri"/>
+          <w:color w:val="1E293B"/>
+          <w:sz w:val="21"/>
+        </w:rPr>
+        <w:t xml:space="preserve"> relaxing after your temple visit in </w:t>
+      </w:r>
+      <w:r>
+        <w:rPr>
+          <w:rFonts w:ascii="Calibri" w:hAnsi="Calibri"/>
+          <w:color w:val="1E293B"/>
+          <w:sz w:val="21"/>
+        </w:rPr>
+        <w:t>secret apartment cafes near Ben Thanh</w:t>
+      </w:r>
+      <w:r>
+        <w:rPr>
+          <w:rFonts w:ascii="Calibri" w:hAnsi="Calibri"/>
+          <w:color w:val="1E293B"/>
+          <w:sz w:val="21"/>
+        </w:rPr>
+        <w:t>.</w:t>
+      </w:r>
+      <w:r>
+        <w:rPr>
+          <w:rFonts w:ascii="Calibri" w:hAnsi="Calibri"/>
+          <w:color w:val="1E293B"/>
+          <w:sz w:val="21"/>
+        </w:rPr>
+      </w:r>
+      <w:r>
+        <w:rPr>
+          <w:rFonts w:ascii="Calibri" w:hAnsi="Calibri"/>
+          <w:color w:val="1E293B"/>
+          <w:sz w:val="21"/>
+        </w:rPr>
+        <w:br/>
+        <w:t xml:space="preserve">- </w:t>
+      </w:r>
+      <w:r>
+        <w:rPr>
+          <w:rFonts w:ascii="Calibri" w:hAnsi="Calibri"/>
+          <w:b/>
+          <w:color w:val="1E293B"/>
+          <w:sz w:val="21"/>
+        </w:rPr>
+        <w:t>Curated Vietnam Tours:</w:t>
+      </w:r>
+      <w:r>
+        <w:rPr>
+          <w:rFonts w:ascii="Calibri" w:hAnsi="Calibri"/>
+          <w:color w:val="1E293B"/>
+          <w:sz w:val="21"/>
+        </w:rPr>
+        <w:t xml:space="preserve"> discovering more southern heritage on our </w:t>
+      </w:r>
+      <w:r>
+        <w:rPr>
+          <w:rFonts w:ascii="Calibri" w:hAnsi="Calibri"/>
+          <w:color w:val="1E293B"/>
+          <w:sz w:val="21"/>
+        </w:rPr>
+        <w:t>curated Vietnam tours</w:t>
+      </w:r>
+      <w:r>
+        <w:rPr>
+          <w:rFonts w:ascii="Calibri" w:hAnsi="Calibri"/>
+          <w:color w:val="1E293B"/>
+          <w:sz w:val="21"/>
+        </w:rPr>
+        <w:t>.</w:t>
       </w:r>
     </w:p>
     <w:p>
@@ -8544,10 +9712,25 @@
     </w:p>
     <w:p>
       <w:pPr>
+        <w:spacing w:before="120" w:after="120"/>
+        <w:jc w:val="center"/>
+      </w:pPr>
+      <w:r>
+        <w:t>―――――――――――――――――――――――――――――――――――――――――――――</w:t>
+      </w:r>
+      <w:r>
+        <w:rPr>
+          <w:color w:val="CBD5E1"/>
+        </w:rPr>
+        <w:t>―――――――――――――――――――――――――――――――――――――――――――――</w:t>
+      </w:r>
+    </w:p>
+    <w:p>
+      <w:pPr>
         <w:spacing w:before="320" w:after="120" w:line="276" w:lineRule="auto"/>
       </w:pPr>
       <w:r>
-        <w:t>Epilogue: Carrying Home the Warmth of Southern Hospitality</w:t>
+        <w:t>🗺️ Curated Cluster Connections</w:t>
       </w:r>
       <w:r>
         <w:rPr>
@@ -8556,6 +9739,243 @@
           <w:color w:val="1B365D"/>
           <w:sz w:val="32"/>
         </w:rPr>
+        <w:t>🗺️ Curated Cluster Connections</w:t>
+      </w:r>
+    </w:p>
+    <w:p>
+      <w:pPr>
+        <w:spacing w:before="40" w:after="120" w:line="276" w:lineRule="auto"/>
+      </w:pPr>
+      <w:r>
+        <w:t>To help you navigate District 1 with ease, explore our companion heritage guides:</w:t>
+        <w:br/>
+        <w:t>- Money Exchange at Ha Tam Gold Shop: securing local cash at the licensed money exchange near Ben Thanh Market.</w:t>
+        <w:br/>
+        <w:t>- Ben Thanh Market Scams &amp; Safety Guide: avoiding bargaining traps with our Ben Thanh Market scams and safety guide.</w:t>
+        <w:br/>
+        <w:t>- Things to Do in Ben Thanh Market: navigating the 4 gates with our things to do in Ben Thanh Market guide.</w:t>
+        <w:br/>
+        <w:t>- Ben Thanh Market Ultimate Travel Guide: checking opening hours in our Ben Thanh Market ultimate travel guide.</w:t>
+      </w:r>
+      <w:r>
+        <w:rPr>
+          <w:rFonts w:ascii="Calibri" w:hAnsi="Calibri"/>
+          <w:color w:val="1E293B"/>
+          <w:sz w:val="21"/>
+        </w:rPr>
+        <w:t>To help you navigate District 1 with ease, explore our companion heritage guides:</w:t>
+      </w:r>
+      <w:r>
+        <w:rPr>
+          <w:rFonts w:ascii="Calibri" w:hAnsi="Calibri"/>
+          <w:color w:val="1E293B"/>
+          <w:sz w:val="21"/>
+        </w:rPr>
+      </w:r>
+      <w:r>
+        <w:rPr>
+          <w:rFonts w:ascii="Calibri" w:hAnsi="Calibri"/>
+          <w:color w:val="1E293B"/>
+          <w:sz w:val="21"/>
+        </w:rPr>
+        <w:br/>
+        <w:t xml:space="preserve">- </w:t>
+      </w:r>
+      <w:r>
+        <w:rPr>
+          <w:rFonts w:ascii="Calibri" w:hAnsi="Calibri"/>
+          <w:b/>
+          <w:color w:val="1E293B"/>
+          <w:sz w:val="21"/>
+        </w:rPr>
+        <w:t>Money Exchange at Ha Tam Gold Shop:</w:t>
+      </w:r>
+      <w:r>
+        <w:rPr>
+          <w:rFonts w:ascii="Calibri" w:hAnsi="Calibri"/>
+          <w:color w:val="1E293B"/>
+          <w:sz w:val="21"/>
+        </w:rPr>
+        <w:t xml:space="preserve"> securing local cash at the licensed </w:t>
+      </w:r>
+      <w:r>
+        <w:rPr>
+          <w:rFonts w:ascii="Calibri" w:hAnsi="Calibri"/>
+          <w:color w:val="1E293B"/>
+          <w:sz w:val="21"/>
+        </w:rPr>
+        <w:t>money exchange near Ben Thanh Market</w:t>
+      </w:r>
+      <w:r>
+        <w:rPr>
+          <w:rFonts w:ascii="Calibri" w:hAnsi="Calibri"/>
+          <w:color w:val="1E293B"/>
+          <w:sz w:val="21"/>
+        </w:rPr>
+        <w:t>.</w:t>
+      </w:r>
+      <w:r>
+        <w:rPr>
+          <w:rFonts w:ascii="Calibri" w:hAnsi="Calibri"/>
+          <w:color w:val="1E293B"/>
+          <w:sz w:val="21"/>
+        </w:rPr>
+      </w:r>
+      <w:r>
+        <w:rPr>
+          <w:rFonts w:ascii="Calibri" w:hAnsi="Calibri"/>
+          <w:color w:val="1E293B"/>
+          <w:sz w:val="21"/>
+        </w:rPr>
+        <w:br/>
+        <w:t xml:space="preserve">- </w:t>
+      </w:r>
+      <w:r>
+        <w:rPr>
+          <w:rFonts w:ascii="Calibri" w:hAnsi="Calibri"/>
+          <w:b/>
+          <w:color w:val="1E293B"/>
+          <w:sz w:val="21"/>
+        </w:rPr>
+        <w:t>Ben Thanh Market Scams &amp; Safety Guide:</w:t>
+      </w:r>
+      <w:r>
+        <w:rPr>
+          <w:rFonts w:ascii="Calibri" w:hAnsi="Calibri"/>
+          <w:color w:val="1E293B"/>
+          <w:sz w:val="21"/>
+        </w:rPr>
+        <w:t xml:space="preserve"> avoiding bargaining traps with our </w:t>
+      </w:r>
+      <w:r>
+        <w:rPr>
+          <w:rFonts w:ascii="Calibri" w:hAnsi="Calibri"/>
+          <w:color w:val="1E293B"/>
+          <w:sz w:val="21"/>
+        </w:rPr>
+        <w:t>Ben Thanh Market scams and safety guide</w:t>
+      </w:r>
+      <w:r>
+        <w:rPr>
+          <w:rFonts w:ascii="Calibri" w:hAnsi="Calibri"/>
+          <w:color w:val="1E293B"/>
+          <w:sz w:val="21"/>
+        </w:rPr>
+        <w:t>.</w:t>
+      </w:r>
+      <w:r>
+        <w:rPr>
+          <w:rFonts w:ascii="Calibri" w:hAnsi="Calibri"/>
+          <w:color w:val="1E293B"/>
+          <w:sz w:val="21"/>
+        </w:rPr>
+      </w:r>
+      <w:r>
+        <w:rPr>
+          <w:rFonts w:ascii="Calibri" w:hAnsi="Calibri"/>
+          <w:color w:val="1E293B"/>
+          <w:sz w:val="21"/>
+        </w:rPr>
+        <w:br/>
+        <w:t xml:space="preserve">- </w:t>
+      </w:r>
+      <w:r>
+        <w:rPr>
+          <w:rFonts w:ascii="Calibri" w:hAnsi="Calibri"/>
+          <w:b/>
+          <w:color w:val="1E293B"/>
+          <w:sz w:val="21"/>
+        </w:rPr>
+        <w:t>Things to Do in Ben Thanh Market:</w:t>
+      </w:r>
+      <w:r>
+        <w:rPr>
+          <w:rFonts w:ascii="Calibri" w:hAnsi="Calibri"/>
+          <w:color w:val="1E293B"/>
+          <w:sz w:val="21"/>
+        </w:rPr>
+        <w:t xml:space="preserve"> navigating the 4 gates with our </w:t>
+      </w:r>
+      <w:r>
+        <w:rPr>
+          <w:rFonts w:ascii="Calibri" w:hAnsi="Calibri"/>
+          <w:color w:val="1E293B"/>
+          <w:sz w:val="21"/>
+        </w:rPr>
+        <w:t>things to do in Ben Thanh Market</w:t>
+      </w:r>
+      <w:r>
+        <w:rPr>
+          <w:rFonts w:ascii="Calibri" w:hAnsi="Calibri"/>
+          <w:color w:val="1E293B"/>
+          <w:sz w:val="21"/>
+        </w:rPr>
+        <w:t xml:space="preserve"> guide.</w:t>
+      </w:r>
+      <w:r>
+        <w:rPr>
+          <w:rFonts w:ascii="Calibri" w:hAnsi="Calibri"/>
+          <w:color w:val="1E293B"/>
+          <w:sz w:val="21"/>
+        </w:rPr>
+      </w:r>
+      <w:r>
+        <w:rPr>
+          <w:rFonts w:ascii="Calibri" w:hAnsi="Calibri"/>
+          <w:color w:val="1E293B"/>
+          <w:sz w:val="21"/>
+        </w:rPr>
+        <w:br/>
+        <w:t xml:space="preserve">- </w:t>
+      </w:r>
+      <w:r>
+        <w:rPr>
+          <w:rFonts w:ascii="Calibri" w:hAnsi="Calibri"/>
+          <w:b/>
+          <w:color w:val="1E293B"/>
+          <w:sz w:val="21"/>
+        </w:rPr>
+        <w:t>Ben Thanh Market Ultimate Travel Guide:</w:t>
+      </w:r>
+      <w:r>
+        <w:rPr>
+          <w:rFonts w:ascii="Calibri" w:hAnsi="Calibri"/>
+          <w:color w:val="1E293B"/>
+          <w:sz w:val="21"/>
+        </w:rPr>
+        <w:t xml:space="preserve"> checking opening hours in our </w:t>
+      </w:r>
+      <w:r>
+        <w:rPr>
+          <w:rFonts w:ascii="Calibri" w:hAnsi="Calibri"/>
+          <w:color w:val="1E293B"/>
+          <w:sz w:val="21"/>
+        </w:rPr>
+        <w:t>Ben Thanh Market ultimate travel guide</w:t>
+      </w:r>
+      <w:r>
+        <w:rPr>
+          <w:rFonts w:ascii="Calibri" w:hAnsi="Calibri"/>
+          <w:color w:val="1E293B"/>
+          <w:sz w:val="21"/>
+        </w:rPr>
+        <w:t>.</w:t>
+      </w:r>
+    </w:p>
+    <w:p>
+      <w:pPr>
+        <w:spacing w:before="320" w:after="120" w:line="276" w:lineRule="auto"/>
+      </w:pPr>
+      <w:r>
+        <w:t>Epilogue: Carrying Home the Warmth of Southern Hospitality</w:t>
+      </w:r>
+      <w:r>
+        <w:rPr>
+          <w:rFonts w:ascii="Calibri" w:hAnsi="Calibri"/>
+          <w:b/>
+          <w:color w:val="1B365D"/>
+          <w:sz w:val="32"/>
+        </w:rPr>
         <w:t>Epilogue: Carrying Home the Warmth of Southern Hospitality</w:t>
       </w:r>
     </w:p>
@@ -8668,7 +10088,23 @@
           <w:color w:val="1E293B"/>
           <w:sz w:val="21"/>
         </w:rPr>
-        <w:t>Following the unified 2026 opening of the Ben Thanh Central Metro Station and the revitalized Quach Thi Trang Plaza, the double-decker bus service has become an indispensable scenic artery, harmoniously linking Saigon's protected colonial heritage with its 21st-century architectural renaissance.</w:t>
+        <w:t xml:space="preserve">Following the unified 2026 opening of the </w:t>
+      </w:r>
+      <w:r>
+        <w:rPr>
+          <w:rFonts w:ascii="Calibri" w:hAnsi="Calibri"/>
+          <w:color w:val="1E293B"/>
+          <w:sz w:val="21"/>
+        </w:rPr>
+        <w:t>Ben Thanh Central Metro Station</w:t>
+      </w:r>
+      <w:r>
+        <w:rPr>
+          <w:rFonts w:ascii="Calibri" w:hAnsi="Calibri"/>
+          <w:color w:val="1E293B"/>
+          <w:sz w:val="21"/>
+        </w:rPr>
+        <w:t xml:space="preserve"> and the revitalized Quach Thi Trang Plaza, the double-decker bus service has become an indispensable scenic artery, harmoniously linking Saigon's protected colonial heritage with its 21st-century architectural renaissance.</w:t>
       </w:r>
     </w:p>
     <w:p>
@@ -9173,10 +10609,18 @@
       <w:r>
         <w:rPr>
           <w:rFonts w:ascii="Calibri" w:hAnsi="Calibri"/>
-          <w:color w:val="1E293B"/>
-          <w:sz w:val="20"/>
-        </w:rPr>
-        <w:t>Independence Palace (Reunification Hall)</w:t>
+          <w:color w:val="D97706"/>
+          <w:sz w:val="20"/>
+        </w:rPr>
+        <w:t>Independence Palace</w:t>
+      </w:r>
+      <w:r>
+        <w:rPr>
+          <w:rFonts w:ascii="Calibri" w:hAnsi="Calibri"/>
+          <w:color w:val="1E293B"/>
+          <w:sz w:val="20"/>
+        </w:rPr>
+        <w:t xml:space="preserve"> (Reunification Hall)</w:t>
       </w:r>
     </w:p>
     <w:p>
@@ -10020,10 +11464,25 @@
     </w:p>
     <w:p>
       <w:pPr>
+        <w:spacing w:before="120" w:after="120"/>
+        <w:jc w:val="center"/>
+      </w:pPr>
+      <w:r>
+        <w:t>―――――――――――――――――――――――――――――――――――――――――――――</w:t>
+      </w:r>
+      <w:r>
+        <w:rPr>
+          <w:color w:val="CBD5E1"/>
+        </w:rPr>
+        <w:t>―――――――――――――――――――――――――――――――――――――――――――――</w:t>
+      </w:r>
+    </w:p>
+    <w:p>
+      <w:pPr>
         <w:spacing w:before="320" w:after="120" w:line="276" w:lineRule="auto"/>
       </w:pPr>
       <w:r>
-        <w:t>Epilogue: The Urban Rhythm from Above</w:t>
+        <w:t>🗺️ Curated Cluster Connections</w:t>
       </w:r>
       <w:r>
         <w:rPr>
@@ -10032,6 +11491,192 @@
           <w:color w:val="1B365D"/>
           <w:sz w:val="32"/>
         </w:rPr>
+        <w:t>🗺️ Curated Cluster Connections</w:t>
+      </w:r>
+    </w:p>
+    <w:p>
+      <w:pPr>
+        <w:spacing w:before="40" w:after="120" w:line="276" w:lineRule="auto"/>
+      </w:pPr>
+      <w:r>
+        <w:t>To help you navigate District 1 with ease, explore our companion heritage guides:</w:t>
+        <w:br/>
+        <w:t>- Things to Do Near Ben Thanh Market: exploring the main landmarks in our guide to things to do near Ben Thanh Market.</w:t>
+        <w:br/>
+        <w:t>- One-Day Ben Thanh Walking Tour: contrasting the open-top ride with our on-foot one-day Ben Thanh walking tour.</w:t>
+        <w:br/>
+        <w:t>- Private Ho Chi Minh City Tour: choosing a fully guided private Ho Chi Minh City tour for deeper history.</w:t>
+      </w:r>
+      <w:r>
+        <w:rPr>
+          <w:rFonts w:ascii="Calibri" w:hAnsi="Calibri"/>
+          <w:color w:val="1E293B"/>
+          <w:sz w:val="21"/>
+        </w:rPr>
+        <w:t>To help you navigate District 1 with ease, explore our companion heritage guides:</w:t>
+      </w:r>
+      <w:r>
+        <w:rPr>
+          <w:rFonts w:ascii="Calibri" w:hAnsi="Calibri"/>
+          <w:color w:val="1E293B"/>
+          <w:sz w:val="21"/>
+        </w:rPr>
+      </w:r>
+      <w:r>
+        <w:rPr>
+          <w:rFonts w:ascii="Calibri" w:hAnsi="Calibri"/>
+          <w:color w:val="1E293B"/>
+          <w:sz w:val="21"/>
+        </w:rPr>
+        <w:br/>
+        <w:t xml:space="preserve">- </w:t>
+      </w:r>
+      <w:r>
+        <w:rPr>
+          <w:rFonts w:ascii="Calibri" w:hAnsi="Calibri"/>
+          <w:b/>
+          <w:color w:val="1E293B"/>
+          <w:sz w:val="21"/>
+        </w:rPr>
+        <w:t>Things to Do Near Ben Thanh Market:</w:t>
+      </w:r>
+      <w:r>
+        <w:rPr>
+          <w:rFonts w:ascii="Calibri" w:hAnsi="Calibri"/>
+          <w:color w:val="1E293B"/>
+          <w:sz w:val="21"/>
+        </w:rPr>
+        <w:t xml:space="preserve"> exploring the main landmarks in our guide to </w:t>
+      </w:r>
+      <w:r>
+        <w:rPr>
+          <w:rFonts w:ascii="Calibri" w:hAnsi="Calibri"/>
+          <w:color w:val="1E293B"/>
+          <w:sz w:val="21"/>
+        </w:rPr>
+        <w:t>things to do near Ben Thanh Market</w:t>
+      </w:r>
+      <w:r>
+        <w:rPr>
+          <w:rFonts w:ascii="Calibri" w:hAnsi="Calibri"/>
+          <w:color w:val="1E293B"/>
+          <w:sz w:val="21"/>
+        </w:rPr>
+        <w:t>.</w:t>
+      </w:r>
+      <w:r>
+        <w:rPr>
+          <w:rFonts w:ascii="Calibri" w:hAnsi="Calibri"/>
+          <w:color w:val="1E293B"/>
+          <w:sz w:val="21"/>
+        </w:rPr>
+      </w:r>
+      <w:r>
+        <w:rPr>
+          <w:rFonts w:ascii="Calibri" w:hAnsi="Calibri"/>
+          <w:color w:val="1E293B"/>
+          <w:sz w:val="21"/>
+        </w:rPr>
+        <w:br/>
+        <w:t xml:space="preserve">- </w:t>
+      </w:r>
+      <w:r>
+        <w:rPr>
+          <w:rFonts w:ascii="Calibri" w:hAnsi="Calibri"/>
+          <w:b/>
+          <w:color w:val="1E293B"/>
+          <w:sz w:val="21"/>
+        </w:rPr>
+        <w:t>One-Day Ben Thanh Walking Tour:</w:t>
+      </w:r>
+      <w:r>
+        <w:rPr>
+          <w:rFonts w:ascii="Calibri" w:hAnsi="Calibri"/>
+          <w:color w:val="1E293B"/>
+          <w:sz w:val="21"/>
+        </w:rPr>
+        <w:t xml:space="preserve"> contrasting the open-top ride with our on-foot </w:t>
+      </w:r>
+      <w:r>
+        <w:rPr>
+          <w:rFonts w:ascii="Calibri" w:hAnsi="Calibri"/>
+          <w:color w:val="1E293B"/>
+          <w:sz w:val="21"/>
+        </w:rPr>
+        <w:t>one-day Ben Thanh walking tour</w:t>
+      </w:r>
+      <w:r>
+        <w:rPr>
+          <w:rFonts w:ascii="Calibri" w:hAnsi="Calibri"/>
+          <w:color w:val="1E293B"/>
+          <w:sz w:val="21"/>
+        </w:rPr>
+        <w:t>.</w:t>
+      </w:r>
+      <w:r>
+        <w:rPr>
+          <w:rFonts w:ascii="Calibri" w:hAnsi="Calibri"/>
+          <w:color w:val="1E293B"/>
+          <w:sz w:val="21"/>
+        </w:rPr>
+      </w:r>
+      <w:r>
+        <w:rPr>
+          <w:rFonts w:ascii="Calibri" w:hAnsi="Calibri"/>
+          <w:color w:val="1E293B"/>
+          <w:sz w:val="21"/>
+        </w:rPr>
+        <w:br/>
+        <w:t xml:space="preserve">- </w:t>
+      </w:r>
+      <w:r>
+        <w:rPr>
+          <w:rFonts w:ascii="Calibri" w:hAnsi="Calibri"/>
+          <w:b/>
+          <w:color w:val="1E293B"/>
+          <w:sz w:val="21"/>
+        </w:rPr>
+        <w:t>Private Ho Chi Minh City Tour:</w:t>
+      </w:r>
+      <w:r>
+        <w:rPr>
+          <w:rFonts w:ascii="Calibri" w:hAnsi="Calibri"/>
+          <w:color w:val="1E293B"/>
+          <w:sz w:val="21"/>
+        </w:rPr>
+        <w:t xml:space="preserve"> choosing a fully guided </w:t>
+      </w:r>
+      <w:r>
+        <w:rPr>
+          <w:rFonts w:ascii="Calibri" w:hAnsi="Calibri"/>
+          <w:color w:val="1E293B"/>
+          <w:sz w:val="21"/>
+        </w:rPr>
+        <w:t>private Ho Chi Minh City tour</w:t>
+      </w:r>
+      <w:r>
+        <w:rPr>
+          <w:rFonts w:ascii="Calibri" w:hAnsi="Calibri"/>
+          <w:color w:val="1E293B"/>
+          <w:sz w:val="21"/>
+        </w:rPr>
+        <w:t xml:space="preserve"> for deeper history.</w:t>
+      </w:r>
+    </w:p>
+    <w:p>
+      <w:pPr>
+        <w:spacing w:before="320" w:after="120" w:line="276" w:lineRule="auto"/>
+      </w:pPr>
+      <w:r>
+        <w:t>Epilogue: The Urban Rhythm from Above</w:t>
+      </w:r>
+      <w:r>
+        <w:rPr>
+          <w:rFonts w:ascii="Calibri" w:hAnsi="Calibri"/>
+          <w:b/>
+          <w:color w:val="1B365D"/>
+          <w:sz w:val="32"/>
+        </w:rPr>
         <w:t>Epilogue: The Urban Rhythm from Above</w:t>
       </w:r>
     </w:p>
@@ -11090,10 +12735,25 @@
     </w:p>
     <w:p>
       <w:pPr>
+        <w:spacing w:before="120" w:after="120"/>
+        <w:jc w:val="center"/>
+      </w:pPr>
+      <w:r>
+        <w:t>―――――――――――――――――――――――――――――――――――――――――――――</w:t>
+      </w:r>
+      <w:r>
+        <w:rPr>
+          <w:color w:val="CBD5E1"/>
+        </w:rPr>
+        <w:t>―――――――――――――――――――――――――――――――――――――――――――――</w:t>
+      </w:r>
+    </w:p>
+    <w:p>
+      <w:pPr>
         <w:spacing w:before="320" w:after="120" w:line="276" w:lineRule="auto"/>
       </w:pPr>
       <w:r>
-        <w:t>Epilogue: The Timeless Pause</w:t>
+        <w:t>🗺️ Curated Cluster Connections</w:t>
       </w:r>
       <w:r>
         <w:rPr>
@@ -11102,6 +12762,294 @@
           <w:color w:val="1B365D"/>
           <w:sz w:val="32"/>
         </w:rPr>
+        <w:t>🗺️ Curated Cluster Connections</w:t>
+      </w:r>
+    </w:p>
+    <w:p>
+      <w:pPr>
+        <w:spacing w:before="40" w:after="120" w:line="276" w:lineRule="auto"/>
+      </w:pPr>
+      <w:r>
+        <w:t>To help you navigate District 1 with ease, explore our companion heritage guides:</w:t>
+        <w:br/>
+        <w:t>- Things to Do Near Ben Thanh Market: nestled in the vibrant heart of things to do near Ben Thanh Market.</w:t>
+        <w:br/>
+        <w:t>- HCMC Museum of Fine Arts: just steps away from the HCMC Museum of Fine Arts.</w:t>
+        <w:br/>
+        <w:t>- Best Rooftop Bars Near Ben Thanh: switching to evening cocktails at the best rooftop bars near Ben Thanh.</w:t>
+        <w:br/>
+        <w:t>- One-Day Ben Thanh Walking Tour: pausing for drip coffee during our one-day Ben Thanh walking tour.</w:t>
+        <w:br/>
+        <w:t>- Parking Guide Near Ben Thanh Market: finding secure parking lots with our parking guide near Ben Thanh Market.</w:t>
+      </w:r>
+      <w:r>
+        <w:rPr>
+          <w:rFonts w:ascii="Calibri" w:hAnsi="Calibri"/>
+          <w:color w:val="1E293B"/>
+          <w:sz w:val="21"/>
+        </w:rPr>
+        <w:t>To help you navigate District 1 with ease, explore our companion heritage guides:</w:t>
+      </w:r>
+      <w:r>
+        <w:rPr>
+          <w:rFonts w:ascii="Calibri" w:hAnsi="Calibri"/>
+          <w:color w:val="1E293B"/>
+          <w:sz w:val="21"/>
+        </w:rPr>
+      </w:r>
+      <w:r>
+        <w:rPr>
+          <w:rFonts w:ascii="Calibri" w:hAnsi="Calibri"/>
+          <w:color w:val="1E293B"/>
+          <w:sz w:val="21"/>
+        </w:rPr>
+        <w:br/>
+        <w:t xml:space="preserve">- </w:t>
+      </w:r>
+      <w:r>
+        <w:rPr>
+          <w:rFonts w:ascii="Calibri" w:hAnsi="Calibri"/>
+          <w:b/>
+          <w:color w:val="1E293B"/>
+          <w:sz w:val="21"/>
+        </w:rPr>
+        <w:t>Things to Do Near Ben Thanh Market:</w:t>
+      </w:r>
+      <w:r>
+        <w:rPr>
+          <w:rFonts w:ascii="Calibri" w:hAnsi="Calibri"/>
+          <w:color w:val="1E293B"/>
+          <w:sz w:val="21"/>
+        </w:rPr>
+        <w:t xml:space="preserve"> nestled in the vibrant heart of </w:t>
+      </w:r>
+      <w:r>
+        <w:rPr>
+          <w:rFonts w:ascii="Calibri" w:hAnsi="Calibri"/>
+          <w:color w:val="1E293B"/>
+          <w:sz w:val="21"/>
+        </w:rPr>
+        <w:t>things to do near Ben Thanh Market</w:t>
+      </w:r>
+      <w:r>
+        <w:rPr>
+          <w:rFonts w:ascii="Calibri" w:hAnsi="Calibri"/>
+          <w:color w:val="1E293B"/>
+          <w:sz w:val="21"/>
+        </w:rPr>
+        <w:t>.</w:t>
+      </w:r>
+      <w:r>
+        <w:rPr>
+          <w:rFonts w:ascii="Calibri" w:hAnsi="Calibri"/>
+          <w:color w:val="1E293B"/>
+          <w:sz w:val="21"/>
+        </w:rPr>
+      </w:r>
+      <w:r>
+        <w:rPr>
+          <w:rFonts w:ascii="Calibri" w:hAnsi="Calibri"/>
+          <w:color w:val="1E293B"/>
+          <w:sz w:val="21"/>
+        </w:rPr>
+        <w:br/>
+        <w:t xml:space="preserve">- </w:t>
+      </w:r>
+      <w:r>
+        <w:rPr>
+          <w:rFonts w:ascii="Calibri" w:hAnsi="Calibri"/>
+          <w:b/>
+          <w:color w:val="1E293B"/>
+          <w:sz w:val="21"/>
+        </w:rPr>
+        <w:t>HCMC Museum of Fine Arts:</w:t>
+      </w:r>
+      <w:r>
+        <w:rPr>
+          <w:rFonts w:ascii="Calibri" w:hAnsi="Calibri"/>
+          <w:color w:val="1E293B"/>
+          <w:sz w:val="21"/>
+        </w:rPr>
+        <w:t xml:space="preserve"> just steps away from the </w:t>
+      </w:r>
+      <w:r>
+        <w:rPr>
+          <w:rFonts w:ascii="Calibri" w:hAnsi="Calibri"/>
+          <w:color w:val="1E293B"/>
+          <w:sz w:val="21"/>
+        </w:rPr>
+        <w:t>HCMC Museum of Fine Arts</w:t>
+      </w:r>
+      <w:r>
+        <w:rPr>
+          <w:rFonts w:ascii="Calibri" w:hAnsi="Calibri"/>
+          <w:color w:val="1E293B"/>
+          <w:sz w:val="21"/>
+        </w:rPr>
+        <w:t>.</w:t>
+      </w:r>
+      <w:r>
+        <w:rPr>
+          <w:rFonts w:ascii="Calibri" w:hAnsi="Calibri"/>
+          <w:color w:val="1E293B"/>
+          <w:sz w:val="21"/>
+        </w:rPr>
+      </w:r>
+      <w:r>
+        <w:rPr>
+          <w:rFonts w:ascii="Calibri" w:hAnsi="Calibri"/>
+          <w:color w:val="1E293B"/>
+          <w:sz w:val="21"/>
+        </w:rPr>
+        <w:br/>
+        <w:t xml:space="preserve">- </w:t>
+      </w:r>
+      <w:r>
+        <w:rPr>
+          <w:rFonts w:ascii="Calibri" w:hAnsi="Calibri"/>
+          <w:b/>
+          <w:color w:val="1E293B"/>
+          <w:sz w:val="21"/>
+        </w:rPr>
+        <w:t>Best Rooftop Bars Near Ben Thanh:</w:t>
+      </w:r>
+      <w:r>
+        <w:rPr>
+          <w:rFonts w:ascii="Calibri" w:hAnsi="Calibri"/>
+          <w:color w:val="1E293B"/>
+          <w:sz w:val="21"/>
+        </w:rPr>
+        <w:t xml:space="preserve"> switching to evening cocktails at the </w:t>
+      </w:r>
+      <w:r>
+        <w:rPr>
+          <w:rFonts w:ascii="Calibri" w:hAnsi="Calibri"/>
+          <w:color w:val="1E293B"/>
+          <w:sz w:val="21"/>
+        </w:rPr>
+        <w:t>best rooftop bars near Ben Thanh</w:t>
+      </w:r>
+      <w:r>
+        <w:rPr>
+          <w:rFonts w:ascii="Calibri" w:hAnsi="Calibri"/>
+          <w:color w:val="1E293B"/>
+          <w:sz w:val="21"/>
+        </w:rPr>
+        <w:t>.</w:t>
+      </w:r>
+      <w:r>
+        <w:rPr>
+          <w:rFonts w:ascii="Calibri" w:hAnsi="Calibri"/>
+          <w:color w:val="1E293B"/>
+          <w:sz w:val="21"/>
+        </w:rPr>
+      </w:r>
+      <w:r>
+        <w:rPr>
+          <w:rFonts w:ascii="Calibri" w:hAnsi="Calibri"/>
+          <w:color w:val="1E293B"/>
+          <w:sz w:val="21"/>
+        </w:rPr>
+        <w:br/>
+        <w:t xml:space="preserve">- </w:t>
+      </w:r>
+      <w:r>
+        <w:rPr>
+          <w:rFonts w:ascii="Calibri" w:hAnsi="Calibri"/>
+          <w:b/>
+          <w:color w:val="1E293B"/>
+          <w:sz w:val="21"/>
+        </w:rPr>
+        <w:t>One-Day Ben Thanh Walking Tour:</w:t>
+      </w:r>
+      <w:r>
+        <w:rPr>
+          <w:rFonts w:ascii="Calibri" w:hAnsi="Calibri"/>
+          <w:color w:val="1E293B"/>
+          <w:sz w:val="21"/>
+        </w:rPr>
+        <w:t xml:space="preserve"> pausing for drip coffee during our </w:t>
+      </w:r>
+      <w:r>
+        <w:rPr>
+          <w:rFonts w:ascii="Calibri" w:hAnsi="Calibri"/>
+          <w:color w:val="1E293B"/>
+          <w:sz w:val="21"/>
+        </w:rPr>
+        <w:t>one-day Ben Thanh walking tour</w:t>
+      </w:r>
+      <w:r>
+        <w:rPr>
+          <w:rFonts w:ascii="Calibri" w:hAnsi="Calibri"/>
+          <w:color w:val="1E293B"/>
+          <w:sz w:val="21"/>
+        </w:rPr>
+        <w:t>.</w:t>
+      </w:r>
+      <w:r>
+        <w:rPr>
+          <w:rFonts w:ascii="Calibri" w:hAnsi="Calibri"/>
+          <w:color w:val="1E293B"/>
+          <w:sz w:val="21"/>
+        </w:rPr>
+      </w:r>
+      <w:r>
+        <w:rPr>
+          <w:rFonts w:ascii="Calibri" w:hAnsi="Calibri"/>
+          <w:color w:val="1E293B"/>
+          <w:sz w:val="21"/>
+        </w:rPr>
+        <w:br/>
+        <w:t xml:space="preserve">- </w:t>
+      </w:r>
+      <w:r>
+        <w:rPr>
+          <w:rFonts w:ascii="Calibri" w:hAnsi="Calibri"/>
+          <w:b/>
+          <w:color w:val="1E293B"/>
+          <w:sz w:val="21"/>
+        </w:rPr>
+        <w:t>Parking Guide Near Ben Thanh Market:</w:t>
+      </w:r>
+      <w:r>
+        <w:rPr>
+          <w:rFonts w:ascii="Calibri" w:hAnsi="Calibri"/>
+          <w:color w:val="1E293B"/>
+          <w:sz w:val="21"/>
+        </w:rPr>
+        <w:t xml:space="preserve"> finding secure parking lots with our </w:t>
+      </w:r>
+      <w:r>
+        <w:rPr>
+          <w:rFonts w:ascii="Calibri" w:hAnsi="Calibri"/>
+          <w:color w:val="1E293B"/>
+          <w:sz w:val="21"/>
+        </w:rPr>
+        <w:t>parking guide near Ben Thanh Market</w:t>
+      </w:r>
+      <w:r>
+        <w:rPr>
+          <w:rFonts w:ascii="Calibri" w:hAnsi="Calibri"/>
+          <w:color w:val="1E293B"/>
+          <w:sz w:val="21"/>
+        </w:rPr>
+        <w:t>.</w:t>
+      </w:r>
+    </w:p>
+    <w:p>
+      <w:pPr>
+        <w:spacing w:before="320" w:after="120" w:line="276" w:lineRule="auto"/>
+      </w:pPr>
+      <w:r>
+        <w:t>Epilogue: The Timeless Pause</w:t>
+      </w:r>
+      <w:r>
+        <w:rPr>
+          <w:rFonts w:ascii="Calibri" w:hAnsi="Calibri"/>
+          <w:b/>
+          <w:color w:val="1B365D"/>
+          <w:sz w:val="32"/>
+        </w:rPr>
         <w:t>Epilogue: The Timeless Pause</w:t>
       </w:r>
     </w:p>
@@ -12227,10 +14175,25 @@
     </w:p>
     <w:p>
       <w:pPr>
+        <w:spacing w:before="120" w:after="120"/>
+        <w:jc w:val="center"/>
+      </w:pPr>
+      <w:r>
+        <w:t>―――――――――――――――――――――――――――――――――――――――――――――</w:t>
+      </w:r>
+      <w:r>
+        <w:rPr>
+          <w:color w:val="CBD5E1"/>
+        </w:rPr>
+        <w:t>―――――――――――――――――――――――――――――――――――――――――――――</w:t>
+      </w:r>
+    </w:p>
+    <w:p>
+      <w:pPr>
         <w:spacing w:before="320" w:after="120" w:line="276" w:lineRule="auto"/>
       </w:pPr>
       <w:r>
-        <w:t>Epilogue: Toasting the Eternal Metropolis</w:t>
+        <w:t>🗺️ Curated Cluster Connections</w:t>
       </w:r>
       <w:r>
         <w:rPr>
@@ -12239,6 +14202,294 @@
           <w:color w:val="1B365D"/>
           <w:sz w:val="32"/>
         </w:rPr>
+        <w:t>🗺️ Curated Cluster Connections</w:t>
+      </w:r>
+    </w:p>
+    <w:p>
+      <w:pPr>
+        <w:spacing w:before="40" w:after="120" w:line="276" w:lineRule="auto"/>
+      </w:pPr>
+      <w:r>
+        <w:t>To help you navigate District 1 with ease, explore our companion heritage guides:</w:t>
+        <w:br/>
+        <w:t>- Things to Do Near Ben Thanh Market: overlooking the historic district detailed in things to do near Ben Thanh Market.</w:t>
+        <w:br/>
+        <w:t>- Ben Thanh Market Food Guide: dining at local stalls with our Ben Thanh Market food guide before evening drinks.</w:t>
+        <w:br/>
+        <w:t>- Secret Apartment Cafes: spending a quiet afternoon in secret apartment cafes near Ben Thanh.</w:t>
+        <w:br/>
+        <w:t>- Boutique Hotels Near Ben Thanh: staying nearby at properties featured in our boutique hotels near Ben Thanh guide.</w:t>
+        <w:br/>
+        <w:t>- Tan Son Nhat Airport Transfer Guide: heading to late-night flights with our Tan Son Nhat airport to Ben Thanh transfer guide.</w:t>
+      </w:r>
+      <w:r>
+        <w:rPr>
+          <w:rFonts w:ascii="Calibri" w:hAnsi="Calibri"/>
+          <w:color w:val="1E293B"/>
+          <w:sz w:val="21"/>
+        </w:rPr>
+        <w:t>To help you navigate District 1 with ease, explore our companion heritage guides:</w:t>
+      </w:r>
+      <w:r>
+        <w:rPr>
+          <w:rFonts w:ascii="Calibri" w:hAnsi="Calibri"/>
+          <w:color w:val="1E293B"/>
+          <w:sz w:val="21"/>
+        </w:rPr>
+      </w:r>
+      <w:r>
+        <w:rPr>
+          <w:rFonts w:ascii="Calibri" w:hAnsi="Calibri"/>
+          <w:color w:val="1E293B"/>
+          <w:sz w:val="21"/>
+        </w:rPr>
+        <w:br/>
+        <w:t xml:space="preserve">- </w:t>
+      </w:r>
+      <w:r>
+        <w:rPr>
+          <w:rFonts w:ascii="Calibri" w:hAnsi="Calibri"/>
+          <w:b/>
+          <w:color w:val="1E293B"/>
+          <w:sz w:val="21"/>
+        </w:rPr>
+        <w:t>Things to Do Near Ben Thanh Market:</w:t>
+      </w:r>
+      <w:r>
+        <w:rPr>
+          <w:rFonts w:ascii="Calibri" w:hAnsi="Calibri"/>
+          <w:color w:val="1E293B"/>
+          <w:sz w:val="21"/>
+        </w:rPr>
+        <w:t xml:space="preserve"> overlooking the historic district detailed in </w:t>
+      </w:r>
+      <w:r>
+        <w:rPr>
+          <w:rFonts w:ascii="Calibri" w:hAnsi="Calibri"/>
+          <w:color w:val="1E293B"/>
+          <w:sz w:val="21"/>
+        </w:rPr>
+        <w:t>things to do near Ben Thanh Market</w:t>
+      </w:r>
+      <w:r>
+        <w:rPr>
+          <w:rFonts w:ascii="Calibri" w:hAnsi="Calibri"/>
+          <w:color w:val="1E293B"/>
+          <w:sz w:val="21"/>
+        </w:rPr>
+        <w:t>.</w:t>
+      </w:r>
+      <w:r>
+        <w:rPr>
+          <w:rFonts w:ascii="Calibri" w:hAnsi="Calibri"/>
+          <w:color w:val="1E293B"/>
+          <w:sz w:val="21"/>
+        </w:rPr>
+      </w:r>
+      <w:r>
+        <w:rPr>
+          <w:rFonts w:ascii="Calibri" w:hAnsi="Calibri"/>
+          <w:color w:val="1E293B"/>
+          <w:sz w:val="21"/>
+        </w:rPr>
+        <w:br/>
+        <w:t xml:space="preserve">- </w:t>
+      </w:r>
+      <w:r>
+        <w:rPr>
+          <w:rFonts w:ascii="Calibri" w:hAnsi="Calibri"/>
+          <w:b/>
+          <w:color w:val="1E293B"/>
+          <w:sz w:val="21"/>
+        </w:rPr>
+        <w:t>Ben Thanh Market Food Guide:</w:t>
+      </w:r>
+      <w:r>
+        <w:rPr>
+          <w:rFonts w:ascii="Calibri" w:hAnsi="Calibri"/>
+          <w:color w:val="1E293B"/>
+          <w:sz w:val="21"/>
+        </w:rPr>
+        <w:t xml:space="preserve"> dining at local stalls with our </w:t>
+      </w:r>
+      <w:r>
+        <w:rPr>
+          <w:rFonts w:ascii="Calibri" w:hAnsi="Calibri"/>
+          <w:color w:val="1E293B"/>
+          <w:sz w:val="21"/>
+        </w:rPr>
+        <w:t>Ben Thanh Market food guide</w:t>
+      </w:r>
+      <w:r>
+        <w:rPr>
+          <w:rFonts w:ascii="Calibri" w:hAnsi="Calibri"/>
+          <w:color w:val="1E293B"/>
+          <w:sz w:val="21"/>
+        </w:rPr>
+        <w:t xml:space="preserve"> before evening drinks.</w:t>
+      </w:r>
+      <w:r>
+        <w:rPr>
+          <w:rFonts w:ascii="Calibri" w:hAnsi="Calibri"/>
+          <w:color w:val="1E293B"/>
+          <w:sz w:val="21"/>
+        </w:rPr>
+      </w:r>
+      <w:r>
+        <w:rPr>
+          <w:rFonts w:ascii="Calibri" w:hAnsi="Calibri"/>
+          <w:color w:val="1E293B"/>
+          <w:sz w:val="21"/>
+        </w:rPr>
+        <w:br/>
+        <w:t xml:space="preserve">- </w:t>
+      </w:r>
+      <w:r>
+        <w:rPr>
+          <w:rFonts w:ascii="Calibri" w:hAnsi="Calibri"/>
+          <w:b/>
+          <w:color w:val="1E293B"/>
+          <w:sz w:val="21"/>
+        </w:rPr>
+        <w:t>Secret Apartment Cafes:</w:t>
+      </w:r>
+      <w:r>
+        <w:rPr>
+          <w:rFonts w:ascii="Calibri" w:hAnsi="Calibri"/>
+          <w:color w:val="1E293B"/>
+          <w:sz w:val="21"/>
+        </w:rPr>
+        <w:t xml:space="preserve"> spending a quiet afternoon in </w:t>
+      </w:r>
+      <w:r>
+        <w:rPr>
+          <w:rFonts w:ascii="Calibri" w:hAnsi="Calibri"/>
+          <w:color w:val="1E293B"/>
+          <w:sz w:val="21"/>
+        </w:rPr>
+        <w:t>secret apartment cafes near Ben Thanh</w:t>
+      </w:r>
+      <w:r>
+        <w:rPr>
+          <w:rFonts w:ascii="Calibri" w:hAnsi="Calibri"/>
+          <w:color w:val="1E293B"/>
+          <w:sz w:val="21"/>
+        </w:rPr>
+        <w:t>.</w:t>
+      </w:r>
+      <w:r>
+        <w:rPr>
+          <w:rFonts w:ascii="Calibri" w:hAnsi="Calibri"/>
+          <w:color w:val="1E293B"/>
+          <w:sz w:val="21"/>
+        </w:rPr>
+      </w:r>
+      <w:r>
+        <w:rPr>
+          <w:rFonts w:ascii="Calibri" w:hAnsi="Calibri"/>
+          <w:color w:val="1E293B"/>
+          <w:sz w:val="21"/>
+        </w:rPr>
+        <w:br/>
+        <w:t xml:space="preserve">- </w:t>
+      </w:r>
+      <w:r>
+        <w:rPr>
+          <w:rFonts w:ascii="Calibri" w:hAnsi="Calibri"/>
+          <w:b/>
+          <w:color w:val="1E293B"/>
+          <w:sz w:val="21"/>
+        </w:rPr>
+        <w:t>Boutique Hotels Near Ben Thanh:</w:t>
+      </w:r>
+      <w:r>
+        <w:rPr>
+          <w:rFonts w:ascii="Calibri" w:hAnsi="Calibri"/>
+          <w:color w:val="1E293B"/>
+          <w:sz w:val="21"/>
+        </w:rPr>
+        <w:t xml:space="preserve"> staying nearby at properties featured in our </w:t>
+      </w:r>
+      <w:r>
+        <w:rPr>
+          <w:rFonts w:ascii="Calibri" w:hAnsi="Calibri"/>
+          <w:color w:val="1E293B"/>
+          <w:sz w:val="21"/>
+        </w:rPr>
+        <w:t>boutique hotels near Ben Thanh</w:t>
+      </w:r>
+      <w:r>
+        <w:rPr>
+          <w:rFonts w:ascii="Calibri" w:hAnsi="Calibri"/>
+          <w:color w:val="1E293B"/>
+          <w:sz w:val="21"/>
+        </w:rPr>
+        <w:t xml:space="preserve"> guide.</w:t>
+      </w:r>
+      <w:r>
+        <w:rPr>
+          <w:rFonts w:ascii="Calibri" w:hAnsi="Calibri"/>
+          <w:color w:val="1E293B"/>
+          <w:sz w:val="21"/>
+        </w:rPr>
+      </w:r>
+      <w:r>
+        <w:rPr>
+          <w:rFonts w:ascii="Calibri" w:hAnsi="Calibri"/>
+          <w:color w:val="1E293B"/>
+          <w:sz w:val="21"/>
+        </w:rPr>
+        <w:br/>
+        <w:t xml:space="preserve">- </w:t>
+      </w:r>
+      <w:r>
+        <w:rPr>
+          <w:rFonts w:ascii="Calibri" w:hAnsi="Calibri"/>
+          <w:b/>
+          <w:color w:val="1E293B"/>
+          <w:sz w:val="21"/>
+        </w:rPr>
+        <w:t>Tan Son Nhat Airport Transfer Guide:</w:t>
+      </w:r>
+      <w:r>
+        <w:rPr>
+          <w:rFonts w:ascii="Calibri" w:hAnsi="Calibri"/>
+          <w:color w:val="1E293B"/>
+          <w:sz w:val="21"/>
+        </w:rPr>
+        <w:t xml:space="preserve"> heading to late-night flights with our </w:t>
+      </w:r>
+      <w:r>
+        <w:rPr>
+          <w:rFonts w:ascii="Calibri" w:hAnsi="Calibri"/>
+          <w:color w:val="1E293B"/>
+          <w:sz w:val="21"/>
+        </w:rPr>
+        <w:t>Tan Son Nhat airport to Ben Thanh transfer guide</w:t>
+      </w:r>
+      <w:r>
+        <w:rPr>
+          <w:rFonts w:ascii="Calibri" w:hAnsi="Calibri"/>
+          <w:color w:val="1E293B"/>
+          <w:sz w:val="21"/>
+        </w:rPr>
+        <w:t>.</w:t>
+      </w:r>
+    </w:p>
+    <w:p>
+      <w:pPr>
+        <w:spacing w:before="320" w:after="120" w:line="276" w:lineRule="auto"/>
+      </w:pPr>
+      <w:r>
+        <w:t>Epilogue: Toasting the Eternal Metropolis</w:t>
+      </w:r>
+      <w:r>
+        <w:rPr>
+          <w:rFonts w:ascii="Calibri" w:hAnsi="Calibri"/>
+          <w:b/>
+          <w:color w:val="1B365D"/>
+          <w:sz w:val="32"/>
+        </w:rPr>
         <w:t>Epilogue: Toasting the Eternal Metropolis</w:t>
       </w:r>
     </w:p>
@@ -13437,10 +15688,25 @@
     </w:p>
     <w:p>
       <w:pPr>
+        <w:spacing w:before="120" w:after="120"/>
+        <w:jc w:val="center"/>
+      </w:pPr>
+      <w:r>
+        <w:t>―――――――――――――――――――――――――――――――――――――――――――――</w:t>
+      </w:r>
+      <w:r>
+        <w:rPr>
+          <w:color w:val="CBD5E1"/>
+        </w:rPr>
+        <w:t>―――――――――――――――――――――――――――――――――――――――――――――</w:t>
+      </w:r>
+    </w:p>
+    <w:p>
+      <w:pPr>
         <w:spacing w:before="320" w:after="120" w:line="276" w:lineRule="auto"/>
       </w:pPr>
       <w:r>
-        <w:t>Epilogue: Awakening to Saigon’s Living Grace</w:t>
+        <w:t>🗺️ Curated Cluster Connections</w:t>
       </w:r>
       <w:r>
         <w:rPr>
@@ -13449,6 +15715,294 @@
           <w:color w:val="1B365D"/>
           <w:sz w:val="32"/>
         </w:rPr>
+        <w:t>🗺️ Curated Cluster Connections</w:t>
+      </w:r>
+    </w:p>
+    <w:p>
+      <w:pPr>
+        <w:spacing w:before="40" w:after="120" w:line="276" w:lineRule="auto"/>
+      </w:pPr>
+      <w:r>
+        <w:t>To help you navigate District 1 with ease, explore our companion heritage guides:</w:t>
+        <w:br/>
+        <w:t>- Things to Do in Ben Thanh Market: stepping out from your room into the vibrant things to do in Ben Thanh Market.</w:t>
+        <w:br/>
+        <w:t>- Tan Son Nhat Airport Transfer Guide: organizing your arrival using our Tan Son Nhat airport to Ben Thanh transfer guide.</w:t>
+        <w:br/>
+        <w:t>- One-Day Ben Thanh Walking Tour: commencing our curated one-day Ben Thanh walking tour directly from your lobby.</w:t>
+        <w:br/>
+        <w:t>- Best Rooftop Bars Near Ben Thanh: enjoying sunset vistas at the best rooftop bars near Ben Thanh.</w:t>
+        <w:br/>
+        <w:t>- Tailor-Made Vietnam Journeys: requesting VIP concierge travel with our tailor-made journey service.</w:t>
+      </w:r>
+      <w:r>
+        <w:rPr>
+          <w:rFonts w:ascii="Calibri" w:hAnsi="Calibri"/>
+          <w:color w:val="1E293B"/>
+          <w:sz w:val="21"/>
+        </w:rPr>
+        <w:t>To help you navigate District 1 with ease, explore our companion heritage guides:</w:t>
+      </w:r>
+      <w:r>
+        <w:rPr>
+          <w:rFonts w:ascii="Calibri" w:hAnsi="Calibri"/>
+          <w:color w:val="1E293B"/>
+          <w:sz w:val="21"/>
+        </w:rPr>
+      </w:r>
+      <w:r>
+        <w:rPr>
+          <w:rFonts w:ascii="Calibri" w:hAnsi="Calibri"/>
+          <w:color w:val="1E293B"/>
+          <w:sz w:val="21"/>
+        </w:rPr>
+        <w:br/>
+        <w:t xml:space="preserve">- </w:t>
+      </w:r>
+      <w:r>
+        <w:rPr>
+          <w:rFonts w:ascii="Calibri" w:hAnsi="Calibri"/>
+          <w:b/>
+          <w:color w:val="1E293B"/>
+          <w:sz w:val="21"/>
+        </w:rPr>
+        <w:t>Things to Do in Ben Thanh Market:</w:t>
+      </w:r>
+      <w:r>
+        <w:rPr>
+          <w:rFonts w:ascii="Calibri" w:hAnsi="Calibri"/>
+          <w:color w:val="1E293B"/>
+          <w:sz w:val="21"/>
+        </w:rPr>
+        <w:t xml:space="preserve"> stepping out from your room into the vibrant </w:t>
+      </w:r>
+      <w:r>
+        <w:rPr>
+          <w:rFonts w:ascii="Calibri" w:hAnsi="Calibri"/>
+          <w:color w:val="1E293B"/>
+          <w:sz w:val="21"/>
+        </w:rPr>
+        <w:t>things to do in Ben Thanh Market</w:t>
+      </w:r>
+      <w:r>
+        <w:rPr>
+          <w:rFonts w:ascii="Calibri" w:hAnsi="Calibri"/>
+          <w:color w:val="1E293B"/>
+          <w:sz w:val="21"/>
+        </w:rPr>
+        <w:t>.</w:t>
+      </w:r>
+      <w:r>
+        <w:rPr>
+          <w:rFonts w:ascii="Calibri" w:hAnsi="Calibri"/>
+          <w:color w:val="1E293B"/>
+          <w:sz w:val="21"/>
+        </w:rPr>
+      </w:r>
+      <w:r>
+        <w:rPr>
+          <w:rFonts w:ascii="Calibri" w:hAnsi="Calibri"/>
+          <w:color w:val="1E293B"/>
+          <w:sz w:val="21"/>
+        </w:rPr>
+        <w:br/>
+        <w:t xml:space="preserve">- </w:t>
+      </w:r>
+      <w:r>
+        <w:rPr>
+          <w:rFonts w:ascii="Calibri" w:hAnsi="Calibri"/>
+          <w:b/>
+          <w:color w:val="1E293B"/>
+          <w:sz w:val="21"/>
+        </w:rPr>
+        <w:t>Tan Son Nhat Airport Transfer Guide:</w:t>
+      </w:r>
+      <w:r>
+        <w:rPr>
+          <w:rFonts w:ascii="Calibri" w:hAnsi="Calibri"/>
+          <w:color w:val="1E293B"/>
+          <w:sz w:val="21"/>
+        </w:rPr>
+        <w:t xml:space="preserve"> organizing your arrival using our </w:t>
+      </w:r>
+      <w:r>
+        <w:rPr>
+          <w:rFonts w:ascii="Calibri" w:hAnsi="Calibri"/>
+          <w:color w:val="1E293B"/>
+          <w:sz w:val="21"/>
+        </w:rPr>
+        <w:t>Tan Son Nhat airport to Ben Thanh transfer guide</w:t>
+      </w:r>
+      <w:r>
+        <w:rPr>
+          <w:rFonts w:ascii="Calibri" w:hAnsi="Calibri"/>
+          <w:color w:val="1E293B"/>
+          <w:sz w:val="21"/>
+        </w:rPr>
+        <w:t>.</w:t>
+      </w:r>
+      <w:r>
+        <w:rPr>
+          <w:rFonts w:ascii="Calibri" w:hAnsi="Calibri"/>
+          <w:color w:val="1E293B"/>
+          <w:sz w:val="21"/>
+        </w:rPr>
+      </w:r>
+      <w:r>
+        <w:rPr>
+          <w:rFonts w:ascii="Calibri" w:hAnsi="Calibri"/>
+          <w:color w:val="1E293B"/>
+          <w:sz w:val="21"/>
+        </w:rPr>
+        <w:br/>
+        <w:t xml:space="preserve">- </w:t>
+      </w:r>
+      <w:r>
+        <w:rPr>
+          <w:rFonts w:ascii="Calibri" w:hAnsi="Calibri"/>
+          <w:b/>
+          <w:color w:val="1E293B"/>
+          <w:sz w:val="21"/>
+        </w:rPr>
+        <w:t>One-Day Ben Thanh Walking Tour:</w:t>
+      </w:r>
+      <w:r>
+        <w:rPr>
+          <w:rFonts w:ascii="Calibri" w:hAnsi="Calibri"/>
+          <w:color w:val="1E293B"/>
+          <w:sz w:val="21"/>
+        </w:rPr>
+        <w:t xml:space="preserve"> commencing our curated </w:t>
+      </w:r>
+      <w:r>
+        <w:rPr>
+          <w:rFonts w:ascii="Calibri" w:hAnsi="Calibri"/>
+          <w:color w:val="1E293B"/>
+          <w:sz w:val="21"/>
+        </w:rPr>
+        <w:t>one-day Ben Thanh walking tour</w:t>
+      </w:r>
+      <w:r>
+        <w:rPr>
+          <w:rFonts w:ascii="Calibri" w:hAnsi="Calibri"/>
+          <w:color w:val="1E293B"/>
+          <w:sz w:val="21"/>
+        </w:rPr>
+        <w:t xml:space="preserve"> directly from your lobby.</w:t>
+      </w:r>
+      <w:r>
+        <w:rPr>
+          <w:rFonts w:ascii="Calibri" w:hAnsi="Calibri"/>
+          <w:color w:val="1E293B"/>
+          <w:sz w:val="21"/>
+        </w:rPr>
+      </w:r>
+      <w:r>
+        <w:rPr>
+          <w:rFonts w:ascii="Calibri" w:hAnsi="Calibri"/>
+          <w:color w:val="1E293B"/>
+          <w:sz w:val="21"/>
+        </w:rPr>
+        <w:br/>
+        <w:t xml:space="preserve">- </w:t>
+      </w:r>
+      <w:r>
+        <w:rPr>
+          <w:rFonts w:ascii="Calibri" w:hAnsi="Calibri"/>
+          <w:b/>
+          <w:color w:val="1E293B"/>
+          <w:sz w:val="21"/>
+        </w:rPr>
+        <w:t>Best Rooftop Bars Near Ben Thanh:</w:t>
+      </w:r>
+      <w:r>
+        <w:rPr>
+          <w:rFonts w:ascii="Calibri" w:hAnsi="Calibri"/>
+          <w:color w:val="1E293B"/>
+          <w:sz w:val="21"/>
+        </w:rPr>
+        <w:t xml:space="preserve"> enjoying sunset vistas at the </w:t>
+      </w:r>
+      <w:r>
+        <w:rPr>
+          <w:rFonts w:ascii="Calibri" w:hAnsi="Calibri"/>
+          <w:color w:val="1E293B"/>
+          <w:sz w:val="21"/>
+        </w:rPr>
+        <w:t>best rooftop bars near Ben Thanh</w:t>
+      </w:r>
+      <w:r>
+        <w:rPr>
+          <w:rFonts w:ascii="Calibri" w:hAnsi="Calibri"/>
+          <w:color w:val="1E293B"/>
+          <w:sz w:val="21"/>
+        </w:rPr>
+        <w:t>.</w:t>
+      </w:r>
+      <w:r>
+        <w:rPr>
+          <w:rFonts w:ascii="Calibri" w:hAnsi="Calibri"/>
+          <w:color w:val="1E293B"/>
+          <w:sz w:val="21"/>
+        </w:rPr>
+      </w:r>
+      <w:r>
+        <w:rPr>
+          <w:rFonts w:ascii="Calibri" w:hAnsi="Calibri"/>
+          <w:color w:val="1E293B"/>
+          <w:sz w:val="21"/>
+        </w:rPr>
+        <w:br/>
+        <w:t xml:space="preserve">- </w:t>
+      </w:r>
+      <w:r>
+        <w:rPr>
+          <w:rFonts w:ascii="Calibri" w:hAnsi="Calibri"/>
+          <w:b/>
+          <w:color w:val="1E293B"/>
+          <w:sz w:val="21"/>
+        </w:rPr>
+        <w:t>Tailor-Made Vietnam Journeys:</w:t>
+      </w:r>
+      <w:r>
+        <w:rPr>
+          <w:rFonts w:ascii="Calibri" w:hAnsi="Calibri"/>
+          <w:color w:val="1E293B"/>
+          <w:sz w:val="21"/>
+        </w:rPr>
+        <w:t xml:space="preserve"> requesting VIP concierge travel with our </w:t>
+      </w:r>
+      <w:r>
+        <w:rPr>
+          <w:rFonts w:ascii="Calibri" w:hAnsi="Calibri"/>
+          <w:color w:val="1E293B"/>
+          <w:sz w:val="21"/>
+        </w:rPr>
+        <w:t>tailor-made journey service</w:t>
+      </w:r>
+      <w:r>
+        <w:rPr>
+          <w:rFonts w:ascii="Calibri" w:hAnsi="Calibri"/>
+          <w:color w:val="1E293B"/>
+          <w:sz w:val="21"/>
+        </w:rPr>
+        <w:t>.</w:t>
+      </w:r>
+    </w:p>
+    <w:p>
+      <w:pPr>
+        <w:spacing w:before="320" w:after="120" w:line="276" w:lineRule="auto"/>
+      </w:pPr>
+      <w:r>
+        <w:t>Epilogue: Awakening to Saigon’s Living Grace</w:t>
+      </w:r>
+      <w:r>
+        <w:rPr>
+          <w:rFonts w:ascii="Calibri" w:hAnsi="Calibri"/>
+          <w:b/>
+          <w:color w:val="1B365D"/>
+          <w:sz w:val="32"/>
+        </w:rPr>
         <w:t>Epilogue: Awakening to Saigon’s Living Grace</w:t>
       </w:r>
     </w:p>
@@ -14541,6 +17095,258 @@
       </w:r>
     </w:p>
     <w:p>
+      <w:pPr>
+        <w:spacing w:before="120" w:after="120"/>
+        <w:jc w:val="center"/>
+      </w:pPr>
+      <w:r>
+        <w:t>―――――――――――――――――――――――――――――――――――――――――――――</w:t>
+      </w:r>
+      <w:r>
+        <w:rPr>
+          <w:color w:val="CBD5E1"/>
+        </w:rPr>
+        <w:t>―――――――――――――――――――――――――――――――――――――――――――――</w:t>
+      </w:r>
+    </w:p>
+    <w:p>
+      <w:pPr>
+        <w:spacing w:before="320" w:after="120" w:line="276" w:lineRule="auto"/>
+      </w:pPr>
+      <w:r>
+        <w:t>🗺️ Curated Cluster Connections</w:t>
+      </w:r>
+      <w:r>
+        <w:rPr>
+          <w:rFonts w:ascii="Calibri" w:hAnsi="Calibri"/>
+          <w:b/>
+          <w:color w:val="1B365D"/>
+          <w:sz w:val="32"/>
+        </w:rPr>
+        <w:t>🗺️ Curated Cluster Connections</w:t>
+      </w:r>
+    </w:p>
+    <w:p>
+      <w:pPr>
+        <w:spacing w:before="40" w:after="120" w:line="276" w:lineRule="auto"/>
+      </w:pPr>
+      <w:r>
+        <w:t>To help you navigate District 1 with ease, explore our companion heritage guides:</w:t>
+        <w:br/>
+        <w:t>- Ben Thanh Market Food Guide: feasting on regional delicacies with our Ben Thanh Market food guide.</w:t>
+        <w:br/>
+        <w:t>- Ben Thanh Market Shopping Guide: shopping smart with tips from our Ben Thanh Market shopping guide.</w:t>
+        <w:br/>
+        <w:t>- Ben Thanh Market Scams &amp; Safety Guide: avoiding tourist traps with our Ben Thanh Market scams and safety guide.</w:t>
+        <w:br/>
+        <w:t>- Things to Do Near Ben Thanh Market: venturing out to neighboring sights in things to do near Ben Thanh Market.</w:t>
+      </w:r>
+      <w:r>
+        <w:rPr>
+          <w:rFonts w:ascii="Calibri" w:hAnsi="Calibri"/>
+          <w:color w:val="1E293B"/>
+          <w:sz w:val="21"/>
+        </w:rPr>
+        <w:t>To help you navigate District 1 with ease, explore our companion heritage guides:</w:t>
+      </w:r>
+      <w:r>
+        <w:rPr>
+          <w:rFonts w:ascii="Calibri" w:hAnsi="Calibri"/>
+          <w:color w:val="1E293B"/>
+          <w:sz w:val="21"/>
+        </w:rPr>
+      </w:r>
+      <w:r>
+        <w:rPr>
+          <w:rFonts w:ascii="Calibri" w:hAnsi="Calibri"/>
+          <w:color w:val="1E293B"/>
+          <w:sz w:val="21"/>
+        </w:rPr>
+        <w:br/>
+        <w:t xml:space="preserve">- </w:t>
+      </w:r>
+      <w:r>
+        <w:rPr>
+          <w:rFonts w:ascii="Calibri" w:hAnsi="Calibri"/>
+          <w:b/>
+          <w:color w:val="1E293B"/>
+          <w:sz w:val="21"/>
+        </w:rPr>
+        <w:t>Ben Thanh Market Food Guide:</w:t>
+      </w:r>
+      <w:r>
+        <w:rPr>
+          <w:rFonts w:ascii="Calibri" w:hAnsi="Calibri"/>
+          <w:color w:val="1E293B"/>
+          <w:sz w:val="21"/>
+        </w:rPr>
+        <w:t xml:space="preserve"> feasting on regional delicacies with our </w:t>
+      </w:r>
+      <w:r>
+        <w:rPr>
+          <w:rFonts w:ascii="Calibri" w:hAnsi="Calibri"/>
+          <w:color w:val="1E293B"/>
+          <w:sz w:val="21"/>
+        </w:rPr>
+        <w:t>Ben Thanh Market food guide</w:t>
+      </w:r>
+      <w:r>
+        <w:rPr>
+          <w:rFonts w:ascii="Calibri" w:hAnsi="Calibri"/>
+          <w:color w:val="1E293B"/>
+          <w:sz w:val="21"/>
+        </w:rPr>
+        <w:t>.</w:t>
+      </w:r>
+      <w:r>
+        <w:rPr>
+          <w:rFonts w:ascii="Calibri" w:hAnsi="Calibri"/>
+          <w:color w:val="1E293B"/>
+          <w:sz w:val="21"/>
+        </w:rPr>
+      </w:r>
+      <w:r>
+        <w:rPr>
+          <w:rFonts w:ascii="Calibri" w:hAnsi="Calibri"/>
+          <w:color w:val="1E293B"/>
+          <w:sz w:val="21"/>
+        </w:rPr>
+        <w:br/>
+        <w:t xml:space="preserve">- </w:t>
+      </w:r>
+      <w:r>
+        <w:rPr>
+          <w:rFonts w:ascii="Calibri" w:hAnsi="Calibri"/>
+          <w:b/>
+          <w:color w:val="1E293B"/>
+          <w:sz w:val="21"/>
+        </w:rPr>
+        <w:t>Ben Thanh Market Shopping Guide:</w:t>
+      </w:r>
+      <w:r>
+        <w:rPr>
+          <w:rFonts w:ascii="Calibri" w:hAnsi="Calibri"/>
+          <w:color w:val="1E293B"/>
+          <w:sz w:val="21"/>
+        </w:rPr>
+        <w:t xml:space="preserve"> shopping smart with tips from our </w:t>
+      </w:r>
+      <w:r>
+        <w:rPr>
+          <w:rFonts w:ascii="Calibri" w:hAnsi="Calibri"/>
+          <w:color w:val="1E293B"/>
+          <w:sz w:val="21"/>
+        </w:rPr>
+        <w:t>Ben Thanh Market shopping guide</w:t>
+      </w:r>
+      <w:r>
+        <w:rPr>
+          <w:rFonts w:ascii="Calibri" w:hAnsi="Calibri"/>
+          <w:color w:val="1E293B"/>
+          <w:sz w:val="21"/>
+        </w:rPr>
+        <w:t>.</w:t>
+      </w:r>
+      <w:r>
+        <w:rPr>
+          <w:rFonts w:ascii="Calibri" w:hAnsi="Calibri"/>
+          <w:color w:val="1E293B"/>
+          <w:sz w:val="21"/>
+        </w:rPr>
+      </w:r>
+      <w:r>
+        <w:rPr>
+          <w:rFonts w:ascii="Calibri" w:hAnsi="Calibri"/>
+          <w:color w:val="1E293B"/>
+          <w:sz w:val="21"/>
+        </w:rPr>
+        <w:br/>
+        <w:t xml:space="preserve">- </w:t>
+      </w:r>
+      <w:r>
+        <w:rPr>
+          <w:rFonts w:ascii="Calibri" w:hAnsi="Calibri"/>
+          <w:b/>
+          <w:color w:val="1E293B"/>
+          <w:sz w:val="21"/>
+        </w:rPr>
+        <w:t>Ben Thanh Market Scams &amp; Safety Guide:</w:t>
+      </w:r>
+      <w:r>
+        <w:rPr>
+          <w:rFonts w:ascii="Calibri" w:hAnsi="Calibri"/>
+          <w:color w:val="1E293B"/>
+          <w:sz w:val="21"/>
+        </w:rPr>
+        <w:t xml:space="preserve"> avoiding tourist traps with our </w:t>
+      </w:r>
+      <w:r>
+        <w:rPr>
+          <w:rFonts w:ascii="Calibri" w:hAnsi="Calibri"/>
+          <w:color w:val="1E293B"/>
+          <w:sz w:val="21"/>
+        </w:rPr>
+        <w:t>Ben Thanh Market scams and safety guide</w:t>
+      </w:r>
+      <w:r>
+        <w:rPr>
+          <w:rFonts w:ascii="Calibri" w:hAnsi="Calibri"/>
+          <w:color w:val="1E293B"/>
+          <w:sz w:val="21"/>
+        </w:rPr>
+        <w:t>.</w:t>
+      </w:r>
+      <w:r>
+        <w:rPr>
+          <w:rFonts w:ascii="Calibri" w:hAnsi="Calibri"/>
+          <w:color w:val="1E293B"/>
+          <w:sz w:val="21"/>
+        </w:rPr>
+      </w:r>
+      <w:r>
+        <w:rPr>
+          <w:rFonts w:ascii="Calibri" w:hAnsi="Calibri"/>
+          <w:color w:val="1E293B"/>
+          <w:sz w:val="21"/>
+        </w:rPr>
+        <w:br/>
+        <w:t xml:space="preserve">- </w:t>
+      </w:r>
+      <w:r>
+        <w:rPr>
+          <w:rFonts w:ascii="Calibri" w:hAnsi="Calibri"/>
+          <w:b/>
+          <w:color w:val="1E293B"/>
+          <w:sz w:val="21"/>
+        </w:rPr>
+        <w:t>Things to Do Near Ben Thanh Market:</w:t>
+      </w:r>
+      <w:r>
+        <w:rPr>
+          <w:rFonts w:ascii="Calibri" w:hAnsi="Calibri"/>
+          <w:color w:val="1E293B"/>
+          <w:sz w:val="21"/>
+        </w:rPr>
+        <w:t xml:space="preserve"> venturing out to neighboring sights in </w:t>
+      </w:r>
+      <w:r>
+        <w:rPr>
+          <w:rFonts w:ascii="Calibri" w:hAnsi="Calibri"/>
+          <w:color w:val="1E293B"/>
+          <w:sz w:val="21"/>
+        </w:rPr>
+        <w:t>things to do near Ben Thanh Market</w:t>
+      </w:r>
+      <w:r>
+        <w:rPr>
+          <w:rFonts w:ascii="Calibri" w:hAnsi="Calibri"/>
+          <w:color w:val="1E293B"/>
+          <w:sz w:val="21"/>
+        </w:rPr>
+        <w:t>.</w:t>
+      </w:r>
+    </w:p>
+    <w:p>
       <w:r>
         <w:br w:type="page"/>
       </w:r>
@@ -15669,6 +18475,81 @@
       </w:r>
     </w:p>
     <w:p>
+      <w:pPr>
+        <w:spacing w:before="120" w:after="120"/>
+        <w:jc w:val="center"/>
+      </w:pPr>
+      <w:r>
+        <w:t>―――――――――――――――――――――――――――――――――――――――――――――</w:t>
+      </w:r>
+      <w:r>
+        <w:rPr>
+          <w:color w:val="CBD5E1"/>
+        </w:rPr>
+        <w:t>―――――――――――――――――――――――――――――――――――――――――――――</w:t>
+      </w:r>
+    </w:p>
+    <w:p>
+      <w:pPr>
+        <w:spacing w:before="320" w:after="120" w:line="276" w:lineRule="auto"/>
+      </w:pPr>
+      <w:r>
+        <w:t>🗺️ Curated Cluster Connections</w:t>
+      </w:r>
+      <w:r>
+        <w:rPr>
+          <w:rFonts w:ascii="Calibri" w:hAnsi="Calibri"/>
+          <w:b/>
+          <w:color w:val="1B365D"/>
+          <w:sz w:val="32"/>
+        </w:rPr>
+        <w:t>🗺️ Curated Cluster Connections</w:t>
+      </w:r>
+    </w:p>
+    <w:p>
+      <w:pPr>
+        <w:spacing w:before="40" w:after="120" w:line="276" w:lineRule="auto"/>
+      </w:pPr>
+      <w:r>
+        <w:t>To help you navigate District 1 with ease, explore our companion heritage guides:</w:t>
+        <w:br/>
+        <w:t>- Things to Do in Ben Thanh Market: discovering the full directory of things to do in Ben Thanh Market.</w:t>
+        <w:br/>
+        <w:t>- Tan Son Nhat Airport Transfer Guide: traveling from the airport via our Tan Son Nhat airport to Ben Thanh transfer guide.</w:t>
+        <w:br/>
+        <w:t>- Parking Guide Near Ben Thanh Market: locating verified lots with our parking guide near Ben Thanh Market.</w:t>
+        <w:br/>
+        <w:t>- Money Exchange at Ha Tam Gold Shop: converting foreign notes safely at the money exchange near Ben Thanh Market.</w:t>
+        <w:br/>
+        <w:t>- Ben Thanh Market Scams &amp; Safety Guide: keeping consumer safety top of mind with our Ben Thanh Market scams and safety guide.</w:t>
+      </w:r>
+      <w:r>
+        <w:rPr>
+          <w:rFonts w:ascii="Calibri" w:hAnsi="Calibri"/>
+          <w:color w:val="1E293B"/>
+          <w:sz w:val="21"/>
+        </w:rPr>
+        <w:t>To help you navigate District 1 with ease, explore our companion heritage guides:</w:t>
+      </w:r>
+      <w:r>
+        <w:rPr>
+          <w:rFonts w:ascii="Calibri" w:hAnsi="Calibri"/>
+          <w:color w:val="1E293B"/>
+          <w:sz w:val="21"/>
+        </w:rPr>
+        <w:br/>
+        <w:t>- Things to Do in Ben Thanh Market: discovering the full directory of things to do in Ben Thanh Market.</w:t>
+        <w:br/>
+        <w:t>- Tan Son Nhat Airport Transfer Guide: traveling from the airport via our Tan Son Nhat airport to Ben Thanh transfer guide.</w:t>
+        <w:br/>
+        <w:t>- Parking Guide Near Ben Thanh Market: locating verified lots with our parking guide near Ben Thanh Market.</w:t>
+        <w:br/>
+        <w:t>- Money Exchange at Ha Tam Gold Shop: converting foreign notes safely at the money exchange near Ben Thanh Market.</w:t>
+        <w:br/>
+        <w:t>- Ben Thanh Market Scams &amp; Safety Guide: keeping consumer safety top of mind with our Ben Thanh Market scams and safety guide.</w:t>
+      </w:r>
+    </w:p>
+    <w:p>
       <w:r>
         <w:br w:type="page"/>
       </w:r>
@@ -16964,6 +19845,309 @@
       </w:r>
     </w:p>
     <w:p>
+      <w:pPr>
+        <w:spacing w:before="120" w:after="120"/>
+        <w:jc w:val="center"/>
+      </w:pPr>
+      <w:r>
+        <w:t>―――――――――――――――――――――――――――――――――――――――――――――</w:t>
+      </w:r>
+      <w:r>
+        <w:rPr>
+          <w:color w:val="CBD5E1"/>
+        </w:rPr>
+        <w:t>―――――――――――――――――――――――――――――――――――――――――――――</w:t>
+      </w:r>
+    </w:p>
+    <w:p>
+      <w:pPr>
+        <w:spacing w:before="320" w:after="120" w:line="276" w:lineRule="auto"/>
+      </w:pPr>
+      <w:r>
+        <w:t>🗺️ Curated Cluster Connections</w:t>
+      </w:r>
+      <w:r>
+        <w:rPr>
+          <w:rFonts w:ascii="Calibri" w:hAnsi="Calibri"/>
+          <w:b/>
+          <w:color w:val="1B365D"/>
+          <w:sz w:val="32"/>
+        </w:rPr>
+        <w:t>🗺️ Curated Cluster Connections</w:t>
+      </w:r>
+    </w:p>
+    <w:p>
+      <w:pPr>
+        <w:spacing w:before="40" w:after="120" w:line="276" w:lineRule="auto"/>
+      </w:pPr>
+      <w:r>
+        <w:t>To help you navigate District 1 with ease, explore our companion heritage guides:</w:t>
+        <w:br/>
+        <w:t>- Ben Thanh Market Shopping Guide: negotiating fair prices with our Ben Thanh Market shopping guide.</w:t>
+        <w:br/>
+        <w:t>- Money Exchange at Ha Tam Gold Shop: avoiding street money traps by using the money exchange near Ben Thanh Market.</w:t>
+        <w:br/>
+        <w:t>- Tan Son Nhat Airport Transfer Guide: preventing taxi overcharging through our Tan Son Nhat airport to Ben Thanh transfer guide.</w:t>
+        <w:br/>
+        <w:t>- Ben Thanh Market Ultimate Travel Guide: verifying market rules in our Ben Thanh Market ultimate travel guide.</w:t>
+        <w:br/>
+        <w:t>- Ben Thanh Market Food Guide: eating safely at stalls highlighted in our Ben Thanh Market food guide.</w:t>
+      </w:r>
+      <w:r>
+        <w:rPr>
+          <w:rFonts w:ascii="Calibri" w:hAnsi="Calibri"/>
+          <w:color w:val="1E293B"/>
+          <w:sz w:val="21"/>
+        </w:rPr>
+        <w:t>To help you navigate District 1 with ease, explore our companion heritage guides:</w:t>
+      </w:r>
+      <w:r>
+        <w:rPr>
+          <w:rFonts w:ascii="Calibri" w:hAnsi="Calibri"/>
+          <w:color w:val="1E293B"/>
+          <w:sz w:val="21"/>
+        </w:rPr>
+      </w:r>
+      <w:r>
+        <w:rPr>
+          <w:rFonts w:ascii="Calibri" w:hAnsi="Calibri"/>
+          <w:color w:val="1E293B"/>
+          <w:sz w:val="21"/>
+        </w:rPr>
+        <w:br/>
+        <w:t xml:space="preserve">- </w:t>
+      </w:r>
+      <w:r>
+        <w:rPr>
+          <w:rFonts w:ascii="Calibri" w:hAnsi="Calibri"/>
+          <w:b/>
+          <w:color w:val="1E293B"/>
+          <w:sz w:val="21"/>
+        </w:rPr>
+        <w:t>Ben Thanh Market Shopping Guide:</w:t>
+      </w:r>
+      <w:r>
+        <w:rPr>
+          <w:rFonts w:ascii="Calibri" w:hAnsi="Calibri"/>
+          <w:color w:val="1E293B"/>
+          <w:sz w:val="21"/>
+        </w:rPr>
+        <w:t xml:space="preserve"> negotiating fair prices with our </w:t>
+      </w:r>
+      <w:r>
+        <w:rPr>
+          <w:rFonts w:ascii="Calibri" w:hAnsi="Calibri"/>
+          <w:color w:val="1E293B"/>
+          <w:sz w:val="21"/>
+        </w:rPr>
+        <w:t>Ben Thanh Market shopping guide</w:t>
+      </w:r>
+      <w:r>
+        <w:rPr>
+          <w:rFonts w:ascii="Calibri" w:hAnsi="Calibri"/>
+          <w:color w:val="1E293B"/>
+          <w:sz w:val="21"/>
+        </w:rPr>
+        <w:t>.</w:t>
+      </w:r>
+      <w:r>
+        <w:rPr>
+          <w:rFonts w:ascii="Calibri" w:hAnsi="Calibri"/>
+          <w:color w:val="1E293B"/>
+          <w:sz w:val="21"/>
+        </w:rPr>
+      </w:r>
+      <w:r>
+        <w:rPr>
+          <w:rFonts w:ascii="Calibri" w:hAnsi="Calibri"/>
+          <w:color w:val="1E293B"/>
+          <w:sz w:val="21"/>
+        </w:rPr>
+        <w:br/>
+        <w:t xml:space="preserve">- </w:t>
+      </w:r>
+      <w:r>
+        <w:rPr>
+          <w:rFonts w:ascii="Calibri" w:hAnsi="Calibri"/>
+          <w:b/>
+          <w:color w:val="1E293B"/>
+          <w:sz w:val="21"/>
+        </w:rPr>
+        <w:t>Money Exchange at Ha Tam Gold Shop:</w:t>
+      </w:r>
+      <w:r>
+        <w:rPr>
+          <w:rFonts w:ascii="Calibri" w:hAnsi="Calibri"/>
+          <w:color w:val="1E293B"/>
+          <w:sz w:val="21"/>
+        </w:rPr>
+        <w:t xml:space="preserve"> avoiding street money traps by using the </w:t>
+      </w:r>
+      <w:r>
+        <w:rPr>
+          <w:rFonts w:ascii="Calibri" w:hAnsi="Calibri"/>
+          <w:color w:val="1E293B"/>
+          <w:sz w:val="21"/>
+        </w:rPr>
+        <w:t>money exchange near Ben Thanh Market</w:t>
+      </w:r>
+      <w:r>
+        <w:rPr>
+          <w:rFonts w:ascii="Calibri" w:hAnsi="Calibri"/>
+          <w:color w:val="1E293B"/>
+          <w:sz w:val="21"/>
+        </w:rPr>
+        <w:t>.</w:t>
+      </w:r>
+      <w:r>
+        <w:rPr>
+          <w:rFonts w:ascii="Calibri" w:hAnsi="Calibri"/>
+          <w:color w:val="1E293B"/>
+          <w:sz w:val="21"/>
+        </w:rPr>
+      </w:r>
+      <w:r>
+        <w:rPr>
+          <w:rFonts w:ascii="Calibri" w:hAnsi="Calibri"/>
+          <w:color w:val="1E293B"/>
+          <w:sz w:val="21"/>
+        </w:rPr>
+        <w:br/>
+        <w:t xml:space="preserve">- </w:t>
+      </w:r>
+      <w:r>
+        <w:rPr>
+          <w:rFonts w:ascii="Calibri" w:hAnsi="Calibri"/>
+          <w:b/>
+          <w:color w:val="1E293B"/>
+          <w:sz w:val="21"/>
+        </w:rPr>
+        <w:t>Tan Son Nhat Airport Transfer Guide:</w:t>
+      </w:r>
+      <w:r>
+        <w:rPr>
+          <w:rFonts w:ascii="Calibri" w:hAnsi="Calibri"/>
+          <w:color w:val="1E293B"/>
+          <w:sz w:val="21"/>
+        </w:rPr>
+        <w:t xml:space="preserve"> preventing taxi overcharging through our </w:t>
+      </w:r>
+      <w:r>
+        <w:rPr>
+          <w:rFonts w:ascii="Calibri" w:hAnsi="Calibri"/>
+          <w:color w:val="1E293B"/>
+          <w:sz w:val="21"/>
+        </w:rPr>
+        <w:t>Tan Son Nhat airport to Ben Thanh transfer guide</w:t>
+      </w:r>
+      <w:r>
+        <w:rPr>
+          <w:rFonts w:ascii="Calibri" w:hAnsi="Calibri"/>
+          <w:color w:val="1E293B"/>
+          <w:sz w:val="21"/>
+        </w:rPr>
+        <w:t>.</w:t>
+      </w:r>
+      <w:r>
+        <w:rPr>
+          <w:rFonts w:ascii="Calibri" w:hAnsi="Calibri"/>
+          <w:color w:val="1E293B"/>
+          <w:sz w:val="21"/>
+        </w:rPr>
+      </w:r>
+      <w:r>
+        <w:rPr>
+          <w:rFonts w:ascii="Calibri" w:hAnsi="Calibri"/>
+          <w:color w:val="1E293B"/>
+          <w:sz w:val="21"/>
+        </w:rPr>
+        <w:br/>
+        <w:t xml:space="preserve">- </w:t>
+      </w:r>
+      <w:r>
+        <w:rPr>
+          <w:rFonts w:ascii="Calibri" w:hAnsi="Calibri"/>
+          <w:b/>
+          <w:color w:val="1E293B"/>
+          <w:sz w:val="21"/>
+        </w:rPr>
+        <w:t>Ben Thanh Market Ultimate Travel Guide:</w:t>
+      </w:r>
+      <w:r>
+        <w:rPr>
+          <w:rFonts w:ascii="Calibri" w:hAnsi="Calibri"/>
+          <w:color w:val="1E293B"/>
+          <w:sz w:val="21"/>
+        </w:rPr>
+        <w:t xml:space="preserve"> verifying market rules in our </w:t>
+      </w:r>
+      <w:r>
+        <w:rPr>
+          <w:rFonts w:ascii="Calibri" w:hAnsi="Calibri"/>
+          <w:color w:val="1E293B"/>
+          <w:sz w:val="21"/>
+        </w:rPr>
+        <w:t>Ben Thanh Market ultimate travel guide</w:t>
+      </w:r>
+      <w:r>
+        <w:rPr>
+          <w:rFonts w:ascii="Calibri" w:hAnsi="Calibri"/>
+          <w:color w:val="1E293B"/>
+          <w:sz w:val="21"/>
+        </w:rPr>
+        <w:t>.</w:t>
+      </w:r>
+      <w:r>
+        <w:rPr>
+          <w:rFonts w:ascii="Calibri" w:hAnsi="Calibri"/>
+          <w:color w:val="1E293B"/>
+          <w:sz w:val="21"/>
+        </w:rPr>
+      </w:r>
+      <w:r>
+        <w:rPr>
+          <w:rFonts w:ascii="Calibri" w:hAnsi="Calibri"/>
+          <w:color w:val="1E293B"/>
+          <w:sz w:val="21"/>
+        </w:rPr>
+        <w:br/>
+        <w:t xml:space="preserve">- </w:t>
+      </w:r>
+      <w:r>
+        <w:rPr>
+          <w:rFonts w:ascii="Calibri" w:hAnsi="Calibri"/>
+          <w:b/>
+          <w:color w:val="1E293B"/>
+          <w:sz w:val="21"/>
+        </w:rPr>
+        <w:t>Ben Thanh Market Food Guide:</w:t>
+      </w:r>
+      <w:r>
+        <w:rPr>
+          <w:rFonts w:ascii="Calibri" w:hAnsi="Calibri"/>
+          <w:color w:val="1E293B"/>
+          <w:sz w:val="21"/>
+        </w:rPr>
+        <w:t xml:space="preserve"> eating safely at stalls highlighted in our </w:t>
+      </w:r>
+      <w:r>
+        <w:rPr>
+          <w:rFonts w:ascii="Calibri" w:hAnsi="Calibri"/>
+          <w:color w:val="1E293B"/>
+          <w:sz w:val="21"/>
+        </w:rPr>
+        <w:t>Ben Thanh Market food guide</w:t>
+      </w:r>
+      <w:r>
+        <w:rPr>
+          <w:rFonts w:ascii="Calibri" w:hAnsi="Calibri"/>
+          <w:color w:val="1E293B"/>
+          <w:sz w:val="21"/>
+        </w:rPr>
+        <w:t>.</w:t>
+      </w:r>
+    </w:p>
+    <w:p>
       <w:r>
         <w:br w:type="page"/>
       </w:r>
@@ -17752,6 +20936,309 @@
           <w:sz w:val="20"/>
         </w:rPr>
         <w:t xml:space="preserve"> Never exit the shop holding visible bundles of cash. Place the money directly into a secure inner zippered jacket pocket or front-facing chest bag, ensure the zip is fastened, and then calmly walk out. For sums exceeding 50,000,000 VND (~$2,000 USD), travel with a companion or summon a ride directly to the storefront.</w:t>
+      </w:r>
+    </w:p>
+    <w:p>
+      <w:pPr>
+        <w:spacing w:before="120" w:after="120"/>
+        <w:jc w:val="center"/>
+      </w:pPr>
+      <w:r>
+        <w:t>―――――――――――――――――――――――――――――――――――――――――――――</w:t>
+      </w:r>
+      <w:r>
+        <w:rPr>
+          <w:color w:val="CBD5E1"/>
+        </w:rPr>
+        <w:t>―――――――――――――――――――――――――――――――――――――――――――――</w:t>
+      </w:r>
+    </w:p>
+    <w:p>
+      <w:pPr>
+        <w:spacing w:before="320" w:after="120" w:line="276" w:lineRule="auto"/>
+      </w:pPr>
+      <w:r>
+        <w:t>🗺️ Curated Cluster Connections</w:t>
+      </w:r>
+      <w:r>
+        <w:rPr>
+          <w:rFonts w:ascii="Calibri" w:hAnsi="Calibri"/>
+          <w:b/>
+          <w:color w:val="1B365D"/>
+          <w:sz w:val="32"/>
+        </w:rPr>
+        <w:t>🗺️ Curated Cluster Connections</w:t>
+      </w:r>
+    </w:p>
+    <w:p>
+      <w:pPr>
+        <w:spacing w:before="40" w:after="120" w:line="276" w:lineRule="auto"/>
+      </w:pPr>
+      <w:r>
+        <w:t>To help you navigate District 1 with ease, explore our companion heritage guides:</w:t>
+        <w:br/>
+        <w:t>- Ben Thanh Market Shopping Guide: spending local currency wisely in our Ben Thanh Market shopping guide.</w:t>
+        <w:br/>
+        <w:t>- Ben Thanh Market Scams &amp; Safety Guide: protecting your wallet with our Ben Thanh Market scams and safety guide.</w:t>
+        <w:br/>
+        <w:t>- Parking Guide Near Ben Thanh Market: finding nearby parking spots in our parking guide near Ben Thanh Market.</w:t>
+        <w:br/>
+        <w:t>- Ben Thanh Market Ultimate Travel Guide: planning your market visit with our Ben Thanh Market ultimate travel guide.</w:t>
+        <w:br/>
+        <w:t>- Tan Son Nhat Airport Transfer Guide: comparing airport vs downtown rates in our Tan Son Nhat airport to Ben Thanh transfer guide.</w:t>
+      </w:r>
+      <w:r>
+        <w:rPr>
+          <w:rFonts w:ascii="Calibri" w:hAnsi="Calibri"/>
+          <w:color w:val="1E293B"/>
+          <w:sz w:val="21"/>
+        </w:rPr>
+        <w:t>To help you navigate District 1 with ease, explore our companion heritage guides:</w:t>
+      </w:r>
+      <w:r>
+        <w:rPr>
+          <w:rFonts w:ascii="Calibri" w:hAnsi="Calibri"/>
+          <w:color w:val="1E293B"/>
+          <w:sz w:val="21"/>
+        </w:rPr>
+      </w:r>
+      <w:r>
+        <w:rPr>
+          <w:rFonts w:ascii="Calibri" w:hAnsi="Calibri"/>
+          <w:color w:val="1E293B"/>
+          <w:sz w:val="21"/>
+        </w:rPr>
+        <w:br/>
+        <w:t xml:space="preserve">- </w:t>
+      </w:r>
+      <w:r>
+        <w:rPr>
+          <w:rFonts w:ascii="Calibri" w:hAnsi="Calibri"/>
+          <w:b/>
+          <w:color w:val="1E293B"/>
+          <w:sz w:val="21"/>
+        </w:rPr>
+        <w:t>Ben Thanh Market Shopping Guide:</w:t>
+      </w:r>
+      <w:r>
+        <w:rPr>
+          <w:rFonts w:ascii="Calibri" w:hAnsi="Calibri"/>
+          <w:color w:val="1E293B"/>
+          <w:sz w:val="21"/>
+        </w:rPr>
+        <w:t xml:space="preserve"> spending local currency wisely in our </w:t>
+      </w:r>
+      <w:r>
+        <w:rPr>
+          <w:rFonts w:ascii="Calibri" w:hAnsi="Calibri"/>
+          <w:color w:val="1E293B"/>
+          <w:sz w:val="21"/>
+        </w:rPr>
+        <w:t>Ben Thanh Market shopping guide</w:t>
+      </w:r>
+      <w:r>
+        <w:rPr>
+          <w:rFonts w:ascii="Calibri" w:hAnsi="Calibri"/>
+          <w:color w:val="1E293B"/>
+          <w:sz w:val="21"/>
+        </w:rPr>
+        <w:t>.</w:t>
+      </w:r>
+      <w:r>
+        <w:rPr>
+          <w:rFonts w:ascii="Calibri" w:hAnsi="Calibri"/>
+          <w:color w:val="1E293B"/>
+          <w:sz w:val="21"/>
+        </w:rPr>
+      </w:r>
+      <w:r>
+        <w:rPr>
+          <w:rFonts w:ascii="Calibri" w:hAnsi="Calibri"/>
+          <w:color w:val="1E293B"/>
+          <w:sz w:val="21"/>
+        </w:rPr>
+        <w:br/>
+        <w:t xml:space="preserve">- </w:t>
+      </w:r>
+      <w:r>
+        <w:rPr>
+          <w:rFonts w:ascii="Calibri" w:hAnsi="Calibri"/>
+          <w:b/>
+          <w:color w:val="1E293B"/>
+          <w:sz w:val="21"/>
+        </w:rPr>
+        <w:t>Ben Thanh Market Scams &amp; Safety Guide:</w:t>
+      </w:r>
+      <w:r>
+        <w:rPr>
+          <w:rFonts w:ascii="Calibri" w:hAnsi="Calibri"/>
+          <w:color w:val="1E293B"/>
+          <w:sz w:val="21"/>
+        </w:rPr>
+        <w:t xml:space="preserve"> protecting your wallet with our </w:t>
+      </w:r>
+      <w:r>
+        <w:rPr>
+          <w:rFonts w:ascii="Calibri" w:hAnsi="Calibri"/>
+          <w:color w:val="1E293B"/>
+          <w:sz w:val="21"/>
+        </w:rPr>
+        <w:t>Ben Thanh Market scams and safety guide</w:t>
+      </w:r>
+      <w:r>
+        <w:rPr>
+          <w:rFonts w:ascii="Calibri" w:hAnsi="Calibri"/>
+          <w:color w:val="1E293B"/>
+          <w:sz w:val="21"/>
+        </w:rPr>
+        <w:t>.</w:t>
+      </w:r>
+      <w:r>
+        <w:rPr>
+          <w:rFonts w:ascii="Calibri" w:hAnsi="Calibri"/>
+          <w:color w:val="1E293B"/>
+          <w:sz w:val="21"/>
+        </w:rPr>
+      </w:r>
+      <w:r>
+        <w:rPr>
+          <w:rFonts w:ascii="Calibri" w:hAnsi="Calibri"/>
+          <w:color w:val="1E293B"/>
+          <w:sz w:val="21"/>
+        </w:rPr>
+        <w:br/>
+        <w:t xml:space="preserve">- </w:t>
+      </w:r>
+      <w:r>
+        <w:rPr>
+          <w:rFonts w:ascii="Calibri" w:hAnsi="Calibri"/>
+          <w:b/>
+          <w:color w:val="1E293B"/>
+          <w:sz w:val="21"/>
+        </w:rPr>
+        <w:t>Parking Guide Near Ben Thanh Market:</w:t>
+      </w:r>
+      <w:r>
+        <w:rPr>
+          <w:rFonts w:ascii="Calibri" w:hAnsi="Calibri"/>
+          <w:color w:val="1E293B"/>
+          <w:sz w:val="21"/>
+        </w:rPr>
+        <w:t xml:space="preserve"> finding nearby parking spots in our </w:t>
+      </w:r>
+      <w:r>
+        <w:rPr>
+          <w:rFonts w:ascii="Calibri" w:hAnsi="Calibri"/>
+          <w:color w:val="1E293B"/>
+          <w:sz w:val="21"/>
+        </w:rPr>
+        <w:t>parking guide near Ben Thanh Market</w:t>
+      </w:r>
+      <w:r>
+        <w:rPr>
+          <w:rFonts w:ascii="Calibri" w:hAnsi="Calibri"/>
+          <w:color w:val="1E293B"/>
+          <w:sz w:val="21"/>
+        </w:rPr>
+        <w:t>.</w:t>
+      </w:r>
+      <w:r>
+        <w:rPr>
+          <w:rFonts w:ascii="Calibri" w:hAnsi="Calibri"/>
+          <w:color w:val="1E293B"/>
+          <w:sz w:val="21"/>
+        </w:rPr>
+      </w:r>
+      <w:r>
+        <w:rPr>
+          <w:rFonts w:ascii="Calibri" w:hAnsi="Calibri"/>
+          <w:color w:val="1E293B"/>
+          <w:sz w:val="21"/>
+        </w:rPr>
+        <w:br/>
+        <w:t xml:space="preserve">- </w:t>
+      </w:r>
+      <w:r>
+        <w:rPr>
+          <w:rFonts w:ascii="Calibri" w:hAnsi="Calibri"/>
+          <w:b/>
+          <w:color w:val="1E293B"/>
+          <w:sz w:val="21"/>
+        </w:rPr>
+        <w:t>Ben Thanh Market Ultimate Travel Guide:</w:t>
+      </w:r>
+      <w:r>
+        <w:rPr>
+          <w:rFonts w:ascii="Calibri" w:hAnsi="Calibri"/>
+          <w:color w:val="1E293B"/>
+          <w:sz w:val="21"/>
+        </w:rPr>
+        <w:t xml:space="preserve"> planning your market visit with our </w:t>
+      </w:r>
+      <w:r>
+        <w:rPr>
+          <w:rFonts w:ascii="Calibri" w:hAnsi="Calibri"/>
+          <w:color w:val="1E293B"/>
+          <w:sz w:val="21"/>
+        </w:rPr>
+        <w:t>Ben Thanh Market ultimate travel guide</w:t>
+      </w:r>
+      <w:r>
+        <w:rPr>
+          <w:rFonts w:ascii="Calibri" w:hAnsi="Calibri"/>
+          <w:color w:val="1E293B"/>
+          <w:sz w:val="21"/>
+        </w:rPr>
+        <w:t>.</w:t>
+      </w:r>
+      <w:r>
+        <w:rPr>
+          <w:rFonts w:ascii="Calibri" w:hAnsi="Calibri"/>
+          <w:color w:val="1E293B"/>
+          <w:sz w:val="21"/>
+        </w:rPr>
+      </w:r>
+      <w:r>
+        <w:rPr>
+          <w:rFonts w:ascii="Calibri" w:hAnsi="Calibri"/>
+          <w:color w:val="1E293B"/>
+          <w:sz w:val="21"/>
+        </w:rPr>
+        <w:br/>
+        <w:t xml:space="preserve">- </w:t>
+      </w:r>
+      <w:r>
+        <w:rPr>
+          <w:rFonts w:ascii="Calibri" w:hAnsi="Calibri"/>
+          <w:b/>
+          <w:color w:val="1E293B"/>
+          <w:sz w:val="21"/>
+        </w:rPr>
+        <w:t>Tan Son Nhat Airport Transfer Guide:</w:t>
+      </w:r>
+      <w:r>
+        <w:rPr>
+          <w:rFonts w:ascii="Calibri" w:hAnsi="Calibri"/>
+          <w:color w:val="1E293B"/>
+          <w:sz w:val="21"/>
+        </w:rPr>
+        <w:t xml:space="preserve"> comparing airport vs downtown rates in our </w:t>
+      </w:r>
+      <w:r>
+        <w:rPr>
+          <w:rFonts w:ascii="Calibri" w:hAnsi="Calibri"/>
+          <w:color w:val="1E293B"/>
+          <w:sz w:val="21"/>
+        </w:rPr>
+        <w:t>Tan Son Nhat airport to Ben Thanh transfer guide</w:t>
+      </w:r>
+      <w:r>
+        <w:rPr>
+          <w:rFonts w:ascii="Calibri" w:hAnsi="Calibri"/>
+          <w:color w:val="1E293B"/>
+          <w:sz w:val="21"/>
+        </w:rPr>
+        <w:t>.</w:t>
       </w:r>
     </w:p>
     <w:p>
@@ -18438,6 +21925,309 @@
         <w:t>- Step 2: Maintain forward trajectory toward the regulated facilities in Section 2.</w:t>
         <w:br/>
         <w:t>- Step 3: To report unlawful curb extortion, dial the District 1 Urban Governance Hotline at +84 28 3829 7643.</w:t>
+      </w:r>
+    </w:p>
+    <w:p>
+      <w:pPr>
+        <w:spacing w:before="120" w:after="120"/>
+        <w:jc w:val="center"/>
+      </w:pPr>
+      <w:r>
+        <w:t>―――――――――――――――――――――――――――――――――――――――――――――</w:t>
+      </w:r>
+      <w:r>
+        <w:rPr>
+          <w:color w:val="CBD5E1"/>
+        </w:rPr>
+        <w:t>―――――――――――――――――――――――――――――――――――――――――――――</w:t>
+      </w:r>
+    </w:p>
+    <w:p>
+      <w:pPr>
+        <w:spacing w:before="320" w:after="120" w:line="276" w:lineRule="auto"/>
+      </w:pPr>
+      <w:r>
+        <w:t>🗺️ Curated Cluster Connections</w:t>
+      </w:r>
+      <w:r>
+        <w:rPr>
+          <w:rFonts w:ascii="Calibri" w:hAnsi="Calibri"/>
+          <w:b/>
+          <w:color w:val="1B365D"/>
+          <w:sz w:val="32"/>
+        </w:rPr>
+        <w:t>🗺️ Curated Cluster Connections</w:t>
+      </w:r>
+    </w:p>
+    <w:p>
+      <w:pPr>
+        <w:spacing w:before="40" w:after="120" w:line="276" w:lineRule="auto"/>
+      </w:pPr>
+      <w:r>
+        <w:t>To help you navigate District 1 with ease, explore our companion heritage guides:</w:t>
+        <w:br/>
+        <w:t>- Ben Thanh Central Metro Station: parking directly inside the modern Ben Thanh Central Metro Station.</w:t>
+        <w:br/>
+        <w:t>- One-Day Ben Thanh Walking Tour: embarking on our turn-by-turn one-day Ben Thanh walking tour after parking.</w:t>
+        <w:br/>
+        <w:t>- Things to Do Near Ben Thanh Market: visiting landmarks detailed in things to do near Ben Thanh Market.</w:t>
+        <w:br/>
+        <w:t>- Ben Thanh Market Ultimate Travel Guide: entering through the main gates listed in our Ben Thanh Market ultimate travel guide.</w:t>
+        <w:br/>
+        <w:t>- Money Exchange at Ha Tam Gold Shop: parking to exchange cash at the money exchange near Ben Thanh Market.</w:t>
+      </w:r>
+      <w:r>
+        <w:rPr>
+          <w:rFonts w:ascii="Calibri" w:hAnsi="Calibri"/>
+          <w:color w:val="1E293B"/>
+          <w:sz w:val="21"/>
+        </w:rPr>
+        <w:t>To help you navigate District 1 with ease, explore our companion heritage guides:</w:t>
+      </w:r>
+      <w:r>
+        <w:rPr>
+          <w:rFonts w:ascii="Calibri" w:hAnsi="Calibri"/>
+          <w:color w:val="1E293B"/>
+          <w:sz w:val="21"/>
+        </w:rPr>
+      </w:r>
+      <w:r>
+        <w:rPr>
+          <w:rFonts w:ascii="Calibri" w:hAnsi="Calibri"/>
+          <w:color w:val="1E293B"/>
+          <w:sz w:val="21"/>
+        </w:rPr>
+        <w:br/>
+        <w:t xml:space="preserve">- </w:t>
+      </w:r>
+      <w:r>
+        <w:rPr>
+          <w:rFonts w:ascii="Calibri" w:hAnsi="Calibri"/>
+          <w:b/>
+          <w:color w:val="1E293B"/>
+          <w:sz w:val="21"/>
+        </w:rPr>
+        <w:t>Ben Thanh Central Metro Station:</w:t>
+      </w:r>
+      <w:r>
+        <w:rPr>
+          <w:rFonts w:ascii="Calibri" w:hAnsi="Calibri"/>
+          <w:color w:val="1E293B"/>
+          <w:sz w:val="21"/>
+        </w:rPr>
+        <w:t xml:space="preserve"> parking directly inside the modern </w:t>
+      </w:r>
+      <w:r>
+        <w:rPr>
+          <w:rFonts w:ascii="Calibri" w:hAnsi="Calibri"/>
+          <w:color w:val="1E293B"/>
+          <w:sz w:val="21"/>
+        </w:rPr>
+        <w:t>Ben Thanh Central Metro Station</w:t>
+      </w:r>
+      <w:r>
+        <w:rPr>
+          <w:rFonts w:ascii="Calibri" w:hAnsi="Calibri"/>
+          <w:color w:val="1E293B"/>
+          <w:sz w:val="21"/>
+        </w:rPr>
+        <w:t>.</w:t>
+      </w:r>
+      <w:r>
+        <w:rPr>
+          <w:rFonts w:ascii="Calibri" w:hAnsi="Calibri"/>
+          <w:color w:val="1E293B"/>
+          <w:sz w:val="21"/>
+        </w:rPr>
+      </w:r>
+      <w:r>
+        <w:rPr>
+          <w:rFonts w:ascii="Calibri" w:hAnsi="Calibri"/>
+          <w:color w:val="1E293B"/>
+          <w:sz w:val="21"/>
+        </w:rPr>
+        <w:br/>
+        <w:t xml:space="preserve">- </w:t>
+      </w:r>
+      <w:r>
+        <w:rPr>
+          <w:rFonts w:ascii="Calibri" w:hAnsi="Calibri"/>
+          <w:b/>
+          <w:color w:val="1E293B"/>
+          <w:sz w:val="21"/>
+        </w:rPr>
+        <w:t>One-Day Ben Thanh Walking Tour:</w:t>
+      </w:r>
+      <w:r>
+        <w:rPr>
+          <w:rFonts w:ascii="Calibri" w:hAnsi="Calibri"/>
+          <w:color w:val="1E293B"/>
+          <w:sz w:val="21"/>
+        </w:rPr>
+        <w:t xml:space="preserve"> embarking on our turn-by-turn </w:t>
+      </w:r>
+      <w:r>
+        <w:rPr>
+          <w:rFonts w:ascii="Calibri" w:hAnsi="Calibri"/>
+          <w:color w:val="1E293B"/>
+          <w:sz w:val="21"/>
+        </w:rPr>
+        <w:t>one-day Ben Thanh walking tour</w:t>
+      </w:r>
+      <w:r>
+        <w:rPr>
+          <w:rFonts w:ascii="Calibri" w:hAnsi="Calibri"/>
+          <w:color w:val="1E293B"/>
+          <w:sz w:val="21"/>
+        </w:rPr>
+        <w:t xml:space="preserve"> after parking.</w:t>
+      </w:r>
+      <w:r>
+        <w:rPr>
+          <w:rFonts w:ascii="Calibri" w:hAnsi="Calibri"/>
+          <w:color w:val="1E293B"/>
+          <w:sz w:val="21"/>
+        </w:rPr>
+      </w:r>
+      <w:r>
+        <w:rPr>
+          <w:rFonts w:ascii="Calibri" w:hAnsi="Calibri"/>
+          <w:color w:val="1E293B"/>
+          <w:sz w:val="21"/>
+        </w:rPr>
+        <w:br/>
+        <w:t xml:space="preserve">- </w:t>
+      </w:r>
+      <w:r>
+        <w:rPr>
+          <w:rFonts w:ascii="Calibri" w:hAnsi="Calibri"/>
+          <w:b/>
+          <w:color w:val="1E293B"/>
+          <w:sz w:val="21"/>
+        </w:rPr>
+        <w:t>Things to Do Near Ben Thanh Market:</w:t>
+      </w:r>
+      <w:r>
+        <w:rPr>
+          <w:rFonts w:ascii="Calibri" w:hAnsi="Calibri"/>
+          <w:color w:val="1E293B"/>
+          <w:sz w:val="21"/>
+        </w:rPr>
+        <w:t xml:space="preserve"> visiting landmarks detailed in </w:t>
+      </w:r>
+      <w:r>
+        <w:rPr>
+          <w:rFonts w:ascii="Calibri" w:hAnsi="Calibri"/>
+          <w:color w:val="1E293B"/>
+          <w:sz w:val="21"/>
+        </w:rPr>
+        <w:t>things to do near Ben Thanh Market</w:t>
+      </w:r>
+      <w:r>
+        <w:rPr>
+          <w:rFonts w:ascii="Calibri" w:hAnsi="Calibri"/>
+          <w:color w:val="1E293B"/>
+          <w:sz w:val="21"/>
+        </w:rPr>
+        <w:t>.</w:t>
+      </w:r>
+      <w:r>
+        <w:rPr>
+          <w:rFonts w:ascii="Calibri" w:hAnsi="Calibri"/>
+          <w:color w:val="1E293B"/>
+          <w:sz w:val="21"/>
+        </w:rPr>
+      </w:r>
+      <w:r>
+        <w:rPr>
+          <w:rFonts w:ascii="Calibri" w:hAnsi="Calibri"/>
+          <w:color w:val="1E293B"/>
+          <w:sz w:val="21"/>
+        </w:rPr>
+        <w:br/>
+        <w:t xml:space="preserve">- </w:t>
+      </w:r>
+      <w:r>
+        <w:rPr>
+          <w:rFonts w:ascii="Calibri" w:hAnsi="Calibri"/>
+          <w:b/>
+          <w:color w:val="1E293B"/>
+          <w:sz w:val="21"/>
+        </w:rPr>
+        <w:t>Ben Thanh Market Ultimate Travel Guide:</w:t>
+      </w:r>
+      <w:r>
+        <w:rPr>
+          <w:rFonts w:ascii="Calibri" w:hAnsi="Calibri"/>
+          <w:color w:val="1E293B"/>
+          <w:sz w:val="21"/>
+        </w:rPr>
+        <w:t xml:space="preserve"> entering through the main gates listed in our </w:t>
+      </w:r>
+      <w:r>
+        <w:rPr>
+          <w:rFonts w:ascii="Calibri" w:hAnsi="Calibri"/>
+          <w:color w:val="1E293B"/>
+          <w:sz w:val="21"/>
+        </w:rPr>
+        <w:t>Ben Thanh Market ultimate travel guide</w:t>
+      </w:r>
+      <w:r>
+        <w:rPr>
+          <w:rFonts w:ascii="Calibri" w:hAnsi="Calibri"/>
+          <w:color w:val="1E293B"/>
+          <w:sz w:val="21"/>
+        </w:rPr>
+        <w:t>.</w:t>
+      </w:r>
+      <w:r>
+        <w:rPr>
+          <w:rFonts w:ascii="Calibri" w:hAnsi="Calibri"/>
+          <w:color w:val="1E293B"/>
+          <w:sz w:val="21"/>
+        </w:rPr>
+      </w:r>
+      <w:r>
+        <w:rPr>
+          <w:rFonts w:ascii="Calibri" w:hAnsi="Calibri"/>
+          <w:color w:val="1E293B"/>
+          <w:sz w:val="21"/>
+        </w:rPr>
+        <w:br/>
+        <w:t xml:space="preserve">- </w:t>
+      </w:r>
+      <w:r>
+        <w:rPr>
+          <w:rFonts w:ascii="Calibri" w:hAnsi="Calibri"/>
+          <w:b/>
+          <w:color w:val="1E293B"/>
+          <w:sz w:val="21"/>
+        </w:rPr>
+        <w:t>Money Exchange at Ha Tam Gold Shop:</w:t>
+      </w:r>
+      <w:r>
+        <w:rPr>
+          <w:rFonts w:ascii="Calibri" w:hAnsi="Calibri"/>
+          <w:color w:val="1E293B"/>
+          <w:sz w:val="21"/>
+        </w:rPr>
+        <w:t xml:space="preserve"> parking to exchange cash at the </w:t>
+      </w:r>
+      <w:r>
+        <w:rPr>
+          <w:rFonts w:ascii="Calibri" w:hAnsi="Calibri"/>
+          <w:color w:val="1E293B"/>
+          <w:sz w:val="21"/>
+        </w:rPr>
+        <w:t>money exchange near Ben Thanh Market</w:t>
+      </w:r>
+      <w:r>
+        <w:rPr>
+          <w:rFonts w:ascii="Calibri" w:hAnsi="Calibri"/>
+          <w:color w:val="1E293B"/>
+          <w:sz w:val="21"/>
+        </w:rPr>
+        <w:t>.</w:t>
       </w:r>
     </w:p>
     <w:p>
@@ -19274,6 +23064,360 @@
           <w:sz w:val="20"/>
         </w:rPr>
         <w:t xml:space="preserve"> Travelers sensitive to tropical fumes and sudden braking should opt for Bus 109 or the electric VinFast fleet (Xanh SM), which run whisper-quiet with zero tailpipe smell.</w:t>
+      </w:r>
+    </w:p>
+    <w:p>
+      <w:pPr>
+        <w:spacing w:before="120" w:after="120"/>
+        <w:jc w:val="center"/>
+      </w:pPr>
+      <w:r>
+        <w:t>―――――――――――――――――――――――――――――――――――――――――――――</w:t>
+      </w:r>
+      <w:r>
+        <w:rPr>
+          <w:color w:val="CBD5E1"/>
+        </w:rPr>
+        <w:t>―――――――――――――――――――――――――――――――――――――――――――――</w:t>
+      </w:r>
+    </w:p>
+    <w:p>
+      <w:pPr>
+        <w:spacing w:before="320" w:after="120" w:line="276" w:lineRule="auto"/>
+      </w:pPr>
+      <w:r>
+        <w:t>🗺️ Curated Cluster Connections</w:t>
+      </w:r>
+      <w:r>
+        <w:rPr>
+          <w:rFonts w:ascii="Calibri" w:hAnsi="Calibri"/>
+          <w:b/>
+          <w:color w:val="1B365D"/>
+          <w:sz w:val="32"/>
+        </w:rPr>
+        <w:t>🗺️ Curated Cluster Connections</w:t>
+      </w:r>
+    </w:p>
+    <w:p>
+      <w:pPr>
+        <w:spacing w:before="40" w:after="120" w:line="276" w:lineRule="auto"/>
+      </w:pPr>
+      <w:r>
+        <w:t>To help you navigate District 1 with ease, explore our companion heritage guides:</w:t>
+        <w:br/>
+        <w:t>- Ben Thanh Central Metro Station: connecting seamlessly to the Ben Thanh Central Metro Station on Line 1.</w:t>
+        <w:br/>
+        <w:t>- Boutique Hotels Near Ben Thanh: checking in to handpicked boutique hotels near Ben Thanh.</w:t>
+        <w:br/>
+        <w:t>- Things to Do Near Ben Thanh Market: spending your first afternoon exploring things to do near Ben Thanh Market.</w:t>
+        <w:br/>
+        <w:t>- Money Exchange at Ha Tam Gold Shop: exchanging foreign cash downtown at the money exchange near Ben Thanh Market.</w:t>
+        <w:br/>
+        <w:t>- Ben Thanh Market Scams &amp; Safety Guide: avoiding airport taxi traps with our Ben Thanh Market scams and safety guide.</w:t>
+        <w:br/>
+        <w:t>- Tailor-Made Vietnam Journeys: booking private VIP transfers and touring with our tailor-made travel design.</w:t>
+      </w:r>
+      <w:r>
+        <w:rPr>
+          <w:rFonts w:ascii="Calibri" w:hAnsi="Calibri"/>
+          <w:color w:val="1E293B"/>
+          <w:sz w:val="21"/>
+        </w:rPr>
+        <w:t>To help you navigate District 1 with ease, explore our companion heritage guides:</w:t>
+      </w:r>
+      <w:r>
+        <w:rPr>
+          <w:rFonts w:ascii="Calibri" w:hAnsi="Calibri"/>
+          <w:color w:val="1E293B"/>
+          <w:sz w:val="21"/>
+        </w:rPr>
+      </w:r>
+      <w:r>
+        <w:rPr>
+          <w:rFonts w:ascii="Calibri" w:hAnsi="Calibri"/>
+          <w:color w:val="1E293B"/>
+          <w:sz w:val="21"/>
+        </w:rPr>
+        <w:br/>
+        <w:t xml:space="preserve">- </w:t>
+      </w:r>
+      <w:r>
+        <w:rPr>
+          <w:rFonts w:ascii="Calibri" w:hAnsi="Calibri"/>
+          <w:b/>
+          <w:color w:val="1E293B"/>
+          <w:sz w:val="21"/>
+        </w:rPr>
+        <w:t>Ben Thanh Central Metro Station:</w:t>
+      </w:r>
+      <w:r>
+        <w:rPr>
+          <w:rFonts w:ascii="Calibri" w:hAnsi="Calibri"/>
+          <w:color w:val="1E293B"/>
+          <w:sz w:val="21"/>
+        </w:rPr>
+        <w:t xml:space="preserve"> connecting seamlessly to the </w:t>
+      </w:r>
+      <w:r>
+        <w:rPr>
+          <w:rFonts w:ascii="Calibri" w:hAnsi="Calibri"/>
+          <w:color w:val="1E293B"/>
+          <w:sz w:val="21"/>
+        </w:rPr>
+        <w:t>Ben Thanh Central Metro Station</w:t>
+      </w:r>
+      <w:r>
+        <w:rPr>
+          <w:rFonts w:ascii="Calibri" w:hAnsi="Calibri"/>
+          <w:color w:val="1E293B"/>
+          <w:sz w:val="21"/>
+        </w:rPr>
+        <w:t xml:space="preserve"> on Line 1.</w:t>
+      </w:r>
+      <w:r>
+        <w:rPr>
+          <w:rFonts w:ascii="Calibri" w:hAnsi="Calibri"/>
+          <w:color w:val="1E293B"/>
+          <w:sz w:val="21"/>
+        </w:rPr>
+      </w:r>
+      <w:r>
+        <w:rPr>
+          <w:rFonts w:ascii="Calibri" w:hAnsi="Calibri"/>
+          <w:color w:val="1E293B"/>
+          <w:sz w:val="21"/>
+        </w:rPr>
+        <w:br/>
+        <w:t xml:space="preserve">- </w:t>
+      </w:r>
+      <w:r>
+        <w:rPr>
+          <w:rFonts w:ascii="Calibri" w:hAnsi="Calibri"/>
+          <w:b/>
+          <w:color w:val="1E293B"/>
+          <w:sz w:val="21"/>
+        </w:rPr>
+        <w:t>Boutique Hotels Near Ben Thanh:</w:t>
+      </w:r>
+      <w:r>
+        <w:rPr>
+          <w:rFonts w:ascii="Calibri" w:hAnsi="Calibri"/>
+          <w:color w:val="1E293B"/>
+          <w:sz w:val="21"/>
+        </w:rPr>
+        <w:t xml:space="preserve"> checking in to handpicked </w:t>
+      </w:r>
+      <w:r>
+        <w:rPr>
+          <w:rFonts w:ascii="Calibri" w:hAnsi="Calibri"/>
+          <w:color w:val="1E293B"/>
+          <w:sz w:val="21"/>
+        </w:rPr>
+        <w:t>boutique hotels near Ben Thanh</w:t>
+      </w:r>
+      <w:r>
+        <w:rPr>
+          <w:rFonts w:ascii="Calibri" w:hAnsi="Calibri"/>
+          <w:color w:val="1E293B"/>
+          <w:sz w:val="21"/>
+        </w:rPr>
+        <w:t>.</w:t>
+      </w:r>
+      <w:r>
+        <w:rPr>
+          <w:rFonts w:ascii="Calibri" w:hAnsi="Calibri"/>
+          <w:color w:val="1E293B"/>
+          <w:sz w:val="21"/>
+        </w:rPr>
+      </w:r>
+      <w:r>
+        <w:rPr>
+          <w:rFonts w:ascii="Calibri" w:hAnsi="Calibri"/>
+          <w:color w:val="1E293B"/>
+          <w:sz w:val="21"/>
+        </w:rPr>
+        <w:br/>
+        <w:t xml:space="preserve">- </w:t>
+      </w:r>
+      <w:r>
+        <w:rPr>
+          <w:rFonts w:ascii="Calibri" w:hAnsi="Calibri"/>
+          <w:b/>
+          <w:color w:val="1E293B"/>
+          <w:sz w:val="21"/>
+        </w:rPr>
+        <w:t>Things to Do Near Ben Thanh Market:</w:t>
+      </w:r>
+      <w:r>
+        <w:rPr>
+          <w:rFonts w:ascii="Calibri" w:hAnsi="Calibri"/>
+          <w:color w:val="1E293B"/>
+          <w:sz w:val="21"/>
+        </w:rPr>
+        <w:t xml:space="preserve"> spending your first afternoon exploring </w:t>
+      </w:r>
+      <w:r>
+        <w:rPr>
+          <w:rFonts w:ascii="Calibri" w:hAnsi="Calibri"/>
+          <w:color w:val="1E293B"/>
+          <w:sz w:val="21"/>
+        </w:rPr>
+        <w:t>things to do near Ben Thanh Market</w:t>
+      </w:r>
+      <w:r>
+        <w:rPr>
+          <w:rFonts w:ascii="Calibri" w:hAnsi="Calibri"/>
+          <w:color w:val="1E293B"/>
+          <w:sz w:val="21"/>
+        </w:rPr>
+        <w:t>.</w:t>
+      </w:r>
+      <w:r>
+        <w:rPr>
+          <w:rFonts w:ascii="Calibri" w:hAnsi="Calibri"/>
+          <w:color w:val="1E293B"/>
+          <w:sz w:val="21"/>
+        </w:rPr>
+      </w:r>
+      <w:r>
+        <w:rPr>
+          <w:rFonts w:ascii="Calibri" w:hAnsi="Calibri"/>
+          <w:color w:val="1E293B"/>
+          <w:sz w:val="21"/>
+        </w:rPr>
+        <w:br/>
+        <w:t xml:space="preserve">- </w:t>
+      </w:r>
+      <w:r>
+        <w:rPr>
+          <w:rFonts w:ascii="Calibri" w:hAnsi="Calibri"/>
+          <w:b/>
+          <w:color w:val="1E293B"/>
+          <w:sz w:val="21"/>
+        </w:rPr>
+        <w:t>Money Exchange at Ha Tam Gold Shop:</w:t>
+      </w:r>
+      <w:r>
+        <w:rPr>
+          <w:rFonts w:ascii="Calibri" w:hAnsi="Calibri"/>
+          <w:color w:val="1E293B"/>
+          <w:sz w:val="21"/>
+        </w:rPr>
+        <w:t xml:space="preserve"> exchanging foreign cash downtown at the </w:t>
+      </w:r>
+      <w:r>
+        <w:rPr>
+          <w:rFonts w:ascii="Calibri" w:hAnsi="Calibri"/>
+          <w:color w:val="1E293B"/>
+          <w:sz w:val="21"/>
+        </w:rPr>
+        <w:t>money exchange near Ben Thanh Market</w:t>
+      </w:r>
+      <w:r>
+        <w:rPr>
+          <w:rFonts w:ascii="Calibri" w:hAnsi="Calibri"/>
+          <w:color w:val="1E293B"/>
+          <w:sz w:val="21"/>
+        </w:rPr>
+        <w:t>.</w:t>
+      </w:r>
+      <w:r>
+        <w:rPr>
+          <w:rFonts w:ascii="Calibri" w:hAnsi="Calibri"/>
+          <w:color w:val="1E293B"/>
+          <w:sz w:val="21"/>
+        </w:rPr>
+      </w:r>
+      <w:r>
+        <w:rPr>
+          <w:rFonts w:ascii="Calibri" w:hAnsi="Calibri"/>
+          <w:color w:val="1E293B"/>
+          <w:sz w:val="21"/>
+        </w:rPr>
+        <w:br/>
+        <w:t xml:space="preserve">- </w:t>
+      </w:r>
+      <w:r>
+        <w:rPr>
+          <w:rFonts w:ascii="Calibri" w:hAnsi="Calibri"/>
+          <w:b/>
+          <w:color w:val="1E293B"/>
+          <w:sz w:val="21"/>
+        </w:rPr>
+        <w:t>Ben Thanh Market Scams &amp; Safety Guide:</w:t>
+      </w:r>
+      <w:r>
+        <w:rPr>
+          <w:rFonts w:ascii="Calibri" w:hAnsi="Calibri"/>
+          <w:color w:val="1E293B"/>
+          <w:sz w:val="21"/>
+        </w:rPr>
+        <w:t xml:space="preserve"> avoiding airport taxi traps with our </w:t>
+      </w:r>
+      <w:r>
+        <w:rPr>
+          <w:rFonts w:ascii="Calibri" w:hAnsi="Calibri"/>
+          <w:color w:val="1E293B"/>
+          <w:sz w:val="21"/>
+        </w:rPr>
+        <w:t>Ben Thanh Market scams and safety guide</w:t>
+      </w:r>
+      <w:r>
+        <w:rPr>
+          <w:rFonts w:ascii="Calibri" w:hAnsi="Calibri"/>
+          <w:color w:val="1E293B"/>
+          <w:sz w:val="21"/>
+        </w:rPr>
+        <w:t>.</w:t>
+      </w:r>
+      <w:r>
+        <w:rPr>
+          <w:rFonts w:ascii="Calibri" w:hAnsi="Calibri"/>
+          <w:color w:val="1E293B"/>
+          <w:sz w:val="21"/>
+        </w:rPr>
+      </w:r>
+      <w:r>
+        <w:rPr>
+          <w:rFonts w:ascii="Calibri" w:hAnsi="Calibri"/>
+          <w:color w:val="1E293B"/>
+          <w:sz w:val="21"/>
+        </w:rPr>
+        <w:br/>
+        <w:t xml:space="preserve">- </w:t>
+      </w:r>
+      <w:r>
+        <w:rPr>
+          <w:rFonts w:ascii="Calibri" w:hAnsi="Calibri"/>
+          <w:b/>
+          <w:color w:val="1E293B"/>
+          <w:sz w:val="21"/>
+        </w:rPr>
+        <w:t>Tailor-Made Vietnam Journeys:</w:t>
+      </w:r>
+      <w:r>
+        <w:rPr>
+          <w:rFonts w:ascii="Calibri" w:hAnsi="Calibri"/>
+          <w:color w:val="1E293B"/>
+          <w:sz w:val="21"/>
+        </w:rPr>
+        <w:t xml:space="preserve"> booking private VIP transfers and touring with our </w:t>
+      </w:r>
+      <w:r>
+        <w:rPr>
+          <w:rFonts w:ascii="Calibri" w:hAnsi="Calibri"/>
+          <w:color w:val="1E293B"/>
+          <w:sz w:val="21"/>
+        </w:rPr>
+        <w:t>tailor-made travel design</w:t>
+      </w:r>
+      <w:r>
+        <w:rPr>
+          <w:rFonts w:ascii="Calibri" w:hAnsi="Calibri"/>
+          <w:color w:val="1E293B"/>
+          <w:sz w:val="21"/>
+        </w:rPr>
+        <w:t>.</w:t>
       </w:r>
     </w:p>
     <w:sectPr>

</xml_diff>